<commit_message>
fix: match exact paragraph layout (num|label|colon|value) + double-spacing from original Word docx
</commit_message>
<xml_diff>
--- a/public/templates/LKP_TEMPLATE_OFFICIAL.docx
+++ b/public/templates/LKP_TEMPLATE_OFFICIAL.docx
@@ -1,1616 +1,6 @@
 
-<file path=word/document.xml><?xml version="1.0" encoding="utf-8"?>
-<w:document xmlns:wpc="http://schemas.microsoft.com/office/word/2010/wordprocessingCanvas" xmlns:cx="http://schemas.microsoft.com/office/drawing/2014/chartex" xmlns:cx1="http://schemas.microsoft.com/office/drawing/2015/9/8/chartex" xmlns:cx2="http://schemas.microsoft.com/office/drawing/2015/10/21/chartex" xmlns:cx3="http://schemas.microsoft.com/office/drawing/2016/5/9/chartex" xmlns:cx4="http://schemas.microsoft.com/office/drawing/2016/5/10/chartex" xmlns:cx5="http://schemas.microsoft.com/office/drawing/2016/5/11/chartex" xmlns:cx6="http://schemas.microsoft.com/office/drawing/2016/5/12/chartex" xmlns:cx7="http://schemas.microsoft.com/office/drawing/2016/5/13/chartex" xmlns:cx8="http://schemas.microsoft.com/office/drawing/2016/5/14/chartex" xmlns:mc="http://schemas.openxmlformats.org/markup-compatibility/2006" xmlns:aink="http://schemas.microsoft.com/office/drawing/2016/ink" xmlns:am3d="http://schemas.microsoft.com/office/drawing/2017/model3d" xmlns:o="urn:schemas-microsoft-com:office:office" xmlns:oel="http://schemas.microsoft.com/office/2019/extlst" xmlns:r="http://schemas.openxmlformats.org/officeDocument/2006/relationships" xmlns:m="http://schemas.openxmlformats.org/officeDocument/2006/math" xmlns:v="urn:schemas-microsoft-com:vml" xmlns:wp14="http://schemas.microsoft.com/office/word/2010/wordprocessingDrawing" xmlns:wp="http://schemas.openxmlformats.org/drawingml/2006/wordprocessingDrawing" xmlns:w10="urn:schemas-microsoft-com:office:word" xmlns:w="http://schemas.openxmlformats.org/wordprocessingml/2006/main" xmlns:w14="http://schemas.microsoft.com/office/word/2010/wordml" xmlns:w15="http://schemas.microsoft.com/office/word/2012/wordml" xmlns:w16cex="http://schemas.microsoft.com/office/word/2018/wordml/cex" xmlns:w16cid="http://schemas.microsoft.com/office/word/2016/wordml/cid" xmlns:w16="http://schemas.microsoft.com/office/word/2018/wordml" xmlns:w16du="http://schemas.microsoft.com/office/word/2023/wordml/word16du" xmlns:w16sdtdh="http://schemas.microsoft.com/office/word/2020/wordml/sdtdatahash" xmlns:w16sdtfl="http://schemas.microsoft.com/office/word/2024/wordml/sdtformatlock" xmlns:w16se="http://schemas.microsoft.com/office/word/2015/wordml/symex" xmlns:wpg="http://schemas.microsoft.com/office/word/2010/wordprocessingGroup" xmlns:wpi="http://schemas.microsoft.com/office/word/2010/wordprocessingInk" xmlns:wne="http://schemas.microsoft.com/office/word/2006/wordml" xmlns:wps="http://schemas.microsoft.com/office/word/2010/wordprocessingShape" mc:Ignorable="w14 w15 w16se w16cid w16 w16cex w16sdtdh w16sdtfl w16du wp14">
-  <w:body>
-    <w:p>
-      <w:pPr>
-        <w:pStyle w:val="ListParagraph"/>
-        <w:numPr>
-          <w:ilvl w:val="0"/>
-          <w:numId w:val="2"/>
-        </w:numPr>
-        <w:spacing w:line="480" w:lineRule="auto"/>
-        <w:rPr>
-          <w:rFonts w:ascii="Arial" w:hAnsi="Arial" w:cs="Arial"/>
-          <w:sz w:val="22"/>
-          <w:szCs w:val="22"/>
-        </w:rPr>
-      </w:pPr>
-      <w:r>
-        <w:rPr>
-          <w:rFonts w:ascii="Arial" w:hAnsi="Arial" w:cs="Arial"/>
-          <w:sz w:val="22"/>
-          <w:szCs w:val="22"/>
-        </w:rPr>
-        <w:t>1. DATA PERALATAN</w:t>
-      </w:r>
-      <w:r>
-        <w:rPr>
-          <w:rFonts w:ascii="Arial" w:hAnsi="Arial" w:cs="Arial"/>
-          <w:sz w:val="22"/>
-          <w:szCs w:val="22"/>
-        </w:rPr>
-        <w:tab/>
-      </w:r>
-      <w:r>
-        <w:rPr>
-          <w:rFonts w:ascii="Arial" w:hAnsi="Arial" w:cs="Arial"/>
-          <w:sz w:val="22"/>
-          <w:szCs w:val="22"/>
-        </w:rPr>
-        <w:tab/>
-      </w:r>
-      <w:r>
-        <w:rPr>
-          <w:rFonts w:ascii="Arial" w:hAnsi="Arial" w:cs="Arial"/>
-          <w:sz w:val="22"/>
-          <w:szCs w:val="22"/>
-        </w:rPr>
-        <w:tab/>
-      </w:r>
-    </w:p>
-    <w:p>
-      <w:pPr>
-        <w:pStyle w:val="ListParagraph"/>
-        <w:numPr>
-          <w:ilvl w:val="0"/>
-          <w:numId w:val="3"/>
-        </w:numPr>
-        <w:spacing w:line="480" w:lineRule="auto"/>
-        <w:ind w:left="1134"/>
-        <w:rPr>
-          <w:rFonts w:ascii="Arial" w:hAnsi="Arial" w:cs="Arial"/>
-          <w:sz w:val="22"/>
-          <w:szCs w:val="22"/>
-          <w:lang w:val="sv-SE"/>
-        </w:rPr>
-      </w:pPr>
-      <w:r>
-        <w:rPr>
-          <w:rFonts w:ascii="Arial" w:hAnsi="Arial" w:cs="Arial"/>
-          <w:sz w:val="22"/>
-          <w:szCs w:val="22"/>
-          <w:lang w:val="sv-SE"/>
-        </w:rPr>
-        <w:t>Nama Peralatan</w:t>
-      </w:r>
-      <w:r>
-        <w:rPr>
-          <w:rFonts w:ascii="Arial" w:hAnsi="Arial" w:cs="Arial"/>
-          <w:sz w:val="22"/>
-          <w:szCs w:val="22"/>
-          <w:lang w:val="sv-SE"/>
-        </w:rPr>
-        <w:tab/>
-      </w:r>
-      <w:r>
-        <w:rPr>
-          <w:rFonts w:ascii="Arial" w:hAnsi="Arial" w:cs="Arial"/>
-          <w:sz w:val="22"/>
-          <w:szCs w:val="22"/>
-          <w:lang w:val="sv-SE"/>
-        </w:rPr>
-        <w:tab/>
-      </w:r>
-      <w:r>
-        <w:rPr>
-          <w:rFonts w:ascii="Arial" w:hAnsi="Arial" w:cs="Arial"/>
-          <w:sz w:val="22"/>
-          <w:szCs w:val="22"/>
-          <w:lang w:val="sv-SE"/>
-        </w:rPr>
-        <w:tab/>
-        <w:t xml:space="preserve">: </w:t>
-      </w:r>
-    </w:p>
-    <w:p>
-      <w:pPr>
-        <w:pStyle w:val="ListParagraph"/>
-        <w:numPr>
-          <w:ilvl w:val="0"/>
-          <w:numId w:val="3"/>
-        </w:numPr>
-        <w:spacing w:line="480" w:lineRule="auto"/>
-        <w:ind w:left="1134"/>
-        <w:rPr>
-          <w:rFonts w:ascii="Arial" w:hAnsi="Arial" w:cs="Arial"/>
-          <w:sz w:val="22"/>
-          <w:szCs w:val="22"/>
-        </w:rPr>
-      </w:pPr>
-      <w:r>
-        <w:rPr>
-          <w:rFonts w:ascii="Arial" w:hAnsi="Arial" w:cs="Arial"/>
-          <w:sz w:val="22"/>
-          <w:szCs w:val="22"/>
-        </w:rPr>
-        <w:t>Merk</w:t>
-      </w:r>
-      <w:r>
-        <w:rPr>
-          <w:rFonts w:ascii="Arial" w:hAnsi="Arial" w:cs="Arial"/>
-          <w:sz w:val="22"/>
-          <w:szCs w:val="22"/>
-        </w:rPr>
-        <w:tab/>
-      </w:r>
-      <w:r>
-        <w:rPr>
-          <w:rFonts w:ascii="Arial" w:hAnsi="Arial" w:cs="Arial"/>
-          <w:sz w:val="22"/>
-          <w:szCs w:val="22"/>
-        </w:rPr>
-        <w:tab/>
-      </w:r>
-      <w:r>
-        <w:rPr>
-          <w:rFonts w:ascii="Arial" w:hAnsi="Arial" w:cs="Arial"/>
-          <w:sz w:val="22"/>
-          <w:szCs w:val="22"/>
-        </w:rPr>
-        <w:tab/>
-      </w:r>
-      <w:r>
-        <w:rPr>
-          <w:rFonts w:ascii="Arial" w:hAnsi="Arial" w:cs="Arial"/>
-          <w:sz w:val="22"/>
-          <w:szCs w:val="22"/>
-        </w:rPr>
-        <w:tab/>
-        <w:t>:</w:t>
-      </w:r>
-      <w:r>
-        <w:rPr>
-          <w:rFonts w:ascii="Arial" w:hAnsi="Arial" w:cs="Arial"/>
-          <w:sz w:val="22"/>
-          <w:szCs w:val="22"/>
-          <w:lang w:val="en-US"/>
-        </w:rPr>
-        <w:t xml:space="preserve"> </w:t>
-      </w:r>
-    </w:p>
-    <w:p>
-      <w:pPr>
-        <w:pStyle w:val="ListParagraph"/>
-        <w:numPr>
-          <w:ilvl w:val="0"/>
-          <w:numId w:val="3"/>
-        </w:numPr>
-        <w:spacing w:line="480" w:lineRule="auto"/>
-        <w:ind w:left="1134"/>
-        <w:rPr>
-          <w:rFonts w:ascii="Arial" w:hAnsi="Arial" w:cs="Arial"/>
-          <w:sz w:val="22"/>
-          <w:szCs w:val="22"/>
-        </w:rPr>
-      </w:pPr>
-      <w:r>
-        <w:rPr>
-          <w:rFonts w:ascii="Arial" w:hAnsi="Arial" w:cs="Arial"/>
-          <w:sz w:val="22"/>
-          <w:szCs w:val="22"/>
-        </w:rPr>
-        <w:t xml:space="preserve">Type </w:t>
-      </w:r>
-      <w:r>
-        <w:rPr>
-          <w:rFonts w:ascii="Arial" w:hAnsi="Arial" w:cs="Arial"/>
-          <w:sz w:val="22"/>
-          <w:szCs w:val="22"/>
-        </w:rPr>
-        <w:tab/>
-      </w:r>
-      <w:r>
-        <w:rPr>
-          <w:rFonts w:ascii="Arial" w:hAnsi="Arial" w:cs="Arial"/>
-          <w:sz w:val="22"/>
-          <w:szCs w:val="22"/>
-        </w:rPr>
-        <w:tab/>
-      </w:r>
-      <w:r>
-        <w:rPr>
-          <w:rFonts w:ascii="Arial" w:hAnsi="Arial" w:cs="Arial"/>
-          <w:sz w:val="22"/>
-          <w:szCs w:val="22"/>
-        </w:rPr>
-        <w:tab/>
-      </w:r>
-      <w:r>
-        <w:rPr>
-          <w:rFonts w:ascii="Arial" w:hAnsi="Arial" w:cs="Arial"/>
-          <w:sz w:val="22"/>
-          <w:szCs w:val="22"/>
-        </w:rPr>
-        <w:tab/>
-        <w:t>:</w:t>
-      </w:r>
-      <w:r>
-        <w:rPr>
-          <w:rFonts w:ascii="Arial" w:hAnsi="Arial" w:cs="Arial"/>
-          <w:sz w:val="22"/>
-          <w:szCs w:val="22"/>
-          <w:lang w:val="en-US"/>
-        </w:rPr>
-        <w:t xml:space="preserve"> </w:t>
-      </w:r>
-    </w:p>
-    <w:p>
-      <w:pPr>
-        <w:pStyle w:val="ListParagraph"/>
-        <w:numPr>
-          <w:ilvl w:val="0"/>
-          <w:numId w:val="3"/>
-        </w:numPr>
-        <w:spacing w:line="480" w:lineRule="auto"/>
-        <w:ind w:left="1134"/>
-        <w:rPr>
-          <w:rFonts w:ascii="Arial" w:hAnsi="Arial" w:cs="Arial"/>
-          <w:sz w:val="22"/>
-          <w:szCs w:val="22"/>
-        </w:rPr>
-      </w:pPr>
-      <w:r>
-        <w:rPr>
-          <w:rFonts w:ascii="Arial" w:hAnsi="Arial" w:cs="Arial"/>
-          <w:sz w:val="22"/>
-          <w:szCs w:val="22"/>
-        </w:rPr>
-        <w:t>No Seri</w:t>
-      </w:r>
-      <w:r>
-        <w:rPr>
-          <w:rFonts w:ascii="Arial" w:hAnsi="Arial" w:cs="Arial"/>
-          <w:sz w:val="22"/>
-          <w:szCs w:val="22"/>
-        </w:rPr>
-        <w:tab/>
-      </w:r>
-      <w:r>
-        <w:rPr>
-          <w:rFonts w:ascii="Arial" w:hAnsi="Arial" w:cs="Arial"/>
-          <w:sz w:val="22"/>
-          <w:szCs w:val="22"/>
-        </w:rPr>
-        <w:tab/>
-      </w:r>
-      <w:r>
-        <w:rPr>
-          <w:rFonts w:ascii="Arial" w:hAnsi="Arial" w:cs="Arial"/>
-          <w:sz w:val="22"/>
-          <w:szCs w:val="22"/>
-        </w:rPr>
-        <w:tab/>
-      </w:r>
-      <w:r>
-        <w:rPr>
-          <w:rFonts w:ascii="Arial" w:hAnsi="Arial" w:cs="Arial"/>
-          <w:sz w:val="22"/>
-          <w:szCs w:val="22"/>
-        </w:rPr>
-        <w:tab/>
-        <w:t>:</w:t>
-      </w:r>
-      <w:r>
-        <w:rPr>
-          <w:rFonts w:ascii="Arial" w:hAnsi="Arial" w:cs="Arial"/>
-          <w:sz w:val="22"/>
-          <w:szCs w:val="22"/>
-          <w:lang w:val="en-US"/>
-        </w:rPr>
-        <w:t xml:space="preserve"> </w:t>
-      </w:r>
-    </w:p>
-    <w:p>
-      <w:pPr>
-        <w:pStyle w:val="ListParagraph"/>
-        <w:numPr>
-          <w:ilvl w:val="0"/>
-          <w:numId w:val="3"/>
-        </w:numPr>
-        <w:spacing w:line="480" w:lineRule="auto"/>
-        <w:ind w:left="1134"/>
-        <w:rPr>
-          <w:rFonts w:ascii="Arial" w:hAnsi="Arial" w:cs="Arial"/>
-          <w:sz w:val="22"/>
-          <w:szCs w:val="22"/>
-        </w:rPr>
-      </w:pPr>
-      <w:r>
-        <w:rPr>
-          <w:rFonts w:ascii="Arial" w:hAnsi="Arial" w:cs="Arial"/>
-          <w:sz w:val="22"/>
-          <w:szCs w:val="22"/>
-        </w:rPr>
-        <w:t>Harga</w:t>
-      </w:r>
-      <w:r>
-        <w:rPr>
-          <w:rFonts w:ascii="Arial" w:hAnsi="Arial" w:cs="Arial"/>
-          <w:sz w:val="22"/>
-          <w:szCs w:val="22"/>
-        </w:rPr>
-        <w:tab/>
-      </w:r>
-      <w:r>
-        <w:rPr>
-          <w:rFonts w:ascii="Arial" w:hAnsi="Arial" w:cs="Arial"/>
-          <w:sz w:val="22"/>
-          <w:szCs w:val="22"/>
-        </w:rPr>
-        <w:tab/>
-      </w:r>
-      <w:r>
-        <w:rPr>
-          <w:rFonts w:ascii="Arial" w:hAnsi="Arial" w:cs="Arial"/>
-          <w:sz w:val="22"/>
-          <w:szCs w:val="22"/>
-        </w:rPr>
-        <w:tab/>
-      </w:r>
-      <w:r>
-        <w:rPr>
-          <w:rFonts w:ascii="Arial" w:hAnsi="Arial" w:cs="Arial"/>
-          <w:sz w:val="22"/>
-          <w:szCs w:val="22"/>
-        </w:rPr>
-        <w:tab/>
-        <w:t>:</w:t>
-      </w:r>
-      <w:r>
-        <w:rPr>
-          <w:rFonts w:ascii="Arial" w:hAnsi="Arial" w:cs="Arial"/>
-          <w:sz w:val="22"/>
-          <w:szCs w:val="22"/>
-          <w:lang w:val="en-US"/>
-        </w:rPr>
-        <w:t xml:space="preserve"> </w:t>
-      </w:r>
-    </w:p>
-    <w:p>
-      <w:pPr>
-        <w:pStyle w:val="ListParagraph"/>
-        <w:numPr>
-          <w:ilvl w:val="0"/>
-          <w:numId w:val="3"/>
-        </w:numPr>
-        <w:spacing w:line="480" w:lineRule="auto"/>
-        <w:ind w:left="1134"/>
-        <w:rPr>
-          <w:rFonts w:ascii="Arial" w:hAnsi="Arial" w:cs="Arial"/>
-          <w:sz w:val="22"/>
-          <w:szCs w:val="22"/>
-        </w:rPr>
-      </w:pPr>
-      <w:r>
-        <w:rPr>
-          <w:rFonts w:ascii="Arial" w:hAnsi="Arial" w:cs="Arial"/>
-          <w:sz w:val="22"/>
-          <w:szCs w:val="22"/>
-        </w:rPr>
-        <w:t>Kode Asset</w:t>
-      </w:r>
-      <w:r>
-        <w:rPr>
-          <w:rFonts w:ascii="Arial" w:hAnsi="Arial" w:cs="Arial"/>
-          <w:sz w:val="22"/>
-          <w:szCs w:val="22"/>
-        </w:rPr>
-        <w:tab/>
-      </w:r>
-      <w:r>
-        <w:rPr>
-          <w:rFonts w:ascii="Arial" w:hAnsi="Arial" w:cs="Arial"/>
-          <w:sz w:val="22"/>
-          <w:szCs w:val="22"/>
-        </w:rPr>
-        <w:tab/>
-      </w:r>
-      <w:r>
-        <w:rPr>
-          <w:rFonts w:ascii="Arial" w:hAnsi="Arial" w:cs="Arial"/>
-          <w:sz w:val="22"/>
-          <w:szCs w:val="22"/>
-        </w:rPr>
-        <w:tab/>
-        <w:t>:</w:t>
-      </w:r>
-      <w:r>
-        <w:rPr>
-          <w:rFonts w:ascii="Arial" w:hAnsi="Arial" w:cs="Arial"/>
-          <w:sz w:val="22"/>
-          <w:szCs w:val="22"/>
-          <w:lang w:val="en-US"/>
-        </w:rPr>
-        <w:t xml:space="preserve"> </w:t>
-      </w:r>
-    </w:p>
-    <w:p>
-      <w:pPr>
-        <w:pStyle w:val="ListParagraph"/>
-        <w:numPr>
-          <w:ilvl w:val="0"/>
-          <w:numId w:val="3"/>
-        </w:numPr>
-        <w:spacing w:line="480" w:lineRule="auto"/>
-        <w:ind w:left="1134"/>
-        <w:rPr>
-          <w:rFonts w:ascii="Arial" w:hAnsi="Arial" w:cs="Arial"/>
-          <w:sz w:val="22"/>
-          <w:szCs w:val="22"/>
-        </w:rPr>
-      </w:pPr>
-      <w:proofErr w:type="spellStart"/>
-      <w:r>
-        <w:rPr>
-          <w:rFonts w:ascii="Arial" w:hAnsi="Arial" w:cs="Arial"/>
-          <w:sz w:val="22"/>
-          <w:szCs w:val="22"/>
-        </w:rPr>
-        <w:t>Tahun</w:t>
-      </w:r>
-      <w:proofErr w:type="spellEnd"/>
-      <w:r>
-        <w:rPr>
-          <w:rFonts w:ascii="Arial" w:hAnsi="Arial" w:cs="Arial"/>
-          <w:sz w:val="22"/>
-          <w:szCs w:val="22"/>
-        </w:rPr>
-        <w:t xml:space="preserve"> </w:t>
-      </w:r>
-      <w:proofErr w:type="spellStart"/>
-      <w:r>
-        <w:rPr>
-          <w:rFonts w:ascii="Arial" w:hAnsi="Arial" w:cs="Arial"/>
-          <w:sz w:val="22"/>
-          <w:szCs w:val="22"/>
-        </w:rPr>
-        <w:t>Operasi</w:t>
-      </w:r>
-      <w:proofErr w:type="spellEnd"/>
-      <w:r>
-        <w:rPr>
-          <w:rFonts w:ascii="Arial" w:hAnsi="Arial" w:cs="Arial"/>
-          <w:sz w:val="22"/>
-          <w:szCs w:val="22"/>
-        </w:rPr>
-        <w:tab/>
-      </w:r>
-      <w:r>
-        <w:rPr>
-          <w:rFonts w:ascii="Arial" w:hAnsi="Arial" w:cs="Arial"/>
-          <w:sz w:val="22"/>
-          <w:szCs w:val="22"/>
-        </w:rPr>
-        <w:tab/>
-      </w:r>
-      <w:r>
-        <w:rPr>
-          <w:rFonts w:ascii="Arial" w:hAnsi="Arial" w:cs="Arial"/>
-          <w:sz w:val="22"/>
-          <w:szCs w:val="22"/>
-        </w:rPr>
-        <w:tab/>
-        <w:t>:</w:t>
-      </w:r>
-      <w:r>
-        <w:rPr>
-          <w:rFonts w:ascii="Arial" w:hAnsi="Arial" w:cs="Arial"/>
-          <w:sz w:val="22"/>
-          <w:szCs w:val="22"/>
-          <w:lang w:val="en-US"/>
-        </w:rPr>
-        <w:t xml:space="preserve"> </w:t>
-      </w:r>
-    </w:p>
-    <w:p>
-      <w:pPr>
-        <w:pStyle w:val="ListParagraph"/>
-        <w:numPr>
-          <w:ilvl w:val="0"/>
-          <w:numId w:val="3"/>
-        </w:numPr>
-        <w:spacing w:line="480" w:lineRule="auto"/>
-        <w:ind w:left="1134"/>
-        <w:rPr>
-          <w:rFonts w:ascii="Arial" w:hAnsi="Arial" w:cs="Arial"/>
-          <w:sz w:val="22"/>
-          <w:szCs w:val="22"/>
-        </w:rPr>
-      </w:pPr>
-      <w:proofErr w:type="spellStart"/>
-      <w:r>
-        <w:rPr>
-          <w:rFonts w:ascii="Arial" w:hAnsi="Arial" w:cs="Arial"/>
-          <w:sz w:val="22"/>
-          <w:szCs w:val="22"/>
-        </w:rPr>
-        <w:t>Tahun</w:t>
-      </w:r>
-      <w:proofErr w:type="spellEnd"/>
-      <w:r>
-        <w:rPr>
-          <w:rFonts w:ascii="Arial" w:hAnsi="Arial" w:cs="Arial"/>
-          <w:sz w:val="22"/>
-          <w:szCs w:val="22"/>
-        </w:rPr>
-        <w:t xml:space="preserve"> </w:t>
-      </w:r>
-      <w:proofErr w:type="spellStart"/>
-      <w:r>
-        <w:rPr>
-          <w:rFonts w:ascii="Arial" w:hAnsi="Arial" w:cs="Arial"/>
-          <w:sz w:val="22"/>
-          <w:szCs w:val="22"/>
-        </w:rPr>
-        <w:t>Buat</w:t>
-      </w:r>
-      <w:proofErr w:type="spellEnd"/>
-      <w:r>
-        <w:rPr>
-          <w:rFonts w:ascii="Arial" w:hAnsi="Arial" w:cs="Arial"/>
-          <w:sz w:val="22"/>
-          <w:szCs w:val="22"/>
-        </w:rPr>
-        <w:tab/>
-      </w:r>
-      <w:r>
-        <w:rPr>
-          <w:rFonts w:ascii="Arial" w:hAnsi="Arial" w:cs="Arial"/>
-          <w:sz w:val="22"/>
-          <w:szCs w:val="22"/>
-        </w:rPr>
-        <w:tab/>
-      </w:r>
-      <w:r>
-        <w:rPr>
-          <w:rFonts w:ascii="Arial" w:hAnsi="Arial" w:cs="Arial"/>
-          <w:sz w:val="22"/>
-          <w:szCs w:val="22"/>
-        </w:rPr>
-        <w:tab/>
-        <w:t>:</w:t>
-      </w:r>
-      <w:r>
-        <w:rPr>
-          <w:rFonts w:ascii="Arial" w:hAnsi="Arial" w:cs="Arial"/>
-          <w:sz w:val="22"/>
-          <w:szCs w:val="22"/>
-          <w:lang w:val="en-US"/>
-        </w:rPr>
-        <w:t xml:space="preserve"> </w:t>
-      </w:r>
-    </w:p>
-    <w:p>
-      <w:pPr>
-        <w:pStyle w:val="ListParagraph"/>
-        <w:numPr>
-          <w:ilvl w:val="0"/>
-          <w:numId w:val="2"/>
-        </w:numPr>
-        <w:spacing w:line="480" w:lineRule="auto"/>
-        <w:rPr>
-          <w:rFonts w:ascii="Arial" w:hAnsi="Arial" w:cs="Arial"/>
-          <w:sz w:val="22"/>
-          <w:szCs w:val="22"/>
-          <w:lang w:val="sv-SE"/>
-        </w:rPr>
-      </w:pPr>
-      <w:r>
-        <w:rPr>
-          <w:rFonts w:ascii="Arial" w:hAnsi="Arial" w:cs="Arial"/>
-          <w:sz w:val="22"/>
-          <w:szCs w:val="22"/>
-          <w:lang w:val="sv-SE"/>
-        </w:rPr>
-        <w:t>PENEMPATAN PERALATAN</w:t>
-      </w:r>
-      <w:r>
-        <w:rPr>
-          <w:rFonts w:ascii="Arial" w:hAnsi="Arial" w:cs="Arial"/>
-          <w:sz w:val="22"/>
-          <w:szCs w:val="22"/>
-          <w:lang w:val="sv-SE"/>
-        </w:rPr>
-        <w:tab/>
-        <w:t xml:space="preserve">: </w:t>
-      </w:r>
-    </w:p>
-    <w:p>
-      <w:pPr>
-        <w:pStyle w:val="ListParagraph"/>
-        <w:numPr>
-          <w:ilvl w:val="0"/>
-          <w:numId w:val="2"/>
-        </w:numPr>
-        <w:spacing w:line="480" w:lineRule="auto"/>
-        <w:rPr>
-          <w:rFonts w:ascii="Arial" w:hAnsi="Arial" w:cs="Arial"/>
-          <w:sz w:val="22"/>
-          <w:szCs w:val="22"/>
-        </w:rPr>
-      </w:pPr>
-      <w:r>
-        <w:rPr>
-          <w:rFonts w:ascii="Arial" w:hAnsi="Arial" w:cs="Arial"/>
-          <w:sz w:val="22"/>
-          <w:szCs w:val="22"/>
-        </w:rPr>
-        <w:t>TANGGAL KEJADIAN</w:t>
-      </w:r>
-      <w:r>
-        <w:rPr>
-          <w:rFonts w:ascii="Arial" w:hAnsi="Arial" w:cs="Arial"/>
-          <w:sz w:val="22"/>
-          <w:szCs w:val="22"/>
-        </w:rPr>
-        <w:tab/>
-      </w:r>
-      <w:r>
-        <w:rPr>
-          <w:rFonts w:ascii="Arial" w:hAnsi="Arial" w:cs="Arial"/>
-          <w:sz w:val="22"/>
-          <w:szCs w:val="22"/>
-        </w:rPr>
-        <w:tab/>
-        <w:t>:</w:t>
-      </w:r>
-      <w:r>
-        <w:rPr>
-          <w:rFonts w:ascii="Arial" w:hAnsi="Arial" w:cs="Arial"/>
-          <w:sz w:val="22"/>
-          <w:szCs w:val="22"/>
-          <w:lang w:val="en-US"/>
-        </w:rPr>
-        <w:t xml:space="preserve"> </w:t>
-      </w:r>
-    </w:p>
-    <w:p>
-      <w:pPr>
-        <w:pStyle w:val="ListParagraph"/>
-        <w:numPr>
-          <w:ilvl w:val="0"/>
-          <w:numId w:val="2"/>
-        </w:numPr>
-        <w:spacing w:line="480" w:lineRule="auto"/>
-        <w:rPr>
-          <w:rFonts w:ascii="Arial" w:hAnsi="Arial" w:cs="Arial"/>
-          <w:sz w:val="22"/>
-          <w:szCs w:val="22"/>
-        </w:rPr>
-      </w:pPr>
-      <w:r>
-        <w:rPr>
-          <w:rFonts w:ascii="Arial" w:hAnsi="Arial" w:cs="Arial"/>
-          <w:sz w:val="22"/>
-          <w:szCs w:val="22"/>
-        </w:rPr>
-        <w:t>JENIS KERUSAKAN</w:t>
-      </w:r>
-      <w:r>
-        <w:rPr>
-          <w:rFonts w:ascii="Arial" w:hAnsi="Arial" w:cs="Arial"/>
-          <w:sz w:val="22"/>
-          <w:szCs w:val="22"/>
-        </w:rPr>
-        <w:tab/>
-      </w:r>
-      <w:r>
-        <w:rPr>
-          <w:rFonts w:ascii="Arial" w:hAnsi="Arial" w:cs="Arial"/>
-          <w:sz w:val="22"/>
-          <w:szCs w:val="22"/>
-        </w:rPr>
-        <w:tab/>
-      </w:r>
-      <w:r>
-        <w:rPr>
-          <w:rFonts w:ascii="Arial" w:hAnsi="Arial" w:cs="Arial"/>
-          <w:sz w:val="22"/>
-          <w:szCs w:val="22"/>
-        </w:rPr>
-        <w:tab/>
-        <w:t>:</w:t>
-      </w:r>
-      <w:r>
-        <w:rPr>
-          <w:rFonts w:ascii="Arial" w:hAnsi="Arial" w:cs="Arial"/>
-          <w:sz w:val="22"/>
-          <w:szCs w:val="22"/>
-          <w:lang w:val="en-US"/>
-        </w:rPr>
-        <w:t xml:space="preserve"> </w:t>
-      </w:r>
-    </w:p>
-    <w:p>
-      <w:pPr>
-        <w:pStyle w:val="ListParagraph"/>
-        <w:numPr>
-          <w:ilvl w:val="0"/>
-          <w:numId w:val="2"/>
-        </w:numPr>
-        <w:spacing w:line="480" w:lineRule="auto"/>
-        <w:rPr>
-          <w:rFonts w:ascii="Arial" w:hAnsi="Arial" w:cs="Arial"/>
-          <w:sz w:val="22"/>
-          <w:szCs w:val="22"/>
-          <w:lang w:val="sv-SE"/>
-        </w:rPr>
-      </w:pPr>
-      <w:r>
-        <w:rPr>
-          <w:rFonts w:ascii="Arial" w:hAnsi="Arial" w:cs="Arial"/>
-          <w:sz w:val="22"/>
-          <w:szCs w:val="22"/>
-          <w:lang w:val="sv-SE"/>
-        </w:rPr>
-        <w:t>PENYEBAB KERUSAKAN</w:t>
-      </w:r>
-      <w:r>
-        <w:rPr>
-          <w:rFonts w:ascii="Arial" w:hAnsi="Arial" w:cs="Arial"/>
-          <w:sz w:val="22"/>
-          <w:szCs w:val="22"/>
-          <w:lang w:val="sv-SE"/>
-        </w:rPr>
-        <w:tab/>
-      </w:r>
-      <w:r>
-        <w:rPr>
-          <w:rFonts w:ascii="Arial" w:hAnsi="Arial" w:cs="Arial"/>
-          <w:sz w:val="22"/>
-          <w:szCs w:val="22"/>
-          <w:lang w:val="sv-SE"/>
-        </w:rPr>
-        <w:tab/>
-        <w:t xml:space="preserve">: </w:t>
-      </w:r>
-    </w:p>
-    <w:p>
-      <w:pPr>
-        <w:pStyle w:val="ListParagraph"/>
-        <w:numPr>
-          <w:ilvl w:val="0"/>
-          <w:numId w:val="2"/>
-        </w:numPr>
-        <w:spacing w:line="480" w:lineRule="auto"/>
-        <w:rPr>
-          <w:rFonts w:ascii="Arial" w:hAnsi="Arial" w:cs="Arial"/>
-          <w:sz w:val="22"/>
-          <w:szCs w:val="22"/>
-          <w:lang w:val="sv-SE"/>
-        </w:rPr>
-      </w:pPr>
-      <w:r>
-        <w:rPr>
-          <w:rFonts w:ascii="Arial" w:hAnsi="Arial" w:cs="Arial"/>
-          <w:sz w:val="22"/>
-          <w:szCs w:val="22"/>
-          <w:lang w:val="sv-SE"/>
-        </w:rPr>
-        <w:t>AKIBAT KERUSAKAN</w:t>
-      </w:r>
-      <w:r>
-        <w:rPr>
-          <w:rFonts w:ascii="Arial" w:hAnsi="Arial" w:cs="Arial"/>
-          <w:sz w:val="22"/>
-          <w:szCs w:val="22"/>
-          <w:lang w:val="sv-SE"/>
-        </w:rPr>
-        <w:tab/>
-      </w:r>
-      <w:r>
-        <w:rPr>
-          <w:rFonts w:ascii="Arial" w:hAnsi="Arial" w:cs="Arial"/>
-          <w:sz w:val="22"/>
-          <w:szCs w:val="22"/>
-          <w:lang w:val="sv-SE"/>
-        </w:rPr>
-        <w:tab/>
-        <w:t xml:space="preserve">: </w:t>
-      </w:r>
-    </w:p>
-    <w:p>
-      <w:pPr>
-        <w:pStyle w:val="ListParagraph"/>
-        <w:numPr>
-          <w:ilvl w:val="0"/>
-          <w:numId w:val="2"/>
-        </w:numPr>
-        <w:spacing w:line="480" w:lineRule="auto"/>
-        <w:rPr>
-          <w:rFonts w:ascii="Arial" w:hAnsi="Arial" w:cs="Arial"/>
-          <w:sz w:val="22"/>
-          <w:szCs w:val="22"/>
-          <w:lang w:val="sv-SE"/>
-        </w:rPr>
-      </w:pPr>
-      <w:r>
-        <w:rPr>
-          <w:rFonts w:ascii="Arial" w:hAnsi="Arial" w:cs="Arial"/>
-          <w:sz w:val="22"/>
-          <w:szCs w:val="22"/>
-          <w:lang w:val="sv-SE"/>
-        </w:rPr>
-        <w:t>USUL DAN SARAN</w:t>
-      </w:r>
-      <w:r>
-        <w:rPr>
-          <w:rFonts w:ascii="Arial" w:hAnsi="Arial" w:cs="Arial"/>
-          <w:sz w:val="22"/>
-          <w:szCs w:val="22"/>
-          <w:lang w:val="sv-SE"/>
-        </w:rPr>
-        <w:tab/>
-      </w:r>
-      <w:r>
-        <w:rPr>
-          <w:rFonts w:ascii="Arial" w:hAnsi="Arial" w:cs="Arial"/>
-          <w:sz w:val="22"/>
-          <w:szCs w:val="22"/>
-          <w:lang w:val="sv-SE"/>
-        </w:rPr>
-        <w:tab/>
-      </w:r>
-      <w:r>
-        <w:rPr>
-          <w:rFonts w:ascii="Arial" w:hAnsi="Arial" w:cs="Arial"/>
-          <w:sz w:val="22"/>
-          <w:szCs w:val="22"/>
-          <w:lang w:val="sv-SE"/>
-        </w:rPr>
-        <w:tab/>
-        <w:t xml:space="preserve">: </w:t>
-      </w:r>
-    </w:p>
-    <w:p>
-      <w:pPr>
-        <w:pStyle w:val="ListParagraph"/>
-        <w:numPr>
-          <w:ilvl w:val="0"/>
-          <w:numId w:val="2"/>
-        </w:numPr>
-        <w:spacing w:line="480" w:lineRule="auto"/>
-        <w:rPr>
-          <w:rFonts w:ascii="Arial" w:hAnsi="Arial" w:cs="Arial"/>
-          <w:sz w:val="22"/>
-          <w:szCs w:val="22"/>
-        </w:rPr>
-      </w:pPr>
-      <w:r>
-        <w:rPr>
-          <w:rFonts w:ascii="Arial" w:hAnsi="Arial" w:cs="Arial"/>
-          <w:sz w:val="22"/>
-          <w:szCs w:val="22"/>
-        </w:rPr>
-        <w:t>LAMPIRAN</w:t>
-      </w:r>
-      <w:r>
-        <w:rPr>
-          <w:rFonts w:ascii="Arial" w:hAnsi="Arial" w:cs="Arial"/>
-          <w:sz w:val="22"/>
-          <w:szCs w:val="22"/>
-        </w:rPr>
-        <w:tab/>
-      </w:r>
-      <w:r>
-        <w:rPr>
-          <w:rFonts w:ascii="Arial" w:hAnsi="Arial" w:cs="Arial"/>
-          <w:sz w:val="22"/>
-          <w:szCs w:val="22"/>
-        </w:rPr>
-        <w:tab/>
-      </w:r>
-      <w:r>
-        <w:rPr>
-          <w:rFonts w:ascii="Arial" w:hAnsi="Arial" w:cs="Arial"/>
-          <w:sz w:val="22"/>
-          <w:szCs w:val="22"/>
-        </w:rPr>
-        <w:tab/>
-      </w:r>
-      <w:r>
-        <w:rPr>
-          <w:rFonts w:ascii="Arial" w:hAnsi="Arial" w:cs="Arial"/>
-          <w:sz w:val="22"/>
-          <w:szCs w:val="22"/>
-        </w:rPr>
-        <w:tab/>
-        <w:t xml:space="preserve">: </w:t>
-      </w:r>
-      <w:r>
-        <w:rPr>
-          <w:rFonts w:ascii="Arial" w:hAnsi="Arial" w:cs="Arial"/>
-          <w:sz w:val="22"/>
-          <w:szCs w:val="22"/>
-        </w:rPr>
-        <w:tab/>
-      </w:r>
-      <w:r>
-        <w:rPr>
-          <w:rFonts w:ascii="Arial" w:hAnsi="Arial" w:cs="Arial"/>
-          <w:sz w:val="22"/>
-          <w:szCs w:val="22"/>
-        </w:rPr>
-        <w:tab/>
-      </w:r>
-      <w:r>
-        <w:rPr>
-          <w:rFonts w:ascii="Arial" w:hAnsi="Arial" w:cs="Arial"/>
-          <w:sz w:val="22"/>
-          <w:szCs w:val="22"/>
-        </w:rPr>
-        <w:tab/>
-      </w:r>
-      <w:r>
-        <w:rPr>
-          <w:rFonts w:ascii="Arial" w:hAnsi="Arial" w:cs="Arial"/>
-          <w:sz w:val="22"/>
-          <w:szCs w:val="22"/>
-        </w:rPr>
-        <w:tab/>
-      </w:r>
-      <w:r>
-        <w:rPr>
-          <w:rFonts w:ascii="Arial" w:hAnsi="Arial" w:cs="Arial"/>
-          <w:sz w:val="22"/>
-          <w:szCs w:val="22"/>
-        </w:rPr>
-        <w:tab/>
-      </w:r>
-      <w:r>
-        <w:rPr>
-          <w:rFonts w:ascii="Arial" w:hAnsi="Arial" w:cs="Arial"/>
-          <w:sz w:val="22"/>
-          <w:szCs w:val="22"/>
-        </w:rPr>
-        <w:tab/>
-      </w:r>
-      <w:r>
-        <w:rPr>
-          <w:rFonts w:ascii="Arial" w:hAnsi="Arial" w:cs="Arial"/>
-          <w:sz w:val="22"/>
-          <w:szCs w:val="22"/>
-        </w:rPr>
-        <w:tab/>
-      </w:r>
-      <w:r>
-        <w:rPr>
-          <w:rFonts w:ascii="Arial" w:hAnsi="Arial" w:cs="Arial"/>
-          <w:sz w:val="22"/>
-          <w:szCs w:val="22"/>
-        </w:rPr>
-        <w:tab/>
-        <w:t xml:space="preserve">    </w:t>
-      </w:r>
-    </w:p>
-    <w:p>
-      <w:pPr>
-        <w:spacing w:line="480" w:lineRule="auto"/>
-        <w:ind w:left="5954" w:firstLineChars="150" w:firstLine="330"/>
-        <w:rPr>
-          <w:rFonts w:ascii="Arial" w:hAnsi="Arial" w:cs="Arial"/>
-          <w:sz w:val="22"/>
-          <w:szCs w:val="22"/>
-          <w:lang w:val="en-US"/>
-        </w:rPr>
-      </w:pPr>
-    </w:p>
-    <w:p>
-      <w:pPr>
-        <w:spacing w:line="480" w:lineRule="auto"/>
-        <w:ind w:left="5954" w:firstLineChars="150" w:firstLine="330"/>
-        <w:rPr>
-          <w:rFonts w:ascii="Arial" w:hAnsi="Arial" w:cs="Arial"/>
-          <w:sz w:val="22"/>
-          <w:szCs w:val="22"/>
-          <w:lang w:val="en-US"/>
-        </w:rPr>
-      </w:pPr>
-      <w:r>
-        <w:rPr>
-          <w:rFonts w:ascii="Arial" w:hAnsi="Arial" w:cs="Arial"/>
-          <w:sz w:val="22"/>
-          <w:szCs w:val="22"/>
-          <w:lang w:val="en-US"/>
-        </w:rPr>
-        <w:t>Bekasi</w:t>
-      </w:r>
-      <w:r>
-        <w:rPr>
-          <w:rFonts w:ascii="Arial" w:hAnsi="Arial" w:cs="Arial"/>
-          <w:sz w:val="22"/>
-          <w:szCs w:val="22"/>
-        </w:rPr>
-        <w:t xml:space="preserve">, </w:t>
-      </w:r>
-      <w:r>
-        <w:rPr>
-          <w:rFonts w:ascii="Arial" w:hAnsi="Arial" w:cs="Arial"/>
-          <w:sz w:val="22"/>
-          <w:szCs w:val="22"/>
-        </w:rPr>
-        <w:t>8</w:t>
-      </w:r>
-      <w:r>
-        <w:rPr>
-          <w:rFonts w:ascii="Arial" w:hAnsi="Arial" w:cs="Arial"/>
-          <w:sz w:val="22"/>
-          <w:szCs w:val="22"/>
-          <w:lang w:val="en-US"/>
-        </w:rPr>
-        <w:t xml:space="preserve"> </w:t>
-      </w:r>
-      <w:r>
-        <w:rPr>
-          <w:rFonts w:ascii="Arial" w:hAnsi="Arial" w:cs="Arial"/>
-          <w:sz w:val="22"/>
-          <w:szCs w:val="22"/>
-          <w:lang w:val="en-US"/>
-        </w:rPr>
-        <w:t>Juli</w:t>
-      </w:r>
-      <w:r>
-        <w:rPr>
-          <w:rFonts w:ascii="Arial" w:hAnsi="Arial" w:cs="Arial"/>
-          <w:sz w:val="22"/>
-          <w:szCs w:val="22"/>
-        </w:rPr>
-        <w:t xml:space="preserve"> 20</w:t>
-      </w:r>
-      <w:r>
-        <w:rPr>
-          <w:rFonts w:ascii="Arial" w:hAnsi="Arial" w:cs="Arial"/>
-          <w:sz w:val="22"/>
-          <w:szCs w:val="22"/>
-          <w:lang w:val="en-US"/>
-        </w:rPr>
-        <w:t>26</w:t>
-      </w:r>
-    </w:p>
-    <w:tbl>
-      <w:tblPr>
-        <w:tblStyle w:val="TableGrid"/>
-        <w:tblW w:w="0" w:type="auto"/>
-        <w:tblBorders>
-          <w:top w:val="none" w:sz="0" w:space="0" w:color="auto"/>
-          <w:left w:val="none" w:sz="0" w:space="0" w:color="auto"/>
-          <w:bottom w:val="none" w:sz="0" w:space="0" w:color="auto"/>
-          <w:right w:val="none" w:sz="0" w:space="0" w:color="auto"/>
-          <w:insideH w:val="none" w:sz="0" w:space="0" w:color="auto"/>
-          <w:insideV w:val="none" w:sz="0" w:space="0" w:color="auto"/>
-        </w:tblBorders>
-        <w:tblLook w:val="04A0" w:firstRow="1" w:lastRow="0" w:firstColumn="1" w:lastColumn="0" w:noHBand="0" w:noVBand="1"/>
-      </w:tblPr>
-      <w:tblGrid>
-        <w:gridCol w:w="3003"/>
-        <w:gridCol w:w="3003"/>
-        <w:gridCol w:w="3004"/>
-      </w:tblGrid>
-      <w:tr>
-        <w:trPr>
-          <w:trHeight w:val="618"/>
-        </w:trPr>
-        <w:tc>
-          <w:tcPr>
-            <w:tcW w:w="3003" w:type="dxa"/>
-            <w:vAlign w:val="center"/>
-          </w:tcPr>
-          <w:p>
-            <w:pPr>
-              <w:widowControl w:val="0"/>
-              <w:autoSpaceDE w:val="0"/>
-              <w:autoSpaceDN w:val="0"/>
-              <w:adjustRightInd w:val="0"/>
-              <w:jc w:val="center"/>
-              <w:rPr>
-                <w:rFonts w:ascii="Arial" w:hAnsi="Arial" w:cs="Arial"/>
-                <w:b/>
-              </w:rPr>
-            </w:pPr>
-            <w:proofErr w:type="spellStart"/>
-            <w:r>
-              <w:rPr>
-                <w:rFonts w:ascii="Arial" w:hAnsi="Arial" w:cs="Arial"/>
-                <w:b/>
-              </w:rPr>
-              <w:t>Mengetahui</w:t>
-            </w:r>
-            <w:proofErr w:type="spellEnd"/>
-            <w:r>
-              <w:rPr>
-                <w:rFonts w:ascii="Arial" w:hAnsi="Arial" w:cs="Arial"/>
-                <w:b/>
-              </w:rPr>
-              <w:t>,</w:t>
-            </w:r>
-          </w:p>
-        </w:tc>
-        <w:tc>
-          <w:tcPr>
-            <w:tcW w:w="3003" w:type="dxa"/>
-          </w:tcPr>
-          <w:p>
-            <w:pPr>
-              <w:widowControl w:val="0"/>
-              <w:autoSpaceDE w:val="0"/>
-              <w:autoSpaceDN w:val="0"/>
-              <w:adjustRightInd w:val="0"/>
-              <w:jc w:val="center"/>
-              <w:rPr>
-                <w:rFonts w:ascii="Arial" w:hAnsi="Arial" w:cs="Arial"/>
-                <w:b/>
-              </w:rPr>
-            </w:pPr>
-          </w:p>
-        </w:tc>
-        <w:tc>
-          <w:tcPr>
-            <w:tcW w:w="3004" w:type="dxa"/>
-          </w:tcPr>
-          <w:p>
-            <w:pPr>
-              <w:widowControl w:val="0"/>
-              <w:autoSpaceDE w:val="0"/>
-              <w:autoSpaceDN w:val="0"/>
-              <w:adjustRightInd w:val="0"/>
-              <w:jc w:val="center"/>
-              <w:rPr>
-                <w:rFonts w:ascii="Arial" w:hAnsi="Arial" w:cs="Arial"/>
-                <w:b/>
-              </w:rPr>
-            </w:pPr>
-          </w:p>
-        </w:tc>
-      </w:tr>
-      <w:tr>
-        <w:tc>
-          <w:tcPr>
-            <w:tcW w:w="3003" w:type="dxa"/>
-          </w:tcPr>
-          <w:p>
-            <w:pPr>
-              <w:widowControl w:val="0"/>
-              <w:autoSpaceDE w:val="0"/>
-              <w:autoSpaceDN w:val="0"/>
-              <w:adjustRightInd w:val="0"/>
-              <w:spacing w:line="288" w:lineRule="auto"/>
-              <w:jc w:val="center"/>
-              <w:rPr>
-                <w:rFonts w:ascii="Arial" w:hAnsi="Arial" w:cs="Arial"/>
-                <w:b/>
-              </w:rPr>
-            </w:pPr>
-          </w:p>
-          <w:p>
-            <w:pPr>
-              <w:widowControl w:val="0"/>
-              <w:autoSpaceDE w:val="0"/>
-              <w:autoSpaceDN w:val="0"/>
-              <w:adjustRightInd w:val="0"/>
-              <w:spacing w:line="288" w:lineRule="auto"/>
-              <w:jc w:val="center"/>
-              <w:rPr>
-                <w:rFonts w:ascii="Arial" w:hAnsi="Arial" w:cs="Arial"/>
-                <w:b/>
-              </w:rPr>
-            </w:pPr>
-          </w:p>
-          <w:p>
-            <w:pPr>
-              <w:widowControl w:val="0"/>
-              <w:autoSpaceDE w:val="0"/>
-              <w:autoSpaceDN w:val="0"/>
-              <w:adjustRightInd w:val="0"/>
-              <w:spacing w:line="288" w:lineRule="auto"/>
-              <w:jc w:val="center"/>
-              <w:rPr>
-                <w:rFonts w:ascii="Arial" w:hAnsi="Arial" w:cs="Arial"/>
-                <w:b/>
-              </w:rPr>
-            </w:pPr>
-          </w:p>
-          <w:p>
-            <w:pPr>
-              <w:widowControl w:val="0"/>
-              <w:autoSpaceDE w:val="0"/>
-              <w:autoSpaceDN w:val="0"/>
-              <w:adjustRightInd w:val="0"/>
-              <w:spacing w:line="288" w:lineRule="auto"/>
-              <w:jc w:val="center"/>
-              <w:rPr>
-                <w:rFonts w:ascii="Arial" w:hAnsi="Arial" w:cs="Arial"/>
-                <w:b/>
-              </w:rPr>
-            </w:pPr>
-          </w:p>
-          <w:p>
-            <w:pPr>
-              <w:widowControl w:val="0"/>
-              <w:autoSpaceDE w:val="0"/>
-              <w:autoSpaceDN w:val="0"/>
-              <w:adjustRightInd w:val="0"/>
-              <w:spacing w:line="288" w:lineRule="auto"/>
-              <w:jc w:val="center"/>
-              <w:rPr>
-                <w:rFonts w:ascii="Arial" w:hAnsi="Arial" w:cs="Arial"/>
-                <w:b/>
-              </w:rPr>
-            </w:pPr>
-          </w:p>
-          <w:p>
-            <w:pPr>
-              <w:widowControl w:val="0"/>
-              <w:autoSpaceDE w:val="0"/>
-              <w:autoSpaceDN w:val="0"/>
-              <w:adjustRightInd w:val="0"/>
-              <w:spacing w:line="288" w:lineRule="auto"/>
-              <w:jc w:val="center"/>
-              <w:rPr>
-                <w:rFonts w:ascii="Arial" w:hAnsi="Arial" w:cs="Arial"/>
-                <w:b/>
-              </w:rPr>
-            </w:pPr>
-          </w:p>
-          <w:p>
-            <w:pPr>
-              <w:widowControl w:val="0"/>
-              <w:autoSpaceDE w:val="0"/>
-              <w:autoSpaceDN w:val="0"/>
-              <w:adjustRightInd w:val="0"/>
-              <w:spacing w:line="288" w:lineRule="auto"/>
-              <w:jc w:val="center"/>
-              <w:rPr>
-                <w:rFonts w:ascii="Arial" w:hAnsi="Arial" w:cs="Arial"/>
-                <w:b/>
-                <w:u w:val="thick"/>
-                <w:lang w:val="en-US"/>
-              </w:rPr>
-            </w:pPr>
-            <w:r>
-              <w:rPr>
-                <w:rFonts w:ascii="Arial" w:hAnsi="Arial" w:cs="Arial"/>
-                <w:b/>
-                <w:u w:val="thick"/>
-                <w:lang w:val="en-US"/>
-              </w:rPr>
-              <w:t>{managerNama}</w:t>
-            </w:r>
-          </w:p>
-          <w:p>
-            <w:pPr>
-              <w:widowControl w:val="0"/>
-              <w:autoSpaceDE w:val="0"/>
-              <w:autoSpaceDN w:val="0"/>
-              <w:adjustRightInd w:val="0"/>
-              <w:spacing w:line="288" w:lineRule="auto"/>
-              <w:jc w:val="center"/>
-              <w:rPr>
-                <w:rFonts w:ascii="Arial" w:hAnsi="Arial" w:cs="Arial"/>
-                <w:b/>
-                <w:lang w:val="en-US"/>
-              </w:rPr>
-            </w:pPr>
-            <w:r>
-              <w:rPr>
-                <w:rFonts w:ascii="Arial" w:hAnsi="Arial" w:cs="Arial"/>
-                <w:b/>
-              </w:rPr>
-              <w:t xml:space="preserve">MANAGER ULTG </w:t>
-            </w:r>
-            <w:r>
-              <w:rPr>
-                <w:rFonts w:ascii="Arial" w:hAnsi="Arial" w:cs="Arial"/>
-                <w:b/>
-                <w:lang w:val="en-US"/>
-              </w:rPr>
-              <w:t>BEKASI</w:t>
-            </w:r>
-          </w:p>
-          <w:p>
-            <w:pPr>
-              <w:widowControl w:val="0"/>
-              <w:autoSpaceDE w:val="0"/>
-              <w:autoSpaceDN w:val="0"/>
-              <w:adjustRightInd w:val="0"/>
-              <w:spacing w:line="288" w:lineRule="auto"/>
-              <w:jc w:val="center"/>
-              <w:rPr>
-                <w:rFonts w:ascii="Arial" w:hAnsi="Arial" w:cs="Arial"/>
-                <w:b/>
-              </w:rPr>
-            </w:pPr>
-          </w:p>
-        </w:tc>
-        <w:tc>
-          <w:tcPr>
-            <w:tcW w:w="3003" w:type="dxa"/>
-          </w:tcPr>
-          <w:p>
-            <w:pPr>
-              <w:widowControl w:val="0"/>
-              <w:autoSpaceDE w:val="0"/>
-              <w:autoSpaceDN w:val="0"/>
-              <w:adjustRightInd w:val="0"/>
-              <w:spacing w:line="288" w:lineRule="auto"/>
-              <w:jc w:val="center"/>
-              <w:rPr>
-                <w:rFonts w:ascii="Arial" w:hAnsi="Arial" w:cs="Arial"/>
-                <w:b/>
-                <w:lang w:val="en-US"/>
-              </w:rPr>
-            </w:pPr>
-          </w:p>
-        </w:tc>
-        <w:tc>
-          <w:tcPr>
-            <w:tcW w:w="3004" w:type="dxa"/>
-          </w:tcPr>
-          <w:p>
-            <w:pPr>
-              <w:widowControl w:val="0"/>
-              <w:autoSpaceDE w:val="0"/>
-              <w:autoSpaceDN w:val="0"/>
-              <w:adjustRightInd w:val="0"/>
-              <w:spacing w:line="288" w:lineRule="auto"/>
-              <w:jc w:val="center"/>
-              <w:rPr>
-                <w:rFonts w:ascii="Arial" w:hAnsi="Arial" w:cs="Arial"/>
-                <w:b/>
-              </w:rPr>
-            </w:pPr>
-          </w:p>
-          <w:p>
-            <w:pPr>
-              <w:widowControl w:val="0"/>
-              <w:autoSpaceDE w:val="0"/>
-              <w:autoSpaceDN w:val="0"/>
-              <w:adjustRightInd w:val="0"/>
-              <w:spacing w:line="288" w:lineRule="auto"/>
-              <w:jc w:val="center"/>
-              <w:rPr>
-                <w:rFonts w:ascii="Arial" w:hAnsi="Arial" w:cs="Arial"/>
-                <w:b/>
-              </w:rPr>
-            </w:pPr>
-            <w:r>
-              <w:rPr>
-                <w:rFonts w:ascii="Arial" w:hAnsi="Arial" w:cs="Arial"/>
-                <w:noProof/>
-                <w:sz w:val="22"/>
-                <w:szCs w:val="22"/>
-                <w:lang w:val="en-US"/>
-              </w:rPr>
-              <w:drawing>
-                <wp:anchor distT="0" distB="0" distL="114300" distR="114300" simplePos="0" relativeHeight="251665408" behindDoc="1" locked="0" layoutInCell="1" allowOverlap="1" wp14:anchorId="73A78779" wp14:editId="7D05230A">
-                  <wp:simplePos x="0" y="0"/>
-                  <wp:positionH relativeFrom="column">
-                    <wp:posOffset>447675</wp:posOffset>
-                  </wp:positionH>
-                  <wp:positionV relativeFrom="paragraph">
-                    <wp:posOffset>64135</wp:posOffset>
-                  </wp:positionV>
-                  <wp:extent cx="871855" cy="866140"/>
-                  <wp:effectExtent l="0" t="0" r="4445" b="0"/>
-                  <wp:wrapNone/>
-                  <wp:docPr id="1" name="Picture 1"/>
-                  <wp:cNvGraphicFramePr>
-                    <a:graphicFrameLocks xmlns:a="http://schemas.openxmlformats.org/drawingml/2006/main" noChangeAspect="1"/>
-                  </wp:cNvGraphicFramePr>
-                  <a:graphic xmlns:a="http://schemas.openxmlformats.org/drawingml/2006/main">
-                    <a:graphicData uri="http://schemas.openxmlformats.org/drawingml/2006/picture">
-                      <pic:pic xmlns:pic="http://schemas.openxmlformats.org/drawingml/2006/picture">
-                        <pic:nvPicPr>
-                          <pic:cNvPr id="1" name="Picture 1"/>
-                          <pic:cNvPicPr>
-                            <a:picLocks noChangeAspect="1" noChangeArrowheads="1"/>
-                          </pic:cNvPicPr>
-                        </pic:nvPicPr>
-                        <pic:blipFill>
-                          <a:blip r:embed="rId9">
-                            <a:extLst>
-                              <a:ext uri="{28A0092B-C50C-407E-A947-70E740481C1C}">
-                                <a14:useLocalDpi xmlns:a14="http://schemas.microsoft.com/office/drawing/2010/main" val="0"/>
-                              </a:ext>
-                            </a:extLst>
-                          </a:blip>
-                          <a:srcRect l="15773" r="23107"/>
-                          <a:stretch>
-                            <a:fillRect/>
-                          </a:stretch>
-                        </pic:blipFill>
-                        <pic:spPr>
-                          <a:xfrm>
-                            <a:off x="0" y="0"/>
-                            <a:ext cx="872142" cy="866140"/>
-                          </a:xfrm>
-                          <a:prstGeom prst="rect">
-                            <a:avLst/>
-                          </a:prstGeom>
-                          <a:noFill/>
-                          <a:ln>
-                            <a:noFill/>
-                          </a:ln>
-                        </pic:spPr>
-                      </pic:pic>
-                    </a:graphicData>
-                  </a:graphic>
-                </wp:anchor>
-              </w:drawing>
-            </w:r>
-          </w:p>
-          <w:p>
-            <w:pPr>
-              <w:widowControl w:val="0"/>
-              <w:autoSpaceDE w:val="0"/>
-              <w:autoSpaceDN w:val="0"/>
-              <w:adjustRightInd w:val="0"/>
-              <w:spacing w:line="288" w:lineRule="auto"/>
-              <w:jc w:val="center"/>
-              <w:rPr>
-                <w:rFonts w:ascii="Arial" w:hAnsi="Arial" w:cs="Arial"/>
-                <w:b/>
-              </w:rPr>
-            </w:pPr>
-          </w:p>
-          <w:p>
-            <w:pPr>
-              <w:widowControl w:val="0"/>
-              <w:autoSpaceDE w:val="0"/>
-              <w:autoSpaceDN w:val="0"/>
-              <w:adjustRightInd w:val="0"/>
-              <w:spacing w:line="288" w:lineRule="auto"/>
-              <w:jc w:val="center"/>
-              <w:rPr>
-                <w:rFonts w:ascii="Arial" w:hAnsi="Arial" w:cs="Arial"/>
-                <w:b/>
-              </w:rPr>
-            </w:pPr>
-          </w:p>
-          <w:p>
-            <w:pPr>
-              <w:widowControl w:val="0"/>
-              <w:autoSpaceDE w:val="0"/>
-              <w:autoSpaceDN w:val="0"/>
-              <w:adjustRightInd w:val="0"/>
-              <w:spacing w:line="288" w:lineRule="auto"/>
-              <w:jc w:val="center"/>
-              <w:rPr>
-                <w:rFonts w:ascii="Arial" w:hAnsi="Arial" w:cs="Arial"/>
-                <w:b/>
-              </w:rPr>
-            </w:pPr>
-          </w:p>
-          <w:p>
-            <w:pPr>
-              <w:widowControl w:val="0"/>
-              <w:autoSpaceDE w:val="0"/>
-              <w:autoSpaceDN w:val="0"/>
-              <w:adjustRightInd w:val="0"/>
-              <w:spacing w:line="288" w:lineRule="auto"/>
-              <w:jc w:val="center"/>
-              <w:rPr>
-                <w:rFonts w:ascii="Arial" w:hAnsi="Arial" w:cs="Arial"/>
-                <w:b/>
-              </w:rPr>
-            </w:pPr>
-          </w:p>
-          <w:p>
-            <w:pPr>
-              <w:widowControl w:val="0"/>
-              <w:autoSpaceDE w:val="0"/>
-              <w:autoSpaceDN w:val="0"/>
-              <w:adjustRightInd w:val="0"/>
-              <w:spacing w:line="288" w:lineRule="auto"/>
-              <w:jc w:val="center"/>
-              <w:rPr>
-                <w:rFonts w:ascii="Arial" w:hAnsi="Arial" w:cs="Arial"/>
-                <w:b/>
-                <w:u w:val="thick"/>
-                <w:lang w:val="sv-SE"/>
-              </w:rPr>
-            </w:pPr>
-            <w:r>
-              <w:rPr>
-                <w:rFonts w:ascii="Arial" w:hAnsi="Arial" w:cs="Arial"/>
-                <w:b/>
-                <w:u w:val="thick"/>
-                <w:lang w:val="sv-SE"/>
-              </w:rPr>
-              <w:t>{tlNama}</w:t>
-            </w:r>
-          </w:p>
-          <w:p>
-            <w:pPr>
-              <w:widowControl w:val="0"/>
-              <w:autoSpaceDE w:val="0"/>
-              <w:autoSpaceDN w:val="0"/>
-              <w:adjustRightInd w:val="0"/>
-              <w:spacing w:line="288" w:lineRule="auto"/>
-              <w:jc w:val="center"/>
-              <w:rPr>
-                <w:rFonts w:ascii="Arial" w:hAnsi="Arial" w:cs="Arial"/>
-                <w:b/>
-                <w:lang w:val="sv-SE"/>
-              </w:rPr>
-            </w:pPr>
-            <w:r>
-              <w:rPr>
-                <w:rFonts w:ascii="Arial" w:hAnsi="Arial" w:cs="Arial"/>
-                <w:b/>
-                <w:lang w:val="sv-SE"/>
-              </w:rPr>
-              <w:t>{tlJabatan}</w:t>
-            </w:r>
-          </w:p>
-        </w:tc>
-      </w:tr>
-    </w:tbl>
-    <w:p>
-      <w:pPr>
-        <w:widowControl w:val="0"/>
-        <w:autoSpaceDE w:val="0"/>
-        <w:autoSpaceDN w:val="0"/>
-        <w:adjustRightInd w:val="0"/>
-        <w:spacing w:line="288" w:lineRule="auto"/>
-        <w:jc w:val="center"/>
-        <w:rPr>
-          <w:rFonts w:ascii="Arial" w:hAnsi="Arial" w:cs="Arial"/>
-          <w:b/>
-          <w:u w:val="thick"/>
-          <w:lang w:val="sv-SE"/>
-        </w:rPr>
-      </w:pPr>
-    </w:p>
-    <w:p>
-      <w:pPr>
-        <w:widowControl w:val="0"/>
-        <w:autoSpaceDE w:val="0"/>
-        <w:autoSpaceDN w:val="0"/>
-        <w:adjustRightInd w:val="0"/>
-        <w:spacing w:line="288" w:lineRule="auto"/>
-        <w:jc w:val="center"/>
-        <w:rPr>
-          <w:rFonts w:ascii="Arial" w:hAnsi="Arial" w:cs="Arial"/>
-          <w:b/>
-          <w:u w:val="thick"/>
-          <w:lang w:val="en-US"/>
-        </w:rPr>
-      </w:pPr>
-      <w:r>
-        <w:rPr>
-          <w:rFonts w:ascii="Arial" w:hAnsi="Arial" w:cs="Arial"/>
-          <w:b/>
-          <w:u w:val="thick"/>
-          <w:lang w:val="en-US"/>
-        </w:rPr>
-        <w:lastRenderedPageBreak/>
-        <w:t>LAMPIRAN</w:t>
-      </w:r>
-    </w:p>
-    <w:p/>
-    <w:p/>
-    <w:sectPr>
-      <w:headerReference w:type="even" r:id="rId10"/>
-      <w:headerReference w:type="default" r:id="rId11"/>
-      <w:footerReference w:type="even" r:id="rId12"/>
-      <w:footerReference w:type="default" r:id="rId13"/>
-      <w:headerReference w:type="first" r:id="rId14"/>
-      <w:footerReference w:type="first" r:id="rId15"/>
-      <w:pgSz w:w="11907" w:h="16839"/>
-      <w:pgMar w:top="964" w:right="851" w:bottom="1021" w:left="1134" w:header="709" w:footer="709" w:gutter="0"/>
-      <w:pgBorders w:offsetFrom="page">
-        <w:top w:val="pushPinNote1" w:sz="10" w:space="24" w:color="000000"/>
-        <w:left w:val="pushPinNote1" w:sz="10" w:space="24" w:color="000000"/>
-        <w:bottom w:val="pushPinNote1" w:sz="10" w:space="24" w:color="000000"/>
-        <w:right w:val="pushPinNote1" w:sz="10" w:space="24" w:color="000000"/>
-      </w:pgBorders>
-      <w:pgNumType w:start="1" w:chapStyle="1"/>
-      <w:cols w:space="720"/>
-      <w:docGrid w:linePitch="360"/>
-    </w:sectPr>
-  </w:body>
-</w:document>
+<file path=word/document.xml><?xml version="1.0" encoding="UTF-8" standalone="yes"?>
+<w:document xmlns:wpc="http://schemas.microsoft.com/office/word/2010/wordprocessingCanvas" xmlns:cx="http://schemas.microsoft.com/office/drawing/2014/chartex" xmlns:cx1="http://schemas.microsoft.com/office/drawing/2015/9/8/chartex" xmlns:cx2="http://schemas.microsoft.com/office/drawing/2015/10/21/chartex" xmlns:cx3="http://schemas.microsoft.com/office/drawing/2016/5/9/chartex" xmlns:cx4="http://schemas.microsoft.com/office/drawing/2016/5/10/chartex" xmlns:cx5="http://schemas.microsoft.com/office/drawing/2016/5/11/chartex" xmlns:cx6="http://schemas.microsoft.com/office/drawing/2016/5/12/chartex" xmlns:cx7="http://schemas.microsoft.com/office/drawing/2016/5/13/chartex" xmlns:cx8="http://schemas.microsoft.com/office/drawing/2016/5/14/chartex" xmlns:mc="http://schemas.openxmlformats.org/markup-compatibility/2006" xmlns:aink="http://schemas.microsoft.com/office/drawing/2016/ink" xmlns:am3d="http://schemas.microsoft.com/office/drawing/2017/model3d" xmlns:o="urn:schemas-microsoft-com:office:office" xmlns:oel="http://schemas.microsoft.com/office/2019/extlst" xmlns:r="http://schemas.openxmlformats.org/officeDocument/2006/relationships" xmlns:m="http://schemas.openxmlformats.org/officeDocument/2006/math" xmlns:v="urn:schemas-microsoft-com:vml" xmlns:wp14="http://schemas.microsoft.com/office/word/2010/wordprocessingDrawing" xmlns:wp="http://schemas.openxmlformats.org/drawingml/2006/wordprocessingDrawing" xmlns:w10="urn:schemas-microsoft-com:office:word" xmlns:w="http://schemas.openxmlformats.org/wordprocessingml/2006/main" xmlns:w14="http://schemas.microsoft.com/office/word/2010/wordml" xmlns:w15="http://schemas.microsoft.com/office/word/2012/wordml" xmlns:w16cex="http://schemas.microsoft.com/office/word/2018/wordml/cex" xmlns:w16cid="http://schemas.microsoft.com/office/word/2016/wordml/cid" xmlns:w16="http://schemas.microsoft.com/office/word/2018/wordml" xmlns:w16du="http://schemas.microsoft.com/office/word/2023/wordml/word16du" xmlns:w16sdtdh="http://schemas.microsoft.com/office/word/2020/wordml/sdtdatahash" xmlns:w16sdtfl="http://schemas.microsoft.com/office/word/2024/wordml/sdtformatlock" xmlns:w16se="http://schemas.microsoft.com/office/word/2015/wordml/symex" xmlns:wpg="http://schemas.microsoft.com/office/word/2010/wordprocessingGroup" xmlns:wpi="http://schemas.microsoft.com/office/word/2010/wordprocessingInk" xmlns:wne="http://schemas.microsoft.com/office/word/2006/wordml" xmlns:wps="http://schemas.microsoft.com/office/word/2010/wordprocessingShape" mc:Ignorable="w14 w15 w16se w16cid w16 w16cex w16sdtdh w16sdtfl w16du wp14"><w:body><w:p><w:pPr><w:pStyle w:val="ListParagraph"/><w:numPr><w:ilvl w:val="0"/><w:numId w:val="2"/></w:numPr><w:spacing w:line="480" w:lineRule="auto"/><w:rPr><w:rFonts w:ascii="Arial" w:hAnsi="Arial" w:cs="Arial"/><w:sz w:val="22"/><w:szCs w:val="22"/></w:rPr></w:pPr><w:r><w:rPr><w:rFonts w:ascii="Arial" w:hAnsi="Arial" w:cs="Arial"/><w:sz w:val="22"/><w:szCs w:val="22"/></w:rPr><w:t>DATA PERALATAN</w:t></w:r><w:r><w:rPr><w:rFonts w:ascii="Arial" w:hAnsi="Arial" w:cs="Arial"/><w:sz w:val="22"/><w:szCs w:val="22"/></w:rPr><w:tab/></w:r><w:r><w:rPr><w:rFonts w:ascii="Arial" w:hAnsi="Arial" w:cs="Arial"/><w:sz w:val="22"/><w:szCs w:val="22"/></w:rPr><w:tab/></w:r><w:r><w:rPr><w:rFonts w:ascii="Arial" w:hAnsi="Arial" w:cs="Arial"/><w:sz w:val="22"/><w:szCs w:val="22"/></w:rPr><w:tab/></w:r></w:p><w:p><w:pPr><w:pStyle w:val="ListParagraph"/><w:numPr><w:ilvl w:val="0"/><w:numId w:val="3"/></w:numPr><w:spacing w:line="480" w:lineRule="auto"/><w:ind w:left="1134"/><w:rPr><w:rFonts w:ascii="Arial" w:hAnsi="Arial" w:cs="Arial"/><w:sz w:val="22"/><w:szCs w:val="22"/><w:lang w:val="sv-SE"/></w:rPr></w:pPr><w:r><w:rPr><w:rFonts w:ascii="Arial" w:hAnsi="Arial" w:cs="Arial"/><w:sz w:val="22"/><w:szCs w:val="22"/><w:lang w:val="sv-SE"/></w:rPr><w:t>Nama Peralatan</w:t></w:r><w:r><w:rPr><w:rFonts w:ascii="Arial" w:hAnsi="Arial" w:cs="Arial"/><w:sz w:val="22"/><w:szCs w:val="22"/><w:lang w:val="sv-SE"/></w:rPr><w:tab/></w:r><w:r><w:rPr><w:rFonts w:ascii="Arial" w:hAnsi="Arial" w:cs="Arial"/><w:sz w:val="22"/><w:szCs w:val="22"/><w:lang w:val="sv-SE"/></w:rPr><w:tab/></w:r><w:r><w:rPr><w:rFonts w:ascii="Arial" w:hAnsi="Arial" w:cs="Arial"/><w:sz w:val="22"/><w:szCs w:val="22"/><w:lang w:val="sv-SE"/></w:rPr><w:tab/><w:t xml:space="preserve">: </w:t></w:r><w:r><w:rPr><w:rFonts w:ascii="Arial" w:hAnsi="Arial" w:cs="Arial"/><w:sz w:val="22"/><w:szCs w:val="22"/></w:rPr><w:t xml:space="preserve">{namaPeralatan}</w:t></w:r></w:p><w:p><w:pPr><w:pStyle w:val="ListParagraph"/><w:numPr><w:ilvl w:val="0"/><w:numId w:val="3"/></w:numPr><w:spacing w:line="480" w:lineRule="auto"/><w:ind w:left="1134"/><w:rPr><w:rFonts w:ascii="Arial" w:hAnsi="Arial" w:cs="Arial"/><w:sz w:val="22"/><w:szCs w:val="22"/></w:rPr></w:pPr><w:r><w:rPr><w:rFonts w:ascii="Arial" w:hAnsi="Arial" w:cs="Arial"/><w:sz w:val="22"/><w:szCs w:val="22"/></w:rPr><w:t>Merk</w:t></w:r><w:r><w:rPr><w:rFonts w:ascii="Arial" w:hAnsi="Arial" w:cs="Arial"/><w:sz w:val="22"/><w:szCs w:val="22"/></w:rPr><w:tab/></w:r><w:r><w:rPr><w:rFonts w:ascii="Arial" w:hAnsi="Arial" w:cs="Arial"/><w:sz w:val="22"/><w:szCs w:val="22"/></w:rPr><w:tab/></w:r><w:r><w:rPr><w:rFonts w:ascii="Arial" w:hAnsi="Arial" w:cs="Arial"/><w:sz w:val="22"/><w:szCs w:val="22"/></w:rPr><w:tab/></w:r><w:r><w:rPr><w:rFonts w:ascii="Arial" w:hAnsi="Arial" w:cs="Arial"/><w:sz w:val="22"/><w:szCs w:val="22"/></w:rPr><w:tab/><w:t>:</w:t></w:r><w:r><w:rPr><w:rFonts w:ascii="Arial" w:hAnsi="Arial" w:cs="Arial"/><w:sz w:val="22"/><w:szCs w:val="22"/><w:lang w:val="en-US"/></w:rPr><w:t xml:space="preserve"> </w:t></w:r><w:r><w:rPr><w:rFonts w:ascii="Arial" w:hAnsi="Arial" w:cs="Arial"/><w:sz w:val="22"/><w:szCs w:val="22"/></w:rPr><w:t xml:space="preserve">{merk}</w:t></w:r></w:p><w:p><w:pPr><w:pStyle w:val="ListParagraph"/><w:numPr><w:ilvl w:val="0"/><w:numId w:val="3"/></w:numPr><w:spacing w:line="480" w:lineRule="auto"/><w:ind w:left="1134"/><w:rPr><w:rFonts w:ascii="Arial" w:hAnsi="Arial" w:cs="Arial"/><w:sz w:val="22"/><w:szCs w:val="22"/></w:rPr></w:pPr><w:r><w:rPr><w:rFonts w:ascii="Arial" w:hAnsi="Arial" w:cs="Arial"/><w:sz w:val="22"/><w:szCs w:val="22"/></w:rPr><w:t xml:space="preserve">Type </w:t></w:r><w:r><w:rPr><w:rFonts w:ascii="Arial" w:hAnsi="Arial" w:cs="Arial"/><w:sz w:val="22"/><w:szCs w:val="22"/></w:rPr><w:tab/></w:r><w:r><w:rPr><w:rFonts w:ascii="Arial" w:hAnsi="Arial" w:cs="Arial"/><w:sz w:val="22"/><w:szCs w:val="22"/></w:rPr><w:tab/></w:r><w:r><w:rPr><w:rFonts w:ascii="Arial" w:hAnsi="Arial" w:cs="Arial"/><w:sz w:val="22"/><w:szCs w:val="22"/></w:rPr><w:tab/></w:r><w:r><w:rPr><w:rFonts w:ascii="Arial" w:hAnsi="Arial" w:cs="Arial"/><w:sz w:val="22"/><w:szCs w:val="22"/></w:rPr><w:tab/><w:t>:</w:t></w:r><w:r><w:rPr><w:rFonts w:ascii="Arial" w:hAnsi="Arial" w:cs="Arial"/><w:sz w:val="22"/><w:szCs w:val="22"/><w:lang w:val="en-US"/></w:rPr><w:t xml:space="preserve"> </w:t></w:r><w:r><w:rPr><w:rFonts w:ascii="Arial" w:hAnsi="Arial" w:cs="Arial"/><w:sz w:val="22"/><w:szCs w:val="22"/></w:rPr><w:t xml:space="preserve">{type}</w:t></w:r></w:p><w:p><w:pPr><w:pStyle w:val="ListParagraph"/><w:numPr><w:ilvl w:val="0"/><w:numId w:val="3"/></w:numPr><w:spacing w:line="480" w:lineRule="auto"/><w:ind w:left="1134"/><w:rPr><w:rFonts w:ascii="Arial" w:hAnsi="Arial" w:cs="Arial"/><w:sz w:val="22"/><w:szCs w:val="22"/></w:rPr></w:pPr><w:r><w:rPr><w:rFonts w:ascii="Arial" w:hAnsi="Arial" w:cs="Arial"/><w:sz w:val="22"/><w:szCs w:val="22"/></w:rPr><w:t>No Seri</w:t></w:r><w:r><w:rPr><w:rFonts w:ascii="Arial" w:hAnsi="Arial" w:cs="Arial"/><w:sz w:val="22"/><w:szCs w:val="22"/></w:rPr><w:tab/></w:r><w:r><w:rPr><w:rFonts w:ascii="Arial" w:hAnsi="Arial" w:cs="Arial"/><w:sz w:val="22"/><w:szCs w:val="22"/></w:rPr><w:tab/></w:r><w:r><w:rPr><w:rFonts w:ascii="Arial" w:hAnsi="Arial" w:cs="Arial"/><w:sz w:val="22"/><w:szCs w:val="22"/></w:rPr><w:tab/></w:r><w:r><w:rPr><w:rFonts w:ascii="Arial" w:hAnsi="Arial" w:cs="Arial"/><w:sz w:val="22"/><w:szCs w:val="22"/></w:rPr><w:tab/><w:t>:</w:t></w:r><w:r><w:rPr><w:rFonts w:ascii="Arial" w:hAnsi="Arial" w:cs="Arial"/><w:sz w:val="22"/><w:szCs w:val="22"/><w:lang w:val="en-US"/></w:rPr><w:t xml:space="preserve"> </w:t></w:r><w:r><w:rPr><w:rFonts w:ascii="Arial" w:hAnsi="Arial" w:cs="Arial"/><w:sz w:val="22"/><w:szCs w:val="22"/></w:rPr><w:t xml:space="preserve">{noSeri}</w:t></w:r></w:p><w:p><w:pPr><w:pStyle w:val="ListParagraph"/><w:numPr><w:ilvl w:val="0"/><w:numId w:val="3"/></w:numPr><w:spacing w:line="480" w:lineRule="auto"/><w:ind w:left="1134"/><w:rPr><w:rFonts w:ascii="Arial" w:hAnsi="Arial" w:cs="Arial"/><w:sz w:val="22"/><w:szCs w:val="22"/></w:rPr></w:pPr><w:r><w:rPr><w:rFonts w:ascii="Arial" w:hAnsi="Arial" w:cs="Arial"/><w:sz w:val="22"/><w:szCs w:val="22"/></w:rPr><w:t>Harga</w:t></w:r><w:r><w:rPr><w:rFonts w:ascii="Arial" w:hAnsi="Arial" w:cs="Arial"/><w:sz w:val="22"/><w:szCs w:val="22"/></w:rPr><w:tab/></w:r><w:r><w:rPr><w:rFonts w:ascii="Arial" w:hAnsi="Arial" w:cs="Arial"/><w:sz w:val="22"/><w:szCs w:val="22"/></w:rPr><w:tab/></w:r><w:r><w:rPr><w:rFonts w:ascii="Arial" w:hAnsi="Arial" w:cs="Arial"/><w:sz w:val="22"/><w:szCs w:val="22"/></w:rPr><w:tab/></w:r><w:r><w:rPr><w:rFonts w:ascii="Arial" w:hAnsi="Arial" w:cs="Arial"/><w:sz w:val="22"/><w:szCs w:val="22"/></w:rPr><w:tab/><w:t>:</w:t></w:r><w:r><w:rPr><w:rFonts w:ascii="Arial" w:hAnsi="Arial" w:cs="Arial"/><w:sz w:val="22"/><w:szCs w:val="22"/><w:lang w:val="en-US"/></w:rPr><w:t xml:space="preserve"> </w:t></w:r><w:r><w:rPr><w:rFonts w:ascii="Arial" w:hAnsi="Arial" w:cs="Arial"/><w:sz w:val="22"/><w:szCs w:val="22"/></w:rPr><w:t xml:space="preserve">{harga}</w:t></w:r></w:p><w:p><w:pPr><w:pStyle w:val="ListParagraph"/><w:numPr><w:ilvl w:val="0"/><w:numId w:val="3"/></w:numPr><w:spacing w:line="480" w:lineRule="auto"/><w:ind w:left="1134"/><w:rPr><w:rFonts w:ascii="Arial" w:hAnsi="Arial" w:cs="Arial"/><w:sz w:val="22"/><w:szCs w:val="22"/></w:rPr></w:pPr><w:r><w:rPr><w:rFonts w:ascii="Arial" w:hAnsi="Arial" w:cs="Arial"/><w:sz w:val="22"/><w:szCs w:val="22"/></w:rPr><w:t>Kode Asset</w:t></w:r><w:r><w:rPr><w:rFonts w:ascii="Arial" w:hAnsi="Arial" w:cs="Arial"/><w:sz w:val="22"/><w:szCs w:val="22"/></w:rPr><w:tab/></w:r><w:r><w:rPr><w:rFonts w:ascii="Arial" w:hAnsi="Arial" w:cs="Arial"/><w:sz w:val="22"/><w:szCs w:val="22"/></w:rPr><w:tab/></w:r><w:r><w:rPr><w:rFonts w:ascii="Arial" w:hAnsi="Arial" w:cs="Arial"/><w:sz w:val="22"/><w:szCs w:val="22"/></w:rPr><w:tab/><w:t>:</w:t></w:r><w:r><w:rPr><w:rFonts w:ascii="Arial" w:hAnsi="Arial" w:cs="Arial"/><w:sz w:val="22"/><w:szCs w:val="22"/><w:lang w:val="en-US"/></w:rPr><w:t xml:space="preserve"> </w:t></w:r><w:r><w:rPr><w:rFonts w:ascii="Arial" w:hAnsi="Arial" w:cs="Arial"/><w:sz w:val="22"/><w:szCs w:val="22"/></w:rPr><w:t xml:space="preserve">{kodeAsset}</w:t></w:r></w:p><w:p><w:pPr><w:pStyle w:val="ListParagraph"/><w:numPr><w:ilvl w:val="0"/><w:numId w:val="3"/></w:numPr><w:spacing w:line="480" w:lineRule="auto"/><w:ind w:left="1134"/><w:rPr><w:rFonts w:ascii="Arial" w:hAnsi="Arial" w:cs="Arial"/><w:sz w:val="22"/><w:szCs w:val="22"/></w:rPr></w:pPr><w:proofErr w:type="spellStart"/><w:r><w:rPr><w:rFonts w:ascii="Arial" w:hAnsi="Arial" w:cs="Arial"/><w:sz w:val="22"/><w:szCs w:val="22"/></w:rPr><w:t>Tahun</w:t></w:r><w:proofErr w:type="spellEnd"/><w:r><w:rPr><w:rFonts w:ascii="Arial" w:hAnsi="Arial" w:cs="Arial"/><w:sz w:val="22"/><w:szCs w:val="22"/></w:rPr><w:t xml:space="preserve"> </w:t></w:r><w:proofErr w:type="spellStart"/><w:r><w:rPr><w:rFonts w:ascii="Arial" w:hAnsi="Arial" w:cs="Arial"/><w:sz w:val="22"/><w:szCs w:val="22"/></w:rPr><w:t>Operasi</w:t></w:r><w:proofErr w:type="spellEnd"/><w:r><w:rPr><w:rFonts w:ascii="Arial" w:hAnsi="Arial" w:cs="Arial"/><w:sz w:val="22"/><w:szCs w:val="22"/></w:rPr><w:tab/></w:r><w:r><w:rPr><w:rFonts w:ascii="Arial" w:hAnsi="Arial" w:cs="Arial"/><w:sz w:val="22"/><w:szCs w:val="22"/></w:rPr><w:tab/></w:r><w:r><w:rPr><w:rFonts w:ascii="Arial" w:hAnsi="Arial" w:cs="Arial"/><w:sz w:val="22"/><w:szCs w:val="22"/></w:rPr><w:tab/><w:t>:</w:t></w:r><w:r><w:rPr><w:rFonts w:ascii="Arial" w:hAnsi="Arial" w:cs="Arial"/><w:sz w:val="22"/><w:szCs w:val="22"/><w:lang w:val="en-US"/></w:rPr><w:t xml:space="preserve"> </w:t></w:r><w:r><w:rPr><w:rFonts w:ascii="Arial" w:hAnsi="Arial" w:cs="Arial"/><w:sz w:val="22"/><w:szCs w:val="22"/></w:rPr><w:t xml:space="preserve">{tahunOperasi}</w:t></w:r></w:p><w:p><w:pPr><w:pStyle w:val="ListParagraph"/><w:numPr><w:ilvl w:val="0"/><w:numId w:val="3"/></w:numPr><w:spacing w:line="480" w:lineRule="auto"/><w:ind w:left="1134"/><w:rPr><w:rFonts w:ascii="Arial" w:hAnsi="Arial" w:cs="Arial"/><w:sz w:val="22"/><w:szCs w:val="22"/></w:rPr></w:pPr><w:proofErr w:type="spellStart"/><w:r><w:rPr><w:rFonts w:ascii="Arial" w:hAnsi="Arial" w:cs="Arial"/><w:sz w:val="22"/><w:szCs w:val="22"/></w:rPr><w:t>Tahun</w:t></w:r><w:proofErr w:type="spellEnd"/><w:r><w:rPr><w:rFonts w:ascii="Arial" w:hAnsi="Arial" w:cs="Arial"/><w:sz w:val="22"/><w:szCs w:val="22"/></w:rPr><w:t xml:space="preserve"> </w:t></w:r><w:proofErr w:type="spellStart"/><w:r><w:rPr><w:rFonts w:ascii="Arial" w:hAnsi="Arial" w:cs="Arial"/><w:sz w:val="22"/><w:szCs w:val="22"/></w:rPr><w:t>Buat</w:t></w:r><w:proofErr w:type="spellEnd"/><w:r><w:rPr><w:rFonts w:ascii="Arial" w:hAnsi="Arial" w:cs="Arial"/><w:sz w:val="22"/><w:szCs w:val="22"/></w:rPr><w:tab/></w:r><w:r><w:rPr><w:rFonts w:ascii="Arial" w:hAnsi="Arial" w:cs="Arial"/><w:sz w:val="22"/><w:szCs w:val="22"/></w:rPr><w:tab/></w:r><w:r><w:rPr><w:rFonts w:ascii="Arial" w:hAnsi="Arial" w:cs="Arial"/><w:sz w:val="22"/><w:szCs w:val="22"/></w:rPr><w:tab/><w:t>:</w:t></w:r><w:r><w:rPr><w:rFonts w:ascii="Arial" w:hAnsi="Arial" w:cs="Arial"/><w:sz w:val="22"/><w:szCs w:val="22"/><w:lang w:val="en-US"/></w:rPr><w:t xml:space="preserve"> </w:t></w:r><w:r><w:rPr><w:rFonts w:ascii="Arial" w:hAnsi="Arial" w:cs="Arial"/><w:sz w:val="22"/><w:szCs w:val="22"/></w:rPr><w:t xml:space="preserve">{tahunBuat}</w:t></w:r></w:p><w:p><w:pPr><w:pStyle w:val="ListParagraph"/><w:numPr><w:ilvl w:val="0"/><w:numId w:val="2"/></w:numPr><w:spacing w:line="480" w:lineRule="auto"/><w:rPr><w:rFonts w:ascii="Arial" w:hAnsi="Arial" w:cs="Arial"/><w:sz w:val="22"/><w:szCs w:val="22"/><w:lang w:val="sv-SE"/></w:rPr></w:pPr><w:r><w:rPr><w:rFonts w:ascii="Arial" w:hAnsi="Arial" w:cs="Arial"/><w:sz w:val="22"/><w:szCs w:val="22"/><w:lang w:val="sv-SE"/></w:rPr><w:t>PENEMPATAN PERALATAN</w:t></w:r><w:r><w:rPr><w:rFonts w:ascii="Arial" w:hAnsi="Arial" w:cs="Arial"/><w:sz w:val="22"/><w:szCs w:val="22"/><w:lang w:val="sv-SE"/></w:rPr><w:tab/><w:t xml:space="preserve">: </w:t></w:r><w:r><w:rPr><w:rFonts w:ascii="Arial" w:hAnsi="Arial" w:cs="Arial"/><w:sz w:val="22"/><w:szCs w:val="22"/></w:rPr><w:t xml:space="preserve">{penempatanPeralatan}</w:t></w:r></w:p><w:p><w:pPr><w:pStyle w:val="ListParagraph"/><w:numPr><w:ilvl w:val="0"/><w:numId w:val="2"/></w:numPr><w:spacing w:line="480" w:lineRule="auto"/><w:rPr><w:rFonts w:ascii="Arial" w:hAnsi="Arial" w:cs="Arial"/><w:sz w:val="22"/><w:szCs w:val="22"/></w:rPr></w:pPr><w:r><w:rPr><w:rFonts w:ascii="Arial" w:hAnsi="Arial" w:cs="Arial"/><w:sz w:val="22"/><w:szCs w:val="22"/></w:rPr><w:t>TANGGAL KEJADIAN</w:t></w:r><w:r><w:rPr><w:rFonts w:ascii="Arial" w:hAnsi="Arial" w:cs="Arial"/><w:sz w:val="22"/><w:szCs w:val="22"/></w:rPr><w:tab/></w:r><w:r><w:rPr><w:rFonts w:ascii="Arial" w:hAnsi="Arial" w:cs="Arial"/><w:sz w:val="22"/><w:szCs w:val="22"/></w:rPr><w:tab/><w:t>:</w:t></w:r><w:r><w:rPr><w:rFonts w:ascii="Arial" w:hAnsi="Arial" w:cs="Arial"/><w:sz w:val="22"/><w:szCs w:val="22"/><w:lang w:val="en-US"/></w:rPr><w:t xml:space="preserve"> </w:t></w:r><w:r><w:rPr><w:rFonts w:ascii="Arial" w:hAnsi="Arial" w:cs="Arial"/><w:sz w:val="22"/><w:szCs w:val="22"/></w:rPr><w:t xml:space="preserve">{tanggalKejadian}</w:t></w:r></w:p><w:p><w:pPr><w:pStyle w:val="ListParagraph"/><w:numPr><w:ilvl w:val="0"/><w:numId w:val="2"/></w:numPr><w:spacing w:line="480" w:lineRule="auto"/><w:rPr><w:rFonts w:ascii="Arial" w:hAnsi="Arial" w:cs="Arial"/><w:sz w:val="22"/><w:szCs w:val="22"/></w:rPr></w:pPr><w:r><w:rPr><w:rFonts w:ascii="Arial" w:hAnsi="Arial" w:cs="Arial"/><w:sz w:val="22"/><w:szCs w:val="22"/></w:rPr><w:t>JENIS KERUSAKAN</w:t></w:r><w:r><w:rPr><w:rFonts w:ascii="Arial" w:hAnsi="Arial" w:cs="Arial"/><w:sz w:val="22"/><w:szCs w:val="22"/></w:rPr><w:tab/></w:r><w:r><w:rPr><w:rFonts w:ascii="Arial" w:hAnsi="Arial" w:cs="Arial"/><w:sz w:val="22"/><w:szCs w:val="22"/></w:rPr><w:tab/></w:r><w:r><w:rPr><w:rFonts w:ascii="Arial" w:hAnsi="Arial" w:cs="Arial"/><w:sz w:val="22"/><w:szCs w:val="22"/></w:rPr><w:tab/><w:t>:</w:t></w:r><w:r><w:rPr><w:rFonts w:ascii="Arial" w:hAnsi="Arial" w:cs="Arial"/><w:sz w:val="22"/><w:szCs w:val="22"/><w:lang w:val="en-US"/></w:rPr><w:t xml:space="preserve"> </w:t></w:r><w:r><w:rPr><w:rFonts w:ascii="Arial" w:hAnsi="Arial" w:cs="Arial"/><w:sz w:val="22"/><w:szCs w:val="22"/></w:rPr><w:t xml:space="preserve">{jenisKerusakan}</w:t></w:r></w:p><w:p><w:pPr><w:pStyle w:val="ListParagraph"/><w:numPr><w:ilvl w:val="0"/><w:numId w:val="2"/></w:numPr><w:spacing w:line="480" w:lineRule="auto"/><w:rPr><w:rFonts w:ascii="Arial" w:hAnsi="Arial" w:cs="Arial"/><w:sz w:val="22"/><w:szCs w:val="22"/><w:lang w:val="sv-SE"/></w:rPr></w:pPr><w:r><w:rPr><w:rFonts w:ascii="Arial" w:hAnsi="Arial" w:cs="Arial"/><w:sz w:val="22"/><w:szCs w:val="22"/><w:lang w:val="sv-SE"/></w:rPr><w:t>PENYEBAB KERUSAKAN</w:t></w:r><w:r><w:rPr><w:rFonts w:ascii="Arial" w:hAnsi="Arial" w:cs="Arial"/><w:sz w:val="22"/><w:szCs w:val="22"/><w:lang w:val="sv-SE"/></w:rPr><w:tab/></w:r><w:r><w:rPr><w:rFonts w:ascii="Arial" w:hAnsi="Arial" w:cs="Arial"/><w:sz w:val="22"/><w:szCs w:val="22"/><w:lang w:val="sv-SE"/></w:rPr><w:tab/><w:t xml:space="preserve">: </w:t></w:r><w:r><w:rPr><w:rFonts w:ascii="Arial" w:hAnsi="Arial" w:cs="Arial"/><w:sz w:val="22"/><w:szCs w:val="22"/></w:rPr><w:t xml:space="preserve">{penyebabKerusakan}</w:t></w:r></w:p><w:p><w:pPr><w:pStyle w:val="ListParagraph"/><w:numPr><w:ilvl w:val="0"/><w:numId w:val="2"/></w:numPr><w:spacing w:line="480" w:lineRule="auto"/><w:rPr><w:rFonts w:ascii="Arial" w:hAnsi="Arial" w:cs="Arial"/><w:sz w:val="22"/><w:szCs w:val="22"/><w:lang w:val="sv-SE"/></w:rPr></w:pPr><w:r><w:rPr><w:rFonts w:ascii="Arial" w:hAnsi="Arial" w:cs="Arial"/><w:sz w:val="22"/><w:szCs w:val="22"/><w:lang w:val="sv-SE"/></w:rPr><w:t>AKIBAT KERUSAKAN</w:t></w:r><w:r><w:rPr><w:rFonts w:ascii="Arial" w:hAnsi="Arial" w:cs="Arial"/><w:sz w:val="22"/><w:szCs w:val="22"/><w:lang w:val="sv-SE"/></w:rPr><w:tab/></w:r><w:r><w:rPr><w:rFonts w:ascii="Arial" w:hAnsi="Arial" w:cs="Arial"/><w:sz w:val="22"/><w:szCs w:val="22"/><w:lang w:val="sv-SE"/></w:rPr><w:tab/><w:t xml:space="preserve">: </w:t></w:r><w:r><w:rPr><w:rFonts w:ascii="Arial" w:hAnsi="Arial" w:cs="Arial"/><w:sz w:val="22"/><w:szCs w:val="22"/></w:rPr><w:t xml:space="preserve">{akibatKerusakan}</w:t></w:r></w:p><w:p><w:pPr><w:pStyle w:val="ListParagraph"/><w:numPr><w:ilvl w:val="0"/><w:numId w:val="2"/></w:numPr><w:spacing w:line="480" w:lineRule="auto"/><w:rPr><w:rFonts w:ascii="Arial" w:hAnsi="Arial" w:cs="Arial"/><w:sz w:val="22"/><w:szCs w:val="22"/><w:lang w:val="sv-SE"/></w:rPr></w:pPr><w:r><w:rPr><w:rFonts w:ascii="Arial" w:hAnsi="Arial" w:cs="Arial"/><w:sz w:val="22"/><w:szCs w:val="22"/><w:lang w:val="sv-SE"/></w:rPr><w:t>USUL DAN SARAN</w:t></w:r><w:r><w:rPr><w:rFonts w:ascii="Arial" w:hAnsi="Arial" w:cs="Arial"/><w:sz w:val="22"/><w:szCs w:val="22"/><w:lang w:val="sv-SE"/></w:rPr><w:tab/></w:r><w:r><w:rPr><w:rFonts w:ascii="Arial" w:hAnsi="Arial" w:cs="Arial"/><w:sz w:val="22"/><w:szCs w:val="22"/><w:lang w:val="sv-SE"/></w:rPr><w:tab/></w:r><w:r><w:rPr><w:rFonts w:ascii="Arial" w:hAnsi="Arial" w:cs="Arial"/><w:sz w:val="22"/><w:szCs w:val="22"/><w:lang w:val="sv-SE"/></w:rPr><w:tab/><w:t xml:space="preserve">: </w:t></w:r><w:r><w:rPr><w:rFonts w:ascii="Arial" w:hAnsi="Arial" w:cs="Arial"/><w:sz w:val="22"/><w:szCs w:val="22"/></w:rPr><w:t xml:space="preserve">{usulDanSaran}</w:t></w:r></w:p><w:p><w:pPr><w:pStyle w:val="ListParagraph"/><w:numPr><w:ilvl w:val="0"/><w:numId w:val="2"/></w:numPr><w:spacing w:line="480" w:lineRule="auto"/><w:rPr><w:rFonts w:ascii="Arial" w:hAnsi="Arial" w:cs="Arial"/><w:sz w:val="22"/><w:szCs w:val="22"/></w:rPr></w:pPr><w:r><w:rPr><w:rFonts w:ascii="Arial" w:hAnsi="Arial" w:cs="Arial"/><w:sz w:val="22"/><w:szCs w:val="22"/></w:rPr><w:t>LAMPIRAN</w:t></w:r><w:r><w:rPr><w:rFonts w:ascii="Arial" w:hAnsi="Arial" w:cs="Arial"/><w:sz w:val="22"/><w:szCs w:val="22"/></w:rPr><w:tab/></w:r><w:r><w:rPr><w:rFonts w:ascii="Arial" w:hAnsi="Arial" w:cs="Arial"/><w:sz w:val="22"/><w:szCs w:val="22"/></w:rPr><w:tab/></w:r><w:r><w:rPr><w:rFonts w:ascii="Arial" w:hAnsi="Arial" w:cs="Arial"/><w:sz w:val="22"/><w:szCs w:val="22"/></w:rPr><w:tab/></w:r><w:r><w:rPr><w:rFonts w:ascii="Arial" w:hAnsi="Arial" w:cs="Arial"/><w:sz w:val="22"/><w:szCs w:val="22"/></w:rPr><w:tab/><w:t xml:space="preserve">: </w:t></w:r><w:r><w:rPr><w:rFonts w:ascii="Arial" w:hAnsi="Arial" w:cs="Arial"/><w:sz w:val="22"/><w:szCs w:val="22"/></w:rPr><w:tab/></w:r><w:r><w:rPr><w:rFonts w:ascii="Arial" w:hAnsi="Arial" w:cs="Arial"/><w:sz w:val="22"/><w:szCs w:val="22"/></w:rPr><w:tab/></w:r><w:r><w:rPr><w:rFonts w:ascii="Arial" w:hAnsi="Arial" w:cs="Arial"/><w:sz w:val="22"/><w:szCs w:val="22"/></w:rPr><w:tab/></w:r><w:r><w:rPr><w:rFonts w:ascii="Arial" w:hAnsi="Arial" w:cs="Arial"/><w:sz w:val="22"/><w:szCs w:val="22"/></w:rPr><w:tab/></w:r><w:r><w:rPr><w:rFonts w:ascii="Arial" w:hAnsi="Arial" w:cs="Arial"/><w:sz w:val="22"/><w:szCs w:val="22"/></w:rPr><w:tab/></w:r><w:r><w:rPr><w:rFonts w:ascii="Arial" w:hAnsi="Arial" w:cs="Arial"/><w:sz w:val="22"/><w:szCs w:val="22"/></w:rPr><w:tab/></w:r><w:r><w:rPr><w:rFonts w:ascii="Arial" w:hAnsi="Arial" w:cs="Arial"/><w:sz w:val="22"/><w:szCs w:val="22"/></w:rPr><w:tab/></w:r><w:r><w:rPr><w:rFonts w:ascii="Arial" w:hAnsi="Arial" w:cs="Arial"/><w:sz w:val="22"/><w:szCs w:val="22"/></w:rPr><w:tab/><w:t xml:space="preserve">    </w:t></w:r><w:r><w:rPr><w:rFonts w:ascii="Arial" w:hAnsi="Arial" w:cs="Arial"/><w:sz w:val="22"/><w:szCs w:val="22"/></w:rPr><w:t xml:space="preserve">{lampiranText}</w:t></w:r></w:p><w:p><w:pPr><w:spacing w:line="480" w:lineRule="auto"/><w:ind w:left="5954" w:firstLineChars="150" w:firstLine="330"/><w:rPr><w:rFonts w:ascii="Arial" w:hAnsi="Arial" w:cs="Arial"/><w:sz w:val="22"/><w:szCs w:val="22"/><w:lang w:val="en-US"/></w:rPr></w:pPr></w:p><w:p><w:pPr><w:spacing w:line="480" w:lineRule="auto"/><w:ind w:left="5954" w:firstLineChars="150" w:firstLine="330"/><w:r><w:rPr><w:rFonts w:ascii="Arial" w:hAnsi="Arial" w:cs="Arial"/><w:sz w:val="22"/><w:szCs w:val="22"/></w:rPr><w:t xml:space="preserve">{tanggalLokasi}</w:t></w:r></w:p><w:tbl><w:tblPr><w:tblStyle w:val="TableGrid"/><w:tblW w:w="0" w:type="auto"/><w:tblBorders><w:top w:val="none" w:sz="0" w:space="0" w:color="auto"/><w:left w:val="none" w:sz="0" w:space="0" w:color="auto"/><w:bottom w:val="none" w:sz="0" w:space="0" w:color="auto"/><w:right w:val="none" w:sz="0" w:space="0" w:color="auto"/><w:insideH w:val="none" w:sz="0" w:space="0" w:color="auto"/><w:insideV w:val="none" w:sz="0" w:space="0" w:color="auto"/></w:tblBorders><w:tblLook w:val="04A0" w:firstRow="1" w:lastRow="0" w:firstColumn="1" w:lastColumn="0" w:noHBand="0" w:noVBand="1"/></w:tblPr><w:tblGrid><w:gridCol w:w="3003"/><w:gridCol w:w="3003"/><w:gridCol w:w="3004"/></w:tblGrid><w:tr><w:trPr><w:trHeight w:val="618"/></w:trPr><w:tc><w:tcPr><w:tcW w:w="3003" w:type="dxa"/><w:vAlign w:val="center"/></w:tcPr><w:p><w:pPr><w:widowControl w:val="0"/><w:autoSpaceDE w:val="0"/><w:autoSpaceDN w:val="0"/><w:adjustRightInd w:val="0"/><w:jc w:val="center"/><w:rPr><w:rFonts w:ascii="Arial" w:hAnsi="Arial" w:cs="Arial"/><w:b/></w:rPr></w:pPr><w:proofErr w:type="spellStart"/><w:r><w:rPr><w:rFonts w:ascii="Arial" w:hAnsi="Arial" w:cs="Arial"/><w:b/></w:rPr><w:t>Mengetahui</w:t></w:r><w:proofErr w:type="spellEnd"/><w:r><w:rPr><w:rFonts w:ascii="Arial" w:hAnsi="Arial" w:cs="Arial"/><w:b/></w:rPr><w:t>,</w:t></w:r></w:p></w:tc><w:tc><w:tcPr><w:tcW w:w="3003" w:type="dxa"/></w:tcPr><w:p><w:pPr><w:widowControl w:val="0"/><w:autoSpaceDE w:val="0"/><w:autoSpaceDN w:val="0"/><w:adjustRightInd w:val="0"/><w:jc w:val="center"/><w:rPr><w:rFonts w:ascii="Arial" w:hAnsi="Arial" w:cs="Arial"/><w:b/></w:rPr></w:pPr></w:p></w:tc><w:tc><w:tcPr><w:tcW w:w="3004" w:type="dxa"/></w:tcPr><w:p><w:pPr><w:widowControl w:val="0"/><w:autoSpaceDE w:val="0"/><w:autoSpaceDN w:val="0"/><w:adjustRightInd w:val="0"/><w:jc w:val="center"/><w:rPr><w:rFonts w:ascii="Arial" w:hAnsi="Arial" w:cs="Arial"/><w:b/></w:rPr></w:pPr></w:p></w:tc></w:tr><w:tr><w:tc><w:tcPr><w:tcW w:w="3003" w:type="dxa"/></w:tcPr><w:p><w:pPr><w:widowControl w:val="0"/><w:autoSpaceDE w:val="0"/><w:autoSpaceDN w:val="0"/><w:adjustRightInd w:val="0"/><w:spacing w:line="288" w:lineRule="auto"/><w:jc w:val="center"/><w:rPr><w:rFonts w:ascii="Arial" w:hAnsi="Arial" w:cs="Arial"/><w:b/></w:rPr></w:pPr></w:p><w:p><w:pPr><w:widowControl w:val="0"/><w:autoSpaceDE w:val="0"/><w:autoSpaceDN w:val="0"/><w:adjustRightInd w:val="0"/><w:spacing w:line="288" w:lineRule="auto"/><w:jc w:val="center"/><w:rPr><w:rFonts w:ascii="Arial" w:hAnsi="Arial" w:cs="Arial"/><w:b/></w:rPr></w:pPr></w:p><w:p><w:pPr><w:widowControl w:val="0"/><w:autoSpaceDE w:val="0"/><w:autoSpaceDN w:val="0"/><w:adjustRightInd w:val="0"/><w:spacing w:line="288" w:lineRule="auto"/><w:jc w:val="center"/><w:rPr><w:rFonts w:ascii="Arial" w:hAnsi="Arial" w:cs="Arial"/><w:b/></w:rPr></w:pPr></w:p><w:p><w:pPr><w:widowControl w:val="0"/><w:autoSpaceDE w:val="0"/><w:autoSpaceDN w:val="0"/><w:adjustRightInd w:val="0"/><w:spacing w:line="288" w:lineRule="auto"/><w:jc w:val="center"/><w:rPr><w:rFonts w:ascii="Arial" w:hAnsi="Arial" w:cs="Arial"/><w:b/></w:rPr></w:pPr></w:p><w:p><w:pPr><w:widowControl w:val="0"/><w:autoSpaceDE w:val="0"/><w:autoSpaceDN w:val="0"/><w:adjustRightInd w:val="0"/><w:spacing w:line="288" w:lineRule="auto"/><w:jc w:val="center"/><w:rPr><w:rFonts w:ascii="Arial" w:hAnsi="Arial" w:cs="Arial"/><w:b/></w:rPr></w:pPr></w:p><w:p><w:pPr><w:widowControl w:val="0"/><w:autoSpaceDE w:val="0"/><w:autoSpaceDN w:val="0"/><w:adjustRightInd w:val="0"/><w:spacing w:line="288" w:lineRule="auto"/><w:jc w:val="center"/><w:rPr><w:rFonts w:ascii="Arial" w:hAnsi="Arial" w:cs="Arial"/><w:b/></w:rPr></w:pPr></w:p><w:p><w:pPr><w:widowControl w:val="0"/><w:autoSpaceDE w:val="0"/><w:autoSpaceDN w:val="0"/><w:adjustRightInd w:val="0"/><w:spacing w:line="288" w:lineRule="auto"/><w:jc w:val="center"/><w:rPr><w:rFonts w:ascii="Arial" w:hAnsi="Arial" w:cs="Arial"/><w:b/><w:u w:val="thick"/><w:lang w:val="en-US"/></w:rPr></w:pPr><w:r><w:rPr><w:rFonts w:ascii="Arial" w:hAnsi="Arial" w:cs="Arial"/><w:b/><w:u w:val="thick"/><w:lang w:val="en-US"/></w:rPr><w:t>{managerNama}</w:t></w:r></w:p><w:p><w:pPr><w:widowControl w:val="0"/><w:autoSpaceDE w:val="0"/><w:autoSpaceDN w:val="0"/><w:adjustRightInd w:val="0"/><w:spacing w:line="288" w:lineRule="auto"/><w:jc w:val="center"/><w:rPr><w:rFonts w:ascii="Arial" w:hAnsi="Arial" w:cs="Arial"/><w:b/><w:lang w:val="en-US"/></w:rPr></w:pPr><w:r><w:rPr><w:rFonts w:ascii="Arial" w:hAnsi="Arial" w:cs="Arial"/><w:b/></w:rPr><w:t xml:space="preserve">{managerJabatan}</w:t></w:r><w:r><w:rPr><w:rFonts w:ascii="Arial" w:hAnsi="Arial" w:cs="Arial"/><w:b/><w:lang w:val="en-US"/></w:rPr><w:t>BEKASI</w:t></w:r></w:p><w:p><w:pPr><w:widowControl w:val="0"/><w:autoSpaceDE w:val="0"/><w:autoSpaceDN w:val="0"/><w:adjustRightInd w:val="0"/><w:spacing w:line="288" w:lineRule="auto"/><w:jc w:val="center"/><w:rPr><w:rFonts w:ascii="Arial" w:hAnsi="Arial" w:cs="Arial"/><w:b/></w:rPr></w:pPr></w:p></w:tc><w:tc><w:tcPr><w:tcW w:w="3003" w:type="dxa"/></w:tcPr><w:p><w:pPr><w:widowControl w:val="0"/><w:autoSpaceDE w:val="0"/><w:autoSpaceDN w:val="0"/><w:adjustRightInd w:val="0"/><w:spacing w:line="288" w:lineRule="auto"/><w:jc w:val="center"/><w:rPr><w:rFonts w:ascii="Arial" w:hAnsi="Arial" w:cs="Arial"/><w:b/><w:lang w:val="en-US"/></w:rPr></w:pPr></w:p></w:tc><w:tc><w:tcPr><w:tcW w:w="3004" w:type="dxa"/></w:tcPr><w:p><w:pPr><w:widowControl w:val="0"/><w:autoSpaceDE w:val="0"/><w:autoSpaceDN w:val="0"/><w:adjustRightInd w:val="0"/><w:spacing w:line="288" w:lineRule="auto"/><w:jc w:val="center"/><w:rPr><w:rFonts w:ascii="Arial" w:hAnsi="Arial" w:cs="Arial"/><w:b/></w:rPr></w:pPr></w:p><w:p><w:pPr><w:widowControl w:val="0"/><w:autoSpaceDE w:val="0"/><w:autoSpaceDN w:val="0"/><w:adjustRightInd w:val="0"/><w:spacing w:line="288" w:lineRule="auto"/><w:jc w:val="center"/><w:rPr><w:rFonts w:ascii="Arial" w:hAnsi="Arial" w:cs="Arial"/><w:b/></w:rPr></w:pPr><w:r><w:rPr><w:rFonts w:ascii="Arial" w:hAnsi="Arial" w:cs="Arial"/><w:noProof/><w:sz w:val="22"/><w:szCs w:val="22"/><w:lang w:val="en-US"/></w:rPr><w:drawing><wp:anchor distT="0" distB="0" distL="114300" distR="114300" simplePos="0" relativeHeight="251665408" behindDoc="1" locked="0" layoutInCell="1" allowOverlap="1" wp14:anchorId="73A78779" wp14:editId="7D05230A"><wp:simplePos x="0" y="0"/><wp:positionH relativeFrom="column"><wp:posOffset>447675</wp:posOffset></wp:positionH><wp:positionV relativeFrom="paragraph"><wp:posOffset>64135</wp:posOffset></wp:positionV><wp:extent cx="871855" cy="866140"/><wp:effectExtent l="0" t="0" r="4445" b="0"/><wp:wrapNone/><wp:docPr id="1" name="Picture 1"/><wp:cNvGraphicFramePr><a:graphicFrameLocks xmlns:a="http://schemas.openxmlformats.org/drawingml/2006/main" noChangeAspect="1"/></wp:cNvGraphicFramePr><a:graphic xmlns:a="http://schemas.openxmlformats.org/drawingml/2006/main"><a:graphicData uri="http://schemas.openxmlformats.org/drawingml/2006/picture"><pic:pic xmlns:pic="http://schemas.openxmlformats.org/drawingml/2006/picture"><pic:nvPicPr><pic:cNvPr id="1" name="Picture 1"/><pic:cNvPicPr><a:picLocks noChangeAspect="1" noChangeArrowheads="1"/></pic:cNvPicPr></pic:nvPicPr><pic:blipFill><a:blip r:embed="rId9"><a:extLst><a:ext uri="{28A0092B-C50C-407E-A947-70E740481C1C}"><a14:useLocalDpi xmlns:a14="http://schemas.microsoft.com/office/drawing/2010/main" val="0"/></a:ext></a:extLst></a:blip><a:srcRect l="15773" r="23107"/><a:stretch><a:fillRect/></a:stretch></pic:blipFill><pic:spPr><a:xfrm><a:off x="0" y="0"/><a:ext cx="872142" cy="866140"/></a:xfrm><a:prstGeom prst="rect"><a:avLst/></a:prstGeom><a:noFill/><a:ln><a:noFill/></a:ln></pic:spPr></pic:pic></a:graphicData></a:graphic></wp:anchor></w:drawing></w:r></w:p><w:p><w:pPr><w:widowControl w:val="0"/><w:autoSpaceDE w:val="0"/><w:autoSpaceDN w:val="0"/><w:adjustRightInd w:val="0"/><w:spacing w:line="288" w:lineRule="auto"/><w:jc w:val="center"/><w:rPr><w:rFonts w:ascii="Arial" w:hAnsi="Arial" w:cs="Arial"/><w:b/></w:rPr></w:pPr></w:p><w:p><w:pPr><w:widowControl w:val="0"/><w:autoSpaceDE w:val="0"/><w:autoSpaceDN w:val="0"/><w:adjustRightInd w:val="0"/><w:spacing w:line="288" w:lineRule="auto"/><w:jc w:val="center"/><w:rPr><w:rFonts w:ascii="Arial" w:hAnsi="Arial" w:cs="Arial"/><w:b/></w:rPr></w:pPr></w:p><w:p><w:pPr><w:widowControl w:val="0"/><w:autoSpaceDE w:val="0"/><w:autoSpaceDN w:val="0"/><w:adjustRightInd w:val="0"/><w:spacing w:line="288" w:lineRule="auto"/><w:jc w:val="center"/><w:rPr><w:rFonts w:ascii="Arial" w:hAnsi="Arial" w:cs="Arial"/><w:b/></w:rPr></w:pPr></w:p><w:p><w:pPr><w:widowControl w:val="0"/><w:autoSpaceDE w:val="0"/><w:autoSpaceDN w:val="0"/><w:adjustRightInd w:val="0"/><w:spacing w:line="288" w:lineRule="auto"/><w:jc w:val="center"/><w:rPr><w:rFonts w:ascii="Arial" w:hAnsi="Arial" w:cs="Arial"/><w:b/></w:rPr></w:pPr></w:p><w:p><w:pPr><w:widowControl w:val="0"/><w:autoSpaceDE w:val="0"/><w:autoSpaceDN w:val="0"/><w:adjustRightInd w:val="0"/><w:spacing w:line="288" w:lineRule="auto"/><w:jc w:val="center"/><w:rPr><w:rFonts w:ascii="Arial" w:hAnsi="Arial" w:cs="Arial"/><w:b/><w:u w:val="thick"/><w:lang w:val="sv-SE"/></w:rPr></w:pPr><w:r><w:rPr><w:rFonts w:ascii="Arial" w:hAnsi="Arial" w:cs="Arial"/><w:b/><w:u w:val="thick"/><w:lang w:val="sv-SE"/></w:rPr><w:t>{tlNama}</w:t></w:r></w:p><w:p><w:pPr><w:widowControl w:val="0"/><w:autoSpaceDE w:val="0"/><w:autoSpaceDN w:val="0"/><w:adjustRightInd w:val="0"/><w:spacing w:line="288" w:lineRule="auto"/><w:jc w:val="center"/><w:rPr><w:rFonts w:ascii="Arial" w:hAnsi="Arial" w:cs="Arial"/><w:b/><w:lang w:val="sv-SE"/></w:rPr></w:pPr><w:r><w:rPr><w:rFonts w:ascii="Arial" w:hAnsi="Arial" w:cs="Arial"/><w:b/><w:lang w:val="sv-SE"/></w:rPr><w:t>{tlJabatan}</w:t></w:r></w:p></w:tc></w:tr></w:tbl><w:p><w:pPr><w:widowControl w:val="0"/><w:autoSpaceDE w:val="0"/><w:autoSpaceDN w:val="0"/><w:adjustRightInd w:val="0"/><w:spacing w:line="288" w:lineRule="auto"/><w:jc w:val="center"/><w:rPr><w:rFonts w:ascii="Arial" w:hAnsi="Arial" w:cs="Arial"/><w:b/><w:u w:val="thick"/><w:lang w:val="sv-SE"/></w:rPr></w:pPr></w:p><w:p><w:pPr><w:widowControl w:val="0"/><w:autoSpaceDE w:val="0"/><w:autoSpaceDN w:val="0"/><w:adjustRightInd w:val="0"/><w:spacing w:line="288" w:lineRule="auto"/><w:jc w:val="center"/><w:rPr><w:rFonts w:ascii="Arial" w:hAnsi="Arial" w:cs="Arial"/><w:b/><w:u w:val="thick"/><w:lang w:val="en-US"/></w:rPr></w:pPr><w:r><w:rPr><w:rFonts w:ascii="Arial" w:hAnsi="Arial" w:cs="Arial"/><w:b/><w:u w:val="thick"/><w:lang w:val="en-US"/></w:rPr><w:lastRenderedPageBreak/><w:t>LAMPIRAN</w:t></w:r></w:p><w:p/><w:p/><w:sectPr><w:headerReference w:type="even" r:id="rId10"/><w:headerReference w:type="default" r:id="rId11"/><w:footerReference w:type="even" r:id="rId12"/><w:footerReference w:type="default" r:id="rId13"/><w:headerReference w:type="first" r:id="rId14"/><w:footerReference w:type="first" r:id="rId15"/><w:pgSz w:w="11907" w:h="16839"/><w:pgMar w:top="964" w:right="851" w:bottom="1021" w:left="1134" w:header="709" w:footer="709" w:gutter="0"/><w:pgBorders w:offsetFrom="page"><w:top w:val="pushPinNote1" w:sz="10" w:space="24" w:color="000000"/><w:left w:val="pushPinNote1" w:sz="10" w:space="24" w:color="000000"/><w:bottom w:val="pushPinNote1" w:sz="10" w:space="24" w:color="000000"/><w:right w:val="pushPinNote1" w:sz="10" w:space="24" w:color="000000"/></w:pgBorders><w:pgNumType w:start="1" w:chapStyle="1"/><w:cols w:space="720"/><w:docGrid w:linePitch="360"/></w:sectPr></w:body></w:document>
 </file>
 
 <file path=word/endnotes.xml><?xml version="1.0" encoding="utf-8"?>

</xml_diff>

<commit_message>
fix: rebuild docx template safely (text-only replacement, no XML node insertion) — fixes Word cannot open file error, all 19 placeholders verified
</commit_message>
<xml_diff>
--- a/public/templates/LKP_TEMPLATE_OFFICIAL.docx
+++ b/public/templates/LKP_TEMPLATE_OFFICIAL.docx
@@ -1,6 +1,1616 @@
 
-<file path=word/document.xml><?xml version="1.0" encoding="UTF-8" standalone="yes"?>
-<w:document xmlns:wpc="http://schemas.microsoft.com/office/word/2010/wordprocessingCanvas" xmlns:cx="http://schemas.microsoft.com/office/drawing/2014/chartex" xmlns:cx1="http://schemas.microsoft.com/office/drawing/2015/9/8/chartex" xmlns:cx2="http://schemas.microsoft.com/office/drawing/2015/10/21/chartex" xmlns:cx3="http://schemas.microsoft.com/office/drawing/2016/5/9/chartex" xmlns:cx4="http://schemas.microsoft.com/office/drawing/2016/5/10/chartex" xmlns:cx5="http://schemas.microsoft.com/office/drawing/2016/5/11/chartex" xmlns:cx6="http://schemas.microsoft.com/office/drawing/2016/5/12/chartex" xmlns:cx7="http://schemas.microsoft.com/office/drawing/2016/5/13/chartex" xmlns:cx8="http://schemas.microsoft.com/office/drawing/2016/5/14/chartex" xmlns:mc="http://schemas.openxmlformats.org/markup-compatibility/2006" xmlns:aink="http://schemas.microsoft.com/office/drawing/2016/ink" xmlns:am3d="http://schemas.microsoft.com/office/drawing/2017/model3d" xmlns:o="urn:schemas-microsoft-com:office:office" xmlns:oel="http://schemas.microsoft.com/office/2019/extlst" xmlns:r="http://schemas.openxmlformats.org/officeDocument/2006/relationships" xmlns:m="http://schemas.openxmlformats.org/officeDocument/2006/math" xmlns:v="urn:schemas-microsoft-com:vml" xmlns:wp14="http://schemas.microsoft.com/office/word/2010/wordprocessingDrawing" xmlns:wp="http://schemas.openxmlformats.org/drawingml/2006/wordprocessingDrawing" xmlns:w10="urn:schemas-microsoft-com:office:word" xmlns:w="http://schemas.openxmlformats.org/wordprocessingml/2006/main" xmlns:w14="http://schemas.microsoft.com/office/word/2010/wordml" xmlns:w15="http://schemas.microsoft.com/office/word/2012/wordml" xmlns:w16cex="http://schemas.microsoft.com/office/word/2018/wordml/cex" xmlns:w16cid="http://schemas.microsoft.com/office/word/2016/wordml/cid" xmlns:w16="http://schemas.microsoft.com/office/word/2018/wordml" xmlns:w16du="http://schemas.microsoft.com/office/word/2023/wordml/word16du" xmlns:w16sdtdh="http://schemas.microsoft.com/office/word/2020/wordml/sdtdatahash" xmlns:w16sdtfl="http://schemas.microsoft.com/office/word/2024/wordml/sdtformatlock" xmlns:w16se="http://schemas.microsoft.com/office/word/2015/wordml/symex" xmlns:wpg="http://schemas.microsoft.com/office/word/2010/wordprocessingGroup" xmlns:wpi="http://schemas.microsoft.com/office/word/2010/wordprocessingInk" xmlns:wne="http://schemas.microsoft.com/office/word/2006/wordml" xmlns:wps="http://schemas.microsoft.com/office/word/2010/wordprocessingShape" mc:Ignorable="w14 w15 w16se w16cid w16 w16cex w16sdtdh w16sdtfl w16du wp14"><w:body><w:p><w:pPr><w:pStyle w:val="ListParagraph"/><w:numPr><w:ilvl w:val="0"/><w:numId w:val="2"/></w:numPr><w:spacing w:line="480" w:lineRule="auto"/><w:rPr><w:rFonts w:ascii="Arial" w:hAnsi="Arial" w:cs="Arial"/><w:sz w:val="22"/><w:szCs w:val="22"/></w:rPr></w:pPr><w:r><w:rPr><w:rFonts w:ascii="Arial" w:hAnsi="Arial" w:cs="Arial"/><w:sz w:val="22"/><w:szCs w:val="22"/></w:rPr><w:t>DATA PERALATAN</w:t></w:r><w:r><w:rPr><w:rFonts w:ascii="Arial" w:hAnsi="Arial" w:cs="Arial"/><w:sz w:val="22"/><w:szCs w:val="22"/></w:rPr><w:tab/></w:r><w:r><w:rPr><w:rFonts w:ascii="Arial" w:hAnsi="Arial" w:cs="Arial"/><w:sz w:val="22"/><w:szCs w:val="22"/></w:rPr><w:tab/></w:r><w:r><w:rPr><w:rFonts w:ascii="Arial" w:hAnsi="Arial" w:cs="Arial"/><w:sz w:val="22"/><w:szCs w:val="22"/></w:rPr><w:tab/></w:r></w:p><w:p><w:pPr><w:pStyle w:val="ListParagraph"/><w:numPr><w:ilvl w:val="0"/><w:numId w:val="3"/></w:numPr><w:spacing w:line="480" w:lineRule="auto"/><w:ind w:left="1134"/><w:rPr><w:rFonts w:ascii="Arial" w:hAnsi="Arial" w:cs="Arial"/><w:sz w:val="22"/><w:szCs w:val="22"/><w:lang w:val="sv-SE"/></w:rPr></w:pPr><w:r><w:rPr><w:rFonts w:ascii="Arial" w:hAnsi="Arial" w:cs="Arial"/><w:sz w:val="22"/><w:szCs w:val="22"/><w:lang w:val="sv-SE"/></w:rPr><w:t>Nama Peralatan</w:t></w:r><w:r><w:rPr><w:rFonts w:ascii="Arial" w:hAnsi="Arial" w:cs="Arial"/><w:sz w:val="22"/><w:szCs w:val="22"/><w:lang w:val="sv-SE"/></w:rPr><w:tab/></w:r><w:r><w:rPr><w:rFonts w:ascii="Arial" w:hAnsi="Arial" w:cs="Arial"/><w:sz w:val="22"/><w:szCs w:val="22"/><w:lang w:val="sv-SE"/></w:rPr><w:tab/></w:r><w:r><w:rPr><w:rFonts w:ascii="Arial" w:hAnsi="Arial" w:cs="Arial"/><w:sz w:val="22"/><w:szCs w:val="22"/><w:lang w:val="sv-SE"/></w:rPr><w:tab/><w:t xml:space="preserve">: </w:t></w:r><w:r><w:rPr><w:rFonts w:ascii="Arial" w:hAnsi="Arial" w:cs="Arial"/><w:sz w:val="22"/><w:szCs w:val="22"/></w:rPr><w:t xml:space="preserve">{namaPeralatan}</w:t></w:r></w:p><w:p><w:pPr><w:pStyle w:val="ListParagraph"/><w:numPr><w:ilvl w:val="0"/><w:numId w:val="3"/></w:numPr><w:spacing w:line="480" w:lineRule="auto"/><w:ind w:left="1134"/><w:rPr><w:rFonts w:ascii="Arial" w:hAnsi="Arial" w:cs="Arial"/><w:sz w:val="22"/><w:szCs w:val="22"/></w:rPr></w:pPr><w:r><w:rPr><w:rFonts w:ascii="Arial" w:hAnsi="Arial" w:cs="Arial"/><w:sz w:val="22"/><w:szCs w:val="22"/></w:rPr><w:t>Merk</w:t></w:r><w:r><w:rPr><w:rFonts w:ascii="Arial" w:hAnsi="Arial" w:cs="Arial"/><w:sz w:val="22"/><w:szCs w:val="22"/></w:rPr><w:tab/></w:r><w:r><w:rPr><w:rFonts w:ascii="Arial" w:hAnsi="Arial" w:cs="Arial"/><w:sz w:val="22"/><w:szCs w:val="22"/></w:rPr><w:tab/></w:r><w:r><w:rPr><w:rFonts w:ascii="Arial" w:hAnsi="Arial" w:cs="Arial"/><w:sz w:val="22"/><w:szCs w:val="22"/></w:rPr><w:tab/></w:r><w:r><w:rPr><w:rFonts w:ascii="Arial" w:hAnsi="Arial" w:cs="Arial"/><w:sz w:val="22"/><w:szCs w:val="22"/></w:rPr><w:tab/><w:t>:</w:t></w:r><w:r><w:rPr><w:rFonts w:ascii="Arial" w:hAnsi="Arial" w:cs="Arial"/><w:sz w:val="22"/><w:szCs w:val="22"/><w:lang w:val="en-US"/></w:rPr><w:t xml:space="preserve"> </w:t></w:r><w:r><w:rPr><w:rFonts w:ascii="Arial" w:hAnsi="Arial" w:cs="Arial"/><w:sz w:val="22"/><w:szCs w:val="22"/></w:rPr><w:t xml:space="preserve">{merk}</w:t></w:r></w:p><w:p><w:pPr><w:pStyle w:val="ListParagraph"/><w:numPr><w:ilvl w:val="0"/><w:numId w:val="3"/></w:numPr><w:spacing w:line="480" w:lineRule="auto"/><w:ind w:left="1134"/><w:rPr><w:rFonts w:ascii="Arial" w:hAnsi="Arial" w:cs="Arial"/><w:sz w:val="22"/><w:szCs w:val="22"/></w:rPr></w:pPr><w:r><w:rPr><w:rFonts w:ascii="Arial" w:hAnsi="Arial" w:cs="Arial"/><w:sz w:val="22"/><w:szCs w:val="22"/></w:rPr><w:t xml:space="preserve">Type </w:t></w:r><w:r><w:rPr><w:rFonts w:ascii="Arial" w:hAnsi="Arial" w:cs="Arial"/><w:sz w:val="22"/><w:szCs w:val="22"/></w:rPr><w:tab/></w:r><w:r><w:rPr><w:rFonts w:ascii="Arial" w:hAnsi="Arial" w:cs="Arial"/><w:sz w:val="22"/><w:szCs w:val="22"/></w:rPr><w:tab/></w:r><w:r><w:rPr><w:rFonts w:ascii="Arial" w:hAnsi="Arial" w:cs="Arial"/><w:sz w:val="22"/><w:szCs w:val="22"/></w:rPr><w:tab/></w:r><w:r><w:rPr><w:rFonts w:ascii="Arial" w:hAnsi="Arial" w:cs="Arial"/><w:sz w:val="22"/><w:szCs w:val="22"/></w:rPr><w:tab/><w:t>:</w:t></w:r><w:r><w:rPr><w:rFonts w:ascii="Arial" w:hAnsi="Arial" w:cs="Arial"/><w:sz w:val="22"/><w:szCs w:val="22"/><w:lang w:val="en-US"/></w:rPr><w:t xml:space="preserve"> </w:t></w:r><w:r><w:rPr><w:rFonts w:ascii="Arial" w:hAnsi="Arial" w:cs="Arial"/><w:sz w:val="22"/><w:szCs w:val="22"/></w:rPr><w:t xml:space="preserve">{type}</w:t></w:r></w:p><w:p><w:pPr><w:pStyle w:val="ListParagraph"/><w:numPr><w:ilvl w:val="0"/><w:numId w:val="3"/></w:numPr><w:spacing w:line="480" w:lineRule="auto"/><w:ind w:left="1134"/><w:rPr><w:rFonts w:ascii="Arial" w:hAnsi="Arial" w:cs="Arial"/><w:sz w:val="22"/><w:szCs w:val="22"/></w:rPr></w:pPr><w:r><w:rPr><w:rFonts w:ascii="Arial" w:hAnsi="Arial" w:cs="Arial"/><w:sz w:val="22"/><w:szCs w:val="22"/></w:rPr><w:t>No Seri</w:t></w:r><w:r><w:rPr><w:rFonts w:ascii="Arial" w:hAnsi="Arial" w:cs="Arial"/><w:sz w:val="22"/><w:szCs w:val="22"/></w:rPr><w:tab/></w:r><w:r><w:rPr><w:rFonts w:ascii="Arial" w:hAnsi="Arial" w:cs="Arial"/><w:sz w:val="22"/><w:szCs w:val="22"/></w:rPr><w:tab/></w:r><w:r><w:rPr><w:rFonts w:ascii="Arial" w:hAnsi="Arial" w:cs="Arial"/><w:sz w:val="22"/><w:szCs w:val="22"/></w:rPr><w:tab/></w:r><w:r><w:rPr><w:rFonts w:ascii="Arial" w:hAnsi="Arial" w:cs="Arial"/><w:sz w:val="22"/><w:szCs w:val="22"/></w:rPr><w:tab/><w:t>:</w:t></w:r><w:r><w:rPr><w:rFonts w:ascii="Arial" w:hAnsi="Arial" w:cs="Arial"/><w:sz w:val="22"/><w:szCs w:val="22"/><w:lang w:val="en-US"/></w:rPr><w:t xml:space="preserve"> </w:t></w:r><w:r><w:rPr><w:rFonts w:ascii="Arial" w:hAnsi="Arial" w:cs="Arial"/><w:sz w:val="22"/><w:szCs w:val="22"/></w:rPr><w:t xml:space="preserve">{noSeri}</w:t></w:r></w:p><w:p><w:pPr><w:pStyle w:val="ListParagraph"/><w:numPr><w:ilvl w:val="0"/><w:numId w:val="3"/></w:numPr><w:spacing w:line="480" w:lineRule="auto"/><w:ind w:left="1134"/><w:rPr><w:rFonts w:ascii="Arial" w:hAnsi="Arial" w:cs="Arial"/><w:sz w:val="22"/><w:szCs w:val="22"/></w:rPr></w:pPr><w:r><w:rPr><w:rFonts w:ascii="Arial" w:hAnsi="Arial" w:cs="Arial"/><w:sz w:val="22"/><w:szCs w:val="22"/></w:rPr><w:t>Harga</w:t></w:r><w:r><w:rPr><w:rFonts w:ascii="Arial" w:hAnsi="Arial" w:cs="Arial"/><w:sz w:val="22"/><w:szCs w:val="22"/></w:rPr><w:tab/></w:r><w:r><w:rPr><w:rFonts w:ascii="Arial" w:hAnsi="Arial" w:cs="Arial"/><w:sz w:val="22"/><w:szCs w:val="22"/></w:rPr><w:tab/></w:r><w:r><w:rPr><w:rFonts w:ascii="Arial" w:hAnsi="Arial" w:cs="Arial"/><w:sz w:val="22"/><w:szCs w:val="22"/></w:rPr><w:tab/></w:r><w:r><w:rPr><w:rFonts w:ascii="Arial" w:hAnsi="Arial" w:cs="Arial"/><w:sz w:val="22"/><w:szCs w:val="22"/></w:rPr><w:tab/><w:t>:</w:t></w:r><w:r><w:rPr><w:rFonts w:ascii="Arial" w:hAnsi="Arial" w:cs="Arial"/><w:sz w:val="22"/><w:szCs w:val="22"/><w:lang w:val="en-US"/></w:rPr><w:t xml:space="preserve"> </w:t></w:r><w:r><w:rPr><w:rFonts w:ascii="Arial" w:hAnsi="Arial" w:cs="Arial"/><w:sz w:val="22"/><w:szCs w:val="22"/></w:rPr><w:t xml:space="preserve">{harga}</w:t></w:r></w:p><w:p><w:pPr><w:pStyle w:val="ListParagraph"/><w:numPr><w:ilvl w:val="0"/><w:numId w:val="3"/></w:numPr><w:spacing w:line="480" w:lineRule="auto"/><w:ind w:left="1134"/><w:rPr><w:rFonts w:ascii="Arial" w:hAnsi="Arial" w:cs="Arial"/><w:sz w:val="22"/><w:szCs w:val="22"/></w:rPr></w:pPr><w:r><w:rPr><w:rFonts w:ascii="Arial" w:hAnsi="Arial" w:cs="Arial"/><w:sz w:val="22"/><w:szCs w:val="22"/></w:rPr><w:t>Kode Asset</w:t></w:r><w:r><w:rPr><w:rFonts w:ascii="Arial" w:hAnsi="Arial" w:cs="Arial"/><w:sz w:val="22"/><w:szCs w:val="22"/></w:rPr><w:tab/></w:r><w:r><w:rPr><w:rFonts w:ascii="Arial" w:hAnsi="Arial" w:cs="Arial"/><w:sz w:val="22"/><w:szCs w:val="22"/></w:rPr><w:tab/></w:r><w:r><w:rPr><w:rFonts w:ascii="Arial" w:hAnsi="Arial" w:cs="Arial"/><w:sz w:val="22"/><w:szCs w:val="22"/></w:rPr><w:tab/><w:t>:</w:t></w:r><w:r><w:rPr><w:rFonts w:ascii="Arial" w:hAnsi="Arial" w:cs="Arial"/><w:sz w:val="22"/><w:szCs w:val="22"/><w:lang w:val="en-US"/></w:rPr><w:t xml:space="preserve"> </w:t></w:r><w:r><w:rPr><w:rFonts w:ascii="Arial" w:hAnsi="Arial" w:cs="Arial"/><w:sz w:val="22"/><w:szCs w:val="22"/></w:rPr><w:t xml:space="preserve">{kodeAsset}</w:t></w:r></w:p><w:p><w:pPr><w:pStyle w:val="ListParagraph"/><w:numPr><w:ilvl w:val="0"/><w:numId w:val="3"/></w:numPr><w:spacing w:line="480" w:lineRule="auto"/><w:ind w:left="1134"/><w:rPr><w:rFonts w:ascii="Arial" w:hAnsi="Arial" w:cs="Arial"/><w:sz w:val="22"/><w:szCs w:val="22"/></w:rPr></w:pPr><w:proofErr w:type="spellStart"/><w:r><w:rPr><w:rFonts w:ascii="Arial" w:hAnsi="Arial" w:cs="Arial"/><w:sz w:val="22"/><w:szCs w:val="22"/></w:rPr><w:t>Tahun</w:t></w:r><w:proofErr w:type="spellEnd"/><w:r><w:rPr><w:rFonts w:ascii="Arial" w:hAnsi="Arial" w:cs="Arial"/><w:sz w:val="22"/><w:szCs w:val="22"/></w:rPr><w:t xml:space="preserve"> </w:t></w:r><w:proofErr w:type="spellStart"/><w:r><w:rPr><w:rFonts w:ascii="Arial" w:hAnsi="Arial" w:cs="Arial"/><w:sz w:val="22"/><w:szCs w:val="22"/></w:rPr><w:t>Operasi</w:t></w:r><w:proofErr w:type="spellEnd"/><w:r><w:rPr><w:rFonts w:ascii="Arial" w:hAnsi="Arial" w:cs="Arial"/><w:sz w:val="22"/><w:szCs w:val="22"/></w:rPr><w:tab/></w:r><w:r><w:rPr><w:rFonts w:ascii="Arial" w:hAnsi="Arial" w:cs="Arial"/><w:sz w:val="22"/><w:szCs w:val="22"/></w:rPr><w:tab/></w:r><w:r><w:rPr><w:rFonts w:ascii="Arial" w:hAnsi="Arial" w:cs="Arial"/><w:sz w:val="22"/><w:szCs w:val="22"/></w:rPr><w:tab/><w:t>:</w:t></w:r><w:r><w:rPr><w:rFonts w:ascii="Arial" w:hAnsi="Arial" w:cs="Arial"/><w:sz w:val="22"/><w:szCs w:val="22"/><w:lang w:val="en-US"/></w:rPr><w:t xml:space="preserve"> </w:t></w:r><w:r><w:rPr><w:rFonts w:ascii="Arial" w:hAnsi="Arial" w:cs="Arial"/><w:sz w:val="22"/><w:szCs w:val="22"/></w:rPr><w:t xml:space="preserve">{tahunOperasi}</w:t></w:r></w:p><w:p><w:pPr><w:pStyle w:val="ListParagraph"/><w:numPr><w:ilvl w:val="0"/><w:numId w:val="3"/></w:numPr><w:spacing w:line="480" w:lineRule="auto"/><w:ind w:left="1134"/><w:rPr><w:rFonts w:ascii="Arial" w:hAnsi="Arial" w:cs="Arial"/><w:sz w:val="22"/><w:szCs w:val="22"/></w:rPr></w:pPr><w:proofErr w:type="spellStart"/><w:r><w:rPr><w:rFonts w:ascii="Arial" w:hAnsi="Arial" w:cs="Arial"/><w:sz w:val="22"/><w:szCs w:val="22"/></w:rPr><w:t>Tahun</w:t></w:r><w:proofErr w:type="spellEnd"/><w:r><w:rPr><w:rFonts w:ascii="Arial" w:hAnsi="Arial" w:cs="Arial"/><w:sz w:val="22"/><w:szCs w:val="22"/></w:rPr><w:t xml:space="preserve"> </w:t></w:r><w:proofErr w:type="spellStart"/><w:r><w:rPr><w:rFonts w:ascii="Arial" w:hAnsi="Arial" w:cs="Arial"/><w:sz w:val="22"/><w:szCs w:val="22"/></w:rPr><w:t>Buat</w:t></w:r><w:proofErr w:type="spellEnd"/><w:r><w:rPr><w:rFonts w:ascii="Arial" w:hAnsi="Arial" w:cs="Arial"/><w:sz w:val="22"/><w:szCs w:val="22"/></w:rPr><w:tab/></w:r><w:r><w:rPr><w:rFonts w:ascii="Arial" w:hAnsi="Arial" w:cs="Arial"/><w:sz w:val="22"/><w:szCs w:val="22"/></w:rPr><w:tab/></w:r><w:r><w:rPr><w:rFonts w:ascii="Arial" w:hAnsi="Arial" w:cs="Arial"/><w:sz w:val="22"/><w:szCs w:val="22"/></w:rPr><w:tab/><w:t>:</w:t></w:r><w:r><w:rPr><w:rFonts w:ascii="Arial" w:hAnsi="Arial" w:cs="Arial"/><w:sz w:val="22"/><w:szCs w:val="22"/><w:lang w:val="en-US"/></w:rPr><w:t xml:space="preserve"> </w:t></w:r><w:r><w:rPr><w:rFonts w:ascii="Arial" w:hAnsi="Arial" w:cs="Arial"/><w:sz w:val="22"/><w:szCs w:val="22"/></w:rPr><w:t xml:space="preserve">{tahunBuat}</w:t></w:r></w:p><w:p><w:pPr><w:pStyle w:val="ListParagraph"/><w:numPr><w:ilvl w:val="0"/><w:numId w:val="2"/></w:numPr><w:spacing w:line="480" w:lineRule="auto"/><w:rPr><w:rFonts w:ascii="Arial" w:hAnsi="Arial" w:cs="Arial"/><w:sz w:val="22"/><w:szCs w:val="22"/><w:lang w:val="sv-SE"/></w:rPr></w:pPr><w:r><w:rPr><w:rFonts w:ascii="Arial" w:hAnsi="Arial" w:cs="Arial"/><w:sz w:val="22"/><w:szCs w:val="22"/><w:lang w:val="sv-SE"/></w:rPr><w:t>PENEMPATAN PERALATAN</w:t></w:r><w:r><w:rPr><w:rFonts w:ascii="Arial" w:hAnsi="Arial" w:cs="Arial"/><w:sz w:val="22"/><w:szCs w:val="22"/><w:lang w:val="sv-SE"/></w:rPr><w:tab/><w:t xml:space="preserve">: </w:t></w:r><w:r><w:rPr><w:rFonts w:ascii="Arial" w:hAnsi="Arial" w:cs="Arial"/><w:sz w:val="22"/><w:szCs w:val="22"/></w:rPr><w:t xml:space="preserve">{penempatanPeralatan}</w:t></w:r></w:p><w:p><w:pPr><w:pStyle w:val="ListParagraph"/><w:numPr><w:ilvl w:val="0"/><w:numId w:val="2"/></w:numPr><w:spacing w:line="480" w:lineRule="auto"/><w:rPr><w:rFonts w:ascii="Arial" w:hAnsi="Arial" w:cs="Arial"/><w:sz w:val="22"/><w:szCs w:val="22"/></w:rPr></w:pPr><w:r><w:rPr><w:rFonts w:ascii="Arial" w:hAnsi="Arial" w:cs="Arial"/><w:sz w:val="22"/><w:szCs w:val="22"/></w:rPr><w:t>TANGGAL KEJADIAN</w:t></w:r><w:r><w:rPr><w:rFonts w:ascii="Arial" w:hAnsi="Arial" w:cs="Arial"/><w:sz w:val="22"/><w:szCs w:val="22"/></w:rPr><w:tab/></w:r><w:r><w:rPr><w:rFonts w:ascii="Arial" w:hAnsi="Arial" w:cs="Arial"/><w:sz w:val="22"/><w:szCs w:val="22"/></w:rPr><w:tab/><w:t>:</w:t></w:r><w:r><w:rPr><w:rFonts w:ascii="Arial" w:hAnsi="Arial" w:cs="Arial"/><w:sz w:val="22"/><w:szCs w:val="22"/><w:lang w:val="en-US"/></w:rPr><w:t xml:space="preserve"> </w:t></w:r><w:r><w:rPr><w:rFonts w:ascii="Arial" w:hAnsi="Arial" w:cs="Arial"/><w:sz w:val="22"/><w:szCs w:val="22"/></w:rPr><w:t xml:space="preserve">{tanggalKejadian}</w:t></w:r></w:p><w:p><w:pPr><w:pStyle w:val="ListParagraph"/><w:numPr><w:ilvl w:val="0"/><w:numId w:val="2"/></w:numPr><w:spacing w:line="480" w:lineRule="auto"/><w:rPr><w:rFonts w:ascii="Arial" w:hAnsi="Arial" w:cs="Arial"/><w:sz w:val="22"/><w:szCs w:val="22"/></w:rPr></w:pPr><w:r><w:rPr><w:rFonts w:ascii="Arial" w:hAnsi="Arial" w:cs="Arial"/><w:sz w:val="22"/><w:szCs w:val="22"/></w:rPr><w:t>JENIS KERUSAKAN</w:t></w:r><w:r><w:rPr><w:rFonts w:ascii="Arial" w:hAnsi="Arial" w:cs="Arial"/><w:sz w:val="22"/><w:szCs w:val="22"/></w:rPr><w:tab/></w:r><w:r><w:rPr><w:rFonts w:ascii="Arial" w:hAnsi="Arial" w:cs="Arial"/><w:sz w:val="22"/><w:szCs w:val="22"/></w:rPr><w:tab/></w:r><w:r><w:rPr><w:rFonts w:ascii="Arial" w:hAnsi="Arial" w:cs="Arial"/><w:sz w:val="22"/><w:szCs w:val="22"/></w:rPr><w:tab/><w:t>:</w:t></w:r><w:r><w:rPr><w:rFonts w:ascii="Arial" w:hAnsi="Arial" w:cs="Arial"/><w:sz w:val="22"/><w:szCs w:val="22"/><w:lang w:val="en-US"/></w:rPr><w:t xml:space="preserve"> </w:t></w:r><w:r><w:rPr><w:rFonts w:ascii="Arial" w:hAnsi="Arial" w:cs="Arial"/><w:sz w:val="22"/><w:szCs w:val="22"/></w:rPr><w:t xml:space="preserve">{jenisKerusakan}</w:t></w:r></w:p><w:p><w:pPr><w:pStyle w:val="ListParagraph"/><w:numPr><w:ilvl w:val="0"/><w:numId w:val="2"/></w:numPr><w:spacing w:line="480" w:lineRule="auto"/><w:rPr><w:rFonts w:ascii="Arial" w:hAnsi="Arial" w:cs="Arial"/><w:sz w:val="22"/><w:szCs w:val="22"/><w:lang w:val="sv-SE"/></w:rPr></w:pPr><w:r><w:rPr><w:rFonts w:ascii="Arial" w:hAnsi="Arial" w:cs="Arial"/><w:sz w:val="22"/><w:szCs w:val="22"/><w:lang w:val="sv-SE"/></w:rPr><w:t>PENYEBAB KERUSAKAN</w:t></w:r><w:r><w:rPr><w:rFonts w:ascii="Arial" w:hAnsi="Arial" w:cs="Arial"/><w:sz w:val="22"/><w:szCs w:val="22"/><w:lang w:val="sv-SE"/></w:rPr><w:tab/></w:r><w:r><w:rPr><w:rFonts w:ascii="Arial" w:hAnsi="Arial" w:cs="Arial"/><w:sz w:val="22"/><w:szCs w:val="22"/><w:lang w:val="sv-SE"/></w:rPr><w:tab/><w:t xml:space="preserve">: </w:t></w:r><w:r><w:rPr><w:rFonts w:ascii="Arial" w:hAnsi="Arial" w:cs="Arial"/><w:sz w:val="22"/><w:szCs w:val="22"/></w:rPr><w:t xml:space="preserve">{penyebabKerusakan}</w:t></w:r></w:p><w:p><w:pPr><w:pStyle w:val="ListParagraph"/><w:numPr><w:ilvl w:val="0"/><w:numId w:val="2"/></w:numPr><w:spacing w:line="480" w:lineRule="auto"/><w:rPr><w:rFonts w:ascii="Arial" w:hAnsi="Arial" w:cs="Arial"/><w:sz w:val="22"/><w:szCs w:val="22"/><w:lang w:val="sv-SE"/></w:rPr></w:pPr><w:r><w:rPr><w:rFonts w:ascii="Arial" w:hAnsi="Arial" w:cs="Arial"/><w:sz w:val="22"/><w:szCs w:val="22"/><w:lang w:val="sv-SE"/></w:rPr><w:t>AKIBAT KERUSAKAN</w:t></w:r><w:r><w:rPr><w:rFonts w:ascii="Arial" w:hAnsi="Arial" w:cs="Arial"/><w:sz w:val="22"/><w:szCs w:val="22"/><w:lang w:val="sv-SE"/></w:rPr><w:tab/></w:r><w:r><w:rPr><w:rFonts w:ascii="Arial" w:hAnsi="Arial" w:cs="Arial"/><w:sz w:val="22"/><w:szCs w:val="22"/><w:lang w:val="sv-SE"/></w:rPr><w:tab/><w:t xml:space="preserve">: </w:t></w:r><w:r><w:rPr><w:rFonts w:ascii="Arial" w:hAnsi="Arial" w:cs="Arial"/><w:sz w:val="22"/><w:szCs w:val="22"/></w:rPr><w:t xml:space="preserve">{akibatKerusakan}</w:t></w:r></w:p><w:p><w:pPr><w:pStyle w:val="ListParagraph"/><w:numPr><w:ilvl w:val="0"/><w:numId w:val="2"/></w:numPr><w:spacing w:line="480" w:lineRule="auto"/><w:rPr><w:rFonts w:ascii="Arial" w:hAnsi="Arial" w:cs="Arial"/><w:sz w:val="22"/><w:szCs w:val="22"/><w:lang w:val="sv-SE"/></w:rPr></w:pPr><w:r><w:rPr><w:rFonts w:ascii="Arial" w:hAnsi="Arial" w:cs="Arial"/><w:sz w:val="22"/><w:szCs w:val="22"/><w:lang w:val="sv-SE"/></w:rPr><w:t>USUL DAN SARAN</w:t></w:r><w:r><w:rPr><w:rFonts w:ascii="Arial" w:hAnsi="Arial" w:cs="Arial"/><w:sz w:val="22"/><w:szCs w:val="22"/><w:lang w:val="sv-SE"/></w:rPr><w:tab/></w:r><w:r><w:rPr><w:rFonts w:ascii="Arial" w:hAnsi="Arial" w:cs="Arial"/><w:sz w:val="22"/><w:szCs w:val="22"/><w:lang w:val="sv-SE"/></w:rPr><w:tab/></w:r><w:r><w:rPr><w:rFonts w:ascii="Arial" w:hAnsi="Arial" w:cs="Arial"/><w:sz w:val="22"/><w:szCs w:val="22"/><w:lang w:val="sv-SE"/></w:rPr><w:tab/><w:t xml:space="preserve">: </w:t></w:r><w:r><w:rPr><w:rFonts w:ascii="Arial" w:hAnsi="Arial" w:cs="Arial"/><w:sz w:val="22"/><w:szCs w:val="22"/></w:rPr><w:t xml:space="preserve">{usulDanSaran}</w:t></w:r></w:p><w:p><w:pPr><w:pStyle w:val="ListParagraph"/><w:numPr><w:ilvl w:val="0"/><w:numId w:val="2"/></w:numPr><w:spacing w:line="480" w:lineRule="auto"/><w:rPr><w:rFonts w:ascii="Arial" w:hAnsi="Arial" w:cs="Arial"/><w:sz w:val="22"/><w:szCs w:val="22"/></w:rPr></w:pPr><w:r><w:rPr><w:rFonts w:ascii="Arial" w:hAnsi="Arial" w:cs="Arial"/><w:sz w:val="22"/><w:szCs w:val="22"/></w:rPr><w:t>LAMPIRAN</w:t></w:r><w:r><w:rPr><w:rFonts w:ascii="Arial" w:hAnsi="Arial" w:cs="Arial"/><w:sz w:val="22"/><w:szCs w:val="22"/></w:rPr><w:tab/></w:r><w:r><w:rPr><w:rFonts w:ascii="Arial" w:hAnsi="Arial" w:cs="Arial"/><w:sz w:val="22"/><w:szCs w:val="22"/></w:rPr><w:tab/></w:r><w:r><w:rPr><w:rFonts w:ascii="Arial" w:hAnsi="Arial" w:cs="Arial"/><w:sz w:val="22"/><w:szCs w:val="22"/></w:rPr><w:tab/></w:r><w:r><w:rPr><w:rFonts w:ascii="Arial" w:hAnsi="Arial" w:cs="Arial"/><w:sz w:val="22"/><w:szCs w:val="22"/></w:rPr><w:tab/><w:t xml:space="preserve">: </w:t></w:r><w:r><w:rPr><w:rFonts w:ascii="Arial" w:hAnsi="Arial" w:cs="Arial"/><w:sz w:val="22"/><w:szCs w:val="22"/></w:rPr><w:tab/></w:r><w:r><w:rPr><w:rFonts w:ascii="Arial" w:hAnsi="Arial" w:cs="Arial"/><w:sz w:val="22"/><w:szCs w:val="22"/></w:rPr><w:tab/></w:r><w:r><w:rPr><w:rFonts w:ascii="Arial" w:hAnsi="Arial" w:cs="Arial"/><w:sz w:val="22"/><w:szCs w:val="22"/></w:rPr><w:tab/></w:r><w:r><w:rPr><w:rFonts w:ascii="Arial" w:hAnsi="Arial" w:cs="Arial"/><w:sz w:val="22"/><w:szCs w:val="22"/></w:rPr><w:tab/></w:r><w:r><w:rPr><w:rFonts w:ascii="Arial" w:hAnsi="Arial" w:cs="Arial"/><w:sz w:val="22"/><w:szCs w:val="22"/></w:rPr><w:tab/></w:r><w:r><w:rPr><w:rFonts w:ascii="Arial" w:hAnsi="Arial" w:cs="Arial"/><w:sz w:val="22"/><w:szCs w:val="22"/></w:rPr><w:tab/></w:r><w:r><w:rPr><w:rFonts w:ascii="Arial" w:hAnsi="Arial" w:cs="Arial"/><w:sz w:val="22"/><w:szCs w:val="22"/></w:rPr><w:tab/></w:r><w:r><w:rPr><w:rFonts w:ascii="Arial" w:hAnsi="Arial" w:cs="Arial"/><w:sz w:val="22"/><w:szCs w:val="22"/></w:rPr><w:tab/><w:t xml:space="preserve">    </w:t></w:r><w:r><w:rPr><w:rFonts w:ascii="Arial" w:hAnsi="Arial" w:cs="Arial"/><w:sz w:val="22"/><w:szCs w:val="22"/></w:rPr><w:t xml:space="preserve">{lampiranText}</w:t></w:r></w:p><w:p><w:pPr><w:spacing w:line="480" w:lineRule="auto"/><w:ind w:left="5954" w:firstLineChars="150" w:firstLine="330"/><w:rPr><w:rFonts w:ascii="Arial" w:hAnsi="Arial" w:cs="Arial"/><w:sz w:val="22"/><w:szCs w:val="22"/><w:lang w:val="en-US"/></w:rPr></w:pPr></w:p><w:p><w:pPr><w:spacing w:line="480" w:lineRule="auto"/><w:ind w:left="5954" w:firstLineChars="150" w:firstLine="330"/><w:r><w:rPr><w:rFonts w:ascii="Arial" w:hAnsi="Arial" w:cs="Arial"/><w:sz w:val="22"/><w:szCs w:val="22"/></w:rPr><w:t xml:space="preserve">{tanggalLokasi}</w:t></w:r></w:p><w:tbl><w:tblPr><w:tblStyle w:val="TableGrid"/><w:tblW w:w="0" w:type="auto"/><w:tblBorders><w:top w:val="none" w:sz="0" w:space="0" w:color="auto"/><w:left w:val="none" w:sz="0" w:space="0" w:color="auto"/><w:bottom w:val="none" w:sz="0" w:space="0" w:color="auto"/><w:right w:val="none" w:sz="0" w:space="0" w:color="auto"/><w:insideH w:val="none" w:sz="0" w:space="0" w:color="auto"/><w:insideV w:val="none" w:sz="0" w:space="0" w:color="auto"/></w:tblBorders><w:tblLook w:val="04A0" w:firstRow="1" w:lastRow="0" w:firstColumn="1" w:lastColumn="0" w:noHBand="0" w:noVBand="1"/></w:tblPr><w:tblGrid><w:gridCol w:w="3003"/><w:gridCol w:w="3003"/><w:gridCol w:w="3004"/></w:tblGrid><w:tr><w:trPr><w:trHeight w:val="618"/></w:trPr><w:tc><w:tcPr><w:tcW w:w="3003" w:type="dxa"/><w:vAlign w:val="center"/></w:tcPr><w:p><w:pPr><w:widowControl w:val="0"/><w:autoSpaceDE w:val="0"/><w:autoSpaceDN w:val="0"/><w:adjustRightInd w:val="0"/><w:jc w:val="center"/><w:rPr><w:rFonts w:ascii="Arial" w:hAnsi="Arial" w:cs="Arial"/><w:b/></w:rPr></w:pPr><w:proofErr w:type="spellStart"/><w:r><w:rPr><w:rFonts w:ascii="Arial" w:hAnsi="Arial" w:cs="Arial"/><w:b/></w:rPr><w:t>Mengetahui</w:t></w:r><w:proofErr w:type="spellEnd"/><w:r><w:rPr><w:rFonts w:ascii="Arial" w:hAnsi="Arial" w:cs="Arial"/><w:b/></w:rPr><w:t>,</w:t></w:r></w:p></w:tc><w:tc><w:tcPr><w:tcW w:w="3003" w:type="dxa"/></w:tcPr><w:p><w:pPr><w:widowControl w:val="0"/><w:autoSpaceDE w:val="0"/><w:autoSpaceDN w:val="0"/><w:adjustRightInd w:val="0"/><w:jc w:val="center"/><w:rPr><w:rFonts w:ascii="Arial" w:hAnsi="Arial" w:cs="Arial"/><w:b/></w:rPr></w:pPr></w:p></w:tc><w:tc><w:tcPr><w:tcW w:w="3004" w:type="dxa"/></w:tcPr><w:p><w:pPr><w:widowControl w:val="0"/><w:autoSpaceDE w:val="0"/><w:autoSpaceDN w:val="0"/><w:adjustRightInd w:val="0"/><w:jc w:val="center"/><w:rPr><w:rFonts w:ascii="Arial" w:hAnsi="Arial" w:cs="Arial"/><w:b/></w:rPr></w:pPr></w:p></w:tc></w:tr><w:tr><w:tc><w:tcPr><w:tcW w:w="3003" w:type="dxa"/></w:tcPr><w:p><w:pPr><w:widowControl w:val="0"/><w:autoSpaceDE w:val="0"/><w:autoSpaceDN w:val="0"/><w:adjustRightInd w:val="0"/><w:spacing w:line="288" w:lineRule="auto"/><w:jc w:val="center"/><w:rPr><w:rFonts w:ascii="Arial" w:hAnsi="Arial" w:cs="Arial"/><w:b/></w:rPr></w:pPr></w:p><w:p><w:pPr><w:widowControl w:val="0"/><w:autoSpaceDE w:val="0"/><w:autoSpaceDN w:val="0"/><w:adjustRightInd w:val="0"/><w:spacing w:line="288" w:lineRule="auto"/><w:jc w:val="center"/><w:rPr><w:rFonts w:ascii="Arial" w:hAnsi="Arial" w:cs="Arial"/><w:b/></w:rPr></w:pPr></w:p><w:p><w:pPr><w:widowControl w:val="0"/><w:autoSpaceDE w:val="0"/><w:autoSpaceDN w:val="0"/><w:adjustRightInd w:val="0"/><w:spacing w:line="288" w:lineRule="auto"/><w:jc w:val="center"/><w:rPr><w:rFonts w:ascii="Arial" w:hAnsi="Arial" w:cs="Arial"/><w:b/></w:rPr></w:pPr></w:p><w:p><w:pPr><w:widowControl w:val="0"/><w:autoSpaceDE w:val="0"/><w:autoSpaceDN w:val="0"/><w:adjustRightInd w:val="0"/><w:spacing w:line="288" w:lineRule="auto"/><w:jc w:val="center"/><w:rPr><w:rFonts w:ascii="Arial" w:hAnsi="Arial" w:cs="Arial"/><w:b/></w:rPr></w:pPr></w:p><w:p><w:pPr><w:widowControl w:val="0"/><w:autoSpaceDE w:val="0"/><w:autoSpaceDN w:val="0"/><w:adjustRightInd w:val="0"/><w:spacing w:line="288" w:lineRule="auto"/><w:jc w:val="center"/><w:rPr><w:rFonts w:ascii="Arial" w:hAnsi="Arial" w:cs="Arial"/><w:b/></w:rPr></w:pPr></w:p><w:p><w:pPr><w:widowControl w:val="0"/><w:autoSpaceDE w:val="0"/><w:autoSpaceDN w:val="0"/><w:adjustRightInd w:val="0"/><w:spacing w:line="288" w:lineRule="auto"/><w:jc w:val="center"/><w:rPr><w:rFonts w:ascii="Arial" w:hAnsi="Arial" w:cs="Arial"/><w:b/></w:rPr></w:pPr></w:p><w:p><w:pPr><w:widowControl w:val="0"/><w:autoSpaceDE w:val="0"/><w:autoSpaceDN w:val="0"/><w:adjustRightInd w:val="0"/><w:spacing w:line="288" w:lineRule="auto"/><w:jc w:val="center"/><w:rPr><w:rFonts w:ascii="Arial" w:hAnsi="Arial" w:cs="Arial"/><w:b/><w:u w:val="thick"/><w:lang w:val="en-US"/></w:rPr></w:pPr><w:r><w:rPr><w:rFonts w:ascii="Arial" w:hAnsi="Arial" w:cs="Arial"/><w:b/><w:u w:val="thick"/><w:lang w:val="en-US"/></w:rPr><w:t>{managerNama}</w:t></w:r></w:p><w:p><w:pPr><w:widowControl w:val="0"/><w:autoSpaceDE w:val="0"/><w:autoSpaceDN w:val="0"/><w:adjustRightInd w:val="0"/><w:spacing w:line="288" w:lineRule="auto"/><w:jc w:val="center"/><w:rPr><w:rFonts w:ascii="Arial" w:hAnsi="Arial" w:cs="Arial"/><w:b/><w:lang w:val="en-US"/></w:rPr></w:pPr><w:r><w:rPr><w:rFonts w:ascii="Arial" w:hAnsi="Arial" w:cs="Arial"/><w:b/></w:rPr><w:t xml:space="preserve">{managerJabatan}</w:t></w:r><w:r><w:rPr><w:rFonts w:ascii="Arial" w:hAnsi="Arial" w:cs="Arial"/><w:b/><w:lang w:val="en-US"/></w:rPr><w:t>BEKASI</w:t></w:r></w:p><w:p><w:pPr><w:widowControl w:val="0"/><w:autoSpaceDE w:val="0"/><w:autoSpaceDN w:val="0"/><w:adjustRightInd w:val="0"/><w:spacing w:line="288" w:lineRule="auto"/><w:jc w:val="center"/><w:rPr><w:rFonts w:ascii="Arial" w:hAnsi="Arial" w:cs="Arial"/><w:b/></w:rPr></w:pPr></w:p></w:tc><w:tc><w:tcPr><w:tcW w:w="3003" w:type="dxa"/></w:tcPr><w:p><w:pPr><w:widowControl w:val="0"/><w:autoSpaceDE w:val="0"/><w:autoSpaceDN w:val="0"/><w:adjustRightInd w:val="0"/><w:spacing w:line="288" w:lineRule="auto"/><w:jc w:val="center"/><w:rPr><w:rFonts w:ascii="Arial" w:hAnsi="Arial" w:cs="Arial"/><w:b/><w:lang w:val="en-US"/></w:rPr></w:pPr></w:p></w:tc><w:tc><w:tcPr><w:tcW w:w="3004" w:type="dxa"/></w:tcPr><w:p><w:pPr><w:widowControl w:val="0"/><w:autoSpaceDE w:val="0"/><w:autoSpaceDN w:val="0"/><w:adjustRightInd w:val="0"/><w:spacing w:line="288" w:lineRule="auto"/><w:jc w:val="center"/><w:rPr><w:rFonts w:ascii="Arial" w:hAnsi="Arial" w:cs="Arial"/><w:b/></w:rPr></w:pPr></w:p><w:p><w:pPr><w:widowControl w:val="0"/><w:autoSpaceDE w:val="0"/><w:autoSpaceDN w:val="0"/><w:adjustRightInd w:val="0"/><w:spacing w:line="288" w:lineRule="auto"/><w:jc w:val="center"/><w:rPr><w:rFonts w:ascii="Arial" w:hAnsi="Arial" w:cs="Arial"/><w:b/></w:rPr></w:pPr><w:r><w:rPr><w:rFonts w:ascii="Arial" w:hAnsi="Arial" w:cs="Arial"/><w:noProof/><w:sz w:val="22"/><w:szCs w:val="22"/><w:lang w:val="en-US"/></w:rPr><w:drawing><wp:anchor distT="0" distB="0" distL="114300" distR="114300" simplePos="0" relativeHeight="251665408" behindDoc="1" locked="0" layoutInCell="1" allowOverlap="1" wp14:anchorId="73A78779" wp14:editId="7D05230A"><wp:simplePos x="0" y="0"/><wp:positionH relativeFrom="column"><wp:posOffset>447675</wp:posOffset></wp:positionH><wp:positionV relativeFrom="paragraph"><wp:posOffset>64135</wp:posOffset></wp:positionV><wp:extent cx="871855" cy="866140"/><wp:effectExtent l="0" t="0" r="4445" b="0"/><wp:wrapNone/><wp:docPr id="1" name="Picture 1"/><wp:cNvGraphicFramePr><a:graphicFrameLocks xmlns:a="http://schemas.openxmlformats.org/drawingml/2006/main" noChangeAspect="1"/></wp:cNvGraphicFramePr><a:graphic xmlns:a="http://schemas.openxmlformats.org/drawingml/2006/main"><a:graphicData uri="http://schemas.openxmlformats.org/drawingml/2006/picture"><pic:pic xmlns:pic="http://schemas.openxmlformats.org/drawingml/2006/picture"><pic:nvPicPr><pic:cNvPr id="1" name="Picture 1"/><pic:cNvPicPr><a:picLocks noChangeAspect="1" noChangeArrowheads="1"/></pic:cNvPicPr></pic:nvPicPr><pic:blipFill><a:blip r:embed="rId9"><a:extLst><a:ext uri="{28A0092B-C50C-407E-A947-70E740481C1C}"><a14:useLocalDpi xmlns:a14="http://schemas.microsoft.com/office/drawing/2010/main" val="0"/></a:ext></a:extLst></a:blip><a:srcRect l="15773" r="23107"/><a:stretch><a:fillRect/></a:stretch></pic:blipFill><pic:spPr><a:xfrm><a:off x="0" y="0"/><a:ext cx="872142" cy="866140"/></a:xfrm><a:prstGeom prst="rect"><a:avLst/></a:prstGeom><a:noFill/><a:ln><a:noFill/></a:ln></pic:spPr></pic:pic></a:graphicData></a:graphic></wp:anchor></w:drawing></w:r></w:p><w:p><w:pPr><w:widowControl w:val="0"/><w:autoSpaceDE w:val="0"/><w:autoSpaceDN w:val="0"/><w:adjustRightInd w:val="0"/><w:spacing w:line="288" w:lineRule="auto"/><w:jc w:val="center"/><w:rPr><w:rFonts w:ascii="Arial" w:hAnsi="Arial" w:cs="Arial"/><w:b/></w:rPr></w:pPr></w:p><w:p><w:pPr><w:widowControl w:val="0"/><w:autoSpaceDE w:val="0"/><w:autoSpaceDN w:val="0"/><w:adjustRightInd w:val="0"/><w:spacing w:line="288" w:lineRule="auto"/><w:jc w:val="center"/><w:rPr><w:rFonts w:ascii="Arial" w:hAnsi="Arial" w:cs="Arial"/><w:b/></w:rPr></w:pPr></w:p><w:p><w:pPr><w:widowControl w:val="0"/><w:autoSpaceDE w:val="0"/><w:autoSpaceDN w:val="0"/><w:adjustRightInd w:val="0"/><w:spacing w:line="288" w:lineRule="auto"/><w:jc w:val="center"/><w:rPr><w:rFonts w:ascii="Arial" w:hAnsi="Arial" w:cs="Arial"/><w:b/></w:rPr></w:pPr></w:p><w:p><w:pPr><w:widowControl w:val="0"/><w:autoSpaceDE w:val="0"/><w:autoSpaceDN w:val="0"/><w:adjustRightInd w:val="0"/><w:spacing w:line="288" w:lineRule="auto"/><w:jc w:val="center"/><w:rPr><w:rFonts w:ascii="Arial" w:hAnsi="Arial" w:cs="Arial"/><w:b/></w:rPr></w:pPr></w:p><w:p><w:pPr><w:widowControl w:val="0"/><w:autoSpaceDE w:val="0"/><w:autoSpaceDN w:val="0"/><w:adjustRightInd w:val="0"/><w:spacing w:line="288" w:lineRule="auto"/><w:jc w:val="center"/><w:rPr><w:rFonts w:ascii="Arial" w:hAnsi="Arial" w:cs="Arial"/><w:b/><w:u w:val="thick"/><w:lang w:val="sv-SE"/></w:rPr></w:pPr><w:r><w:rPr><w:rFonts w:ascii="Arial" w:hAnsi="Arial" w:cs="Arial"/><w:b/><w:u w:val="thick"/><w:lang w:val="sv-SE"/></w:rPr><w:t>{tlNama}</w:t></w:r></w:p><w:p><w:pPr><w:widowControl w:val="0"/><w:autoSpaceDE w:val="0"/><w:autoSpaceDN w:val="0"/><w:adjustRightInd w:val="0"/><w:spacing w:line="288" w:lineRule="auto"/><w:jc w:val="center"/><w:rPr><w:rFonts w:ascii="Arial" w:hAnsi="Arial" w:cs="Arial"/><w:b/><w:lang w:val="sv-SE"/></w:rPr></w:pPr><w:r><w:rPr><w:rFonts w:ascii="Arial" w:hAnsi="Arial" w:cs="Arial"/><w:b/><w:lang w:val="sv-SE"/></w:rPr><w:t>{tlJabatan}</w:t></w:r></w:p></w:tc></w:tr></w:tbl><w:p><w:pPr><w:widowControl w:val="0"/><w:autoSpaceDE w:val="0"/><w:autoSpaceDN w:val="0"/><w:adjustRightInd w:val="0"/><w:spacing w:line="288" w:lineRule="auto"/><w:jc w:val="center"/><w:rPr><w:rFonts w:ascii="Arial" w:hAnsi="Arial" w:cs="Arial"/><w:b/><w:u w:val="thick"/><w:lang w:val="sv-SE"/></w:rPr></w:pPr></w:p><w:p><w:pPr><w:widowControl w:val="0"/><w:autoSpaceDE w:val="0"/><w:autoSpaceDN w:val="0"/><w:adjustRightInd w:val="0"/><w:spacing w:line="288" w:lineRule="auto"/><w:jc w:val="center"/><w:rPr><w:rFonts w:ascii="Arial" w:hAnsi="Arial" w:cs="Arial"/><w:b/><w:u w:val="thick"/><w:lang w:val="en-US"/></w:rPr></w:pPr><w:r><w:rPr><w:rFonts w:ascii="Arial" w:hAnsi="Arial" w:cs="Arial"/><w:b/><w:u w:val="thick"/><w:lang w:val="en-US"/></w:rPr><w:lastRenderedPageBreak/><w:t>LAMPIRAN</w:t></w:r></w:p><w:p/><w:p/><w:sectPr><w:headerReference w:type="even" r:id="rId10"/><w:headerReference w:type="default" r:id="rId11"/><w:footerReference w:type="even" r:id="rId12"/><w:footerReference w:type="default" r:id="rId13"/><w:headerReference w:type="first" r:id="rId14"/><w:footerReference w:type="first" r:id="rId15"/><w:pgSz w:w="11907" w:h="16839"/><w:pgMar w:top="964" w:right="851" w:bottom="1021" w:left="1134" w:header="709" w:footer="709" w:gutter="0"/><w:pgBorders w:offsetFrom="page"><w:top w:val="pushPinNote1" w:sz="10" w:space="24" w:color="000000"/><w:left w:val="pushPinNote1" w:sz="10" w:space="24" w:color="000000"/><w:bottom w:val="pushPinNote1" w:sz="10" w:space="24" w:color="000000"/><w:right w:val="pushPinNote1" w:sz="10" w:space="24" w:color="000000"/></w:pgBorders><w:pgNumType w:start="1" w:chapStyle="1"/><w:cols w:space="720"/><w:docGrid w:linePitch="360"/></w:sectPr></w:body></w:document>
+<file path=word/document.xml><?xml version="1.0" encoding="utf-8"?>
+<w:document xmlns:wpc="http://schemas.microsoft.com/office/word/2010/wordprocessingCanvas" xmlns:cx="http://schemas.microsoft.com/office/drawing/2014/chartex" xmlns:cx1="http://schemas.microsoft.com/office/drawing/2015/9/8/chartex" xmlns:cx2="http://schemas.microsoft.com/office/drawing/2015/10/21/chartex" xmlns:cx3="http://schemas.microsoft.com/office/drawing/2016/5/9/chartex" xmlns:cx4="http://schemas.microsoft.com/office/drawing/2016/5/10/chartex" xmlns:cx5="http://schemas.microsoft.com/office/drawing/2016/5/11/chartex" xmlns:cx6="http://schemas.microsoft.com/office/drawing/2016/5/12/chartex" xmlns:cx7="http://schemas.microsoft.com/office/drawing/2016/5/13/chartex" xmlns:cx8="http://schemas.microsoft.com/office/drawing/2016/5/14/chartex" xmlns:mc="http://schemas.openxmlformats.org/markup-compatibility/2006" xmlns:aink="http://schemas.microsoft.com/office/drawing/2016/ink" xmlns:am3d="http://schemas.microsoft.com/office/drawing/2017/model3d" xmlns:o="urn:schemas-microsoft-com:office:office" xmlns:oel="http://schemas.microsoft.com/office/2019/extlst" xmlns:r="http://schemas.openxmlformats.org/officeDocument/2006/relationships" xmlns:m="http://schemas.openxmlformats.org/officeDocument/2006/math" xmlns:v="urn:schemas-microsoft-com:vml" xmlns:wp14="http://schemas.microsoft.com/office/word/2010/wordprocessingDrawing" xmlns:wp="http://schemas.openxmlformats.org/drawingml/2006/wordprocessingDrawing" xmlns:w10="urn:schemas-microsoft-com:office:word" xmlns:w="http://schemas.openxmlformats.org/wordprocessingml/2006/main" xmlns:w14="http://schemas.microsoft.com/office/word/2010/wordml" xmlns:w15="http://schemas.microsoft.com/office/word/2012/wordml" xmlns:w16cex="http://schemas.microsoft.com/office/word/2018/wordml/cex" xmlns:w16cid="http://schemas.microsoft.com/office/word/2016/wordml/cid" xmlns:w16="http://schemas.microsoft.com/office/word/2018/wordml" xmlns:w16du="http://schemas.microsoft.com/office/word/2023/wordml/word16du" xmlns:w16sdtdh="http://schemas.microsoft.com/office/word/2020/wordml/sdtdatahash" xmlns:w16sdtfl="http://schemas.microsoft.com/office/word/2024/wordml/sdtformatlock" xmlns:w16se="http://schemas.microsoft.com/office/word/2015/wordml/symex" xmlns:wpg="http://schemas.microsoft.com/office/word/2010/wordprocessingGroup" xmlns:wpi="http://schemas.microsoft.com/office/word/2010/wordprocessingInk" xmlns:wne="http://schemas.microsoft.com/office/word/2006/wordml" xmlns:wps="http://schemas.microsoft.com/office/word/2010/wordprocessingShape" mc:Ignorable="w14 w15 w16se w16cid w16 w16cex w16sdtdh w16sdtfl w16du wp14">
+  <w:body>
+    <w:p>
+      <w:pPr>
+        <w:pStyle w:val="ListParagraph"/>
+        <w:numPr>
+          <w:ilvl w:val="0"/>
+          <w:numId w:val="2"/>
+        </w:numPr>
+        <w:spacing w:line="480" w:lineRule="auto"/>
+        <w:rPr>
+          <w:rFonts w:ascii="Arial" w:hAnsi="Arial" w:cs="Arial"/>
+          <w:sz w:val="22"/>
+          <w:szCs w:val="22"/>
+        </w:rPr>
+      </w:pPr>
+      <w:r>
+        <w:rPr>
+          <w:rFonts w:ascii="Arial" w:hAnsi="Arial" w:cs="Arial"/>
+          <w:sz w:val="22"/>
+          <w:szCs w:val="22"/>
+        </w:rPr>
+        <w:t>DATA PERALATAN</w:t>
+      </w:r>
+      <w:r>
+        <w:rPr>
+          <w:rFonts w:ascii="Arial" w:hAnsi="Arial" w:cs="Arial"/>
+          <w:sz w:val="22"/>
+          <w:szCs w:val="22"/>
+        </w:rPr>
+        <w:tab/>
+      </w:r>
+      <w:r>
+        <w:rPr>
+          <w:rFonts w:ascii="Arial" w:hAnsi="Arial" w:cs="Arial"/>
+          <w:sz w:val="22"/>
+          <w:szCs w:val="22"/>
+        </w:rPr>
+        <w:tab/>
+      </w:r>
+      <w:r>
+        <w:rPr>
+          <w:rFonts w:ascii="Arial" w:hAnsi="Arial" w:cs="Arial"/>
+          <w:sz w:val="22"/>
+          <w:szCs w:val="22"/>
+        </w:rPr>
+        <w:tab/>
+      </w:r>
+    </w:p>
+    <w:p>
+      <w:pPr>
+        <w:pStyle w:val="ListParagraph"/>
+        <w:numPr>
+          <w:ilvl w:val="0"/>
+          <w:numId w:val="3"/>
+        </w:numPr>
+        <w:spacing w:line="480" w:lineRule="auto"/>
+        <w:ind w:left="1134"/>
+        <w:rPr>
+          <w:rFonts w:ascii="Arial" w:hAnsi="Arial" w:cs="Arial"/>
+          <w:sz w:val="22"/>
+          <w:szCs w:val="22"/>
+          <w:lang w:val="sv-SE"/>
+        </w:rPr>
+      </w:pPr>
+      <w:r>
+        <w:rPr>
+          <w:rFonts w:ascii="Arial" w:hAnsi="Arial" w:cs="Arial"/>
+          <w:sz w:val="22"/>
+          <w:szCs w:val="22"/>
+          <w:lang w:val="sv-SE"/>
+        </w:rPr>
+        <w:t>Nama Peralatan</w:t>
+      </w:r>
+      <w:r>
+        <w:rPr>
+          <w:rFonts w:ascii="Arial" w:hAnsi="Arial" w:cs="Arial"/>
+          <w:sz w:val="22"/>
+          <w:szCs w:val="22"/>
+          <w:lang w:val="sv-SE"/>
+        </w:rPr>
+        <w:tab/>
+      </w:r>
+      <w:r>
+        <w:rPr>
+          <w:rFonts w:ascii="Arial" w:hAnsi="Arial" w:cs="Arial"/>
+          <w:sz w:val="22"/>
+          <w:szCs w:val="22"/>
+          <w:lang w:val="sv-SE"/>
+        </w:rPr>
+        <w:tab/>
+      </w:r>
+      <w:r>
+        <w:rPr>
+          <w:rFonts w:ascii="Arial" w:hAnsi="Arial" w:cs="Arial"/>
+          <w:sz w:val="22"/>
+          <w:szCs w:val="22"/>
+          <w:lang w:val="sv-SE"/>
+        </w:rPr>
+        <w:tab/>
+        <w:t xml:space="preserve">: {namaPeralatan}</w:t>
+      </w:r>
+    </w:p>
+    <w:p>
+      <w:pPr>
+        <w:pStyle w:val="ListParagraph"/>
+        <w:numPr>
+          <w:ilvl w:val="0"/>
+          <w:numId w:val="3"/>
+        </w:numPr>
+        <w:spacing w:line="480" w:lineRule="auto"/>
+        <w:ind w:left="1134"/>
+        <w:rPr>
+          <w:rFonts w:ascii="Arial" w:hAnsi="Arial" w:cs="Arial"/>
+          <w:sz w:val="22"/>
+          <w:szCs w:val="22"/>
+        </w:rPr>
+      </w:pPr>
+      <w:r>
+        <w:rPr>
+          <w:rFonts w:ascii="Arial" w:hAnsi="Arial" w:cs="Arial"/>
+          <w:sz w:val="22"/>
+          <w:szCs w:val="22"/>
+        </w:rPr>
+        <w:t>Merk</w:t>
+      </w:r>
+      <w:r>
+        <w:rPr>
+          <w:rFonts w:ascii="Arial" w:hAnsi="Arial" w:cs="Arial"/>
+          <w:sz w:val="22"/>
+          <w:szCs w:val="22"/>
+        </w:rPr>
+        <w:tab/>
+      </w:r>
+      <w:r>
+        <w:rPr>
+          <w:rFonts w:ascii="Arial" w:hAnsi="Arial" w:cs="Arial"/>
+          <w:sz w:val="22"/>
+          <w:szCs w:val="22"/>
+        </w:rPr>
+        <w:tab/>
+      </w:r>
+      <w:r>
+        <w:rPr>
+          <w:rFonts w:ascii="Arial" w:hAnsi="Arial" w:cs="Arial"/>
+          <w:sz w:val="22"/>
+          <w:szCs w:val="22"/>
+        </w:rPr>
+        <w:tab/>
+      </w:r>
+      <w:r>
+        <w:rPr>
+          <w:rFonts w:ascii="Arial" w:hAnsi="Arial" w:cs="Arial"/>
+          <w:sz w:val="22"/>
+          <w:szCs w:val="22"/>
+        </w:rPr>
+        <w:tab/>
+        <w:t>:</w:t>
+      </w:r>
+      <w:r>
+        <w:rPr>
+          <w:rFonts w:ascii="Arial" w:hAnsi="Arial" w:cs="Arial"/>
+          <w:sz w:val="22"/>
+          <w:szCs w:val="22"/>
+          <w:lang w:val="en-US"/>
+        </w:rPr>
+        <w:t xml:space="preserve">: {merk}</w:t>
+      </w:r>
+    </w:p>
+    <w:p>
+      <w:pPr>
+        <w:pStyle w:val="ListParagraph"/>
+        <w:numPr>
+          <w:ilvl w:val="0"/>
+          <w:numId w:val="3"/>
+        </w:numPr>
+        <w:spacing w:line="480" w:lineRule="auto"/>
+        <w:ind w:left="1134"/>
+        <w:rPr>
+          <w:rFonts w:ascii="Arial" w:hAnsi="Arial" w:cs="Arial"/>
+          <w:sz w:val="22"/>
+          <w:szCs w:val="22"/>
+        </w:rPr>
+      </w:pPr>
+      <w:r>
+        <w:rPr>
+          <w:rFonts w:ascii="Arial" w:hAnsi="Arial" w:cs="Arial"/>
+          <w:sz w:val="22"/>
+          <w:szCs w:val="22"/>
+        </w:rPr>
+        <w:t xml:space="preserve">Type </w:t>
+      </w:r>
+      <w:r>
+        <w:rPr>
+          <w:rFonts w:ascii="Arial" w:hAnsi="Arial" w:cs="Arial"/>
+          <w:sz w:val="22"/>
+          <w:szCs w:val="22"/>
+        </w:rPr>
+        <w:tab/>
+      </w:r>
+      <w:r>
+        <w:rPr>
+          <w:rFonts w:ascii="Arial" w:hAnsi="Arial" w:cs="Arial"/>
+          <w:sz w:val="22"/>
+          <w:szCs w:val="22"/>
+        </w:rPr>
+        <w:tab/>
+      </w:r>
+      <w:r>
+        <w:rPr>
+          <w:rFonts w:ascii="Arial" w:hAnsi="Arial" w:cs="Arial"/>
+          <w:sz w:val="22"/>
+          <w:szCs w:val="22"/>
+        </w:rPr>
+        <w:tab/>
+      </w:r>
+      <w:r>
+        <w:rPr>
+          <w:rFonts w:ascii="Arial" w:hAnsi="Arial" w:cs="Arial"/>
+          <w:sz w:val="22"/>
+          <w:szCs w:val="22"/>
+        </w:rPr>
+        <w:tab/>
+        <w:t>:</w:t>
+      </w:r>
+      <w:r>
+        <w:rPr>
+          <w:rFonts w:ascii="Arial" w:hAnsi="Arial" w:cs="Arial"/>
+          <w:sz w:val="22"/>
+          <w:szCs w:val="22"/>
+          <w:lang w:val="en-US"/>
+        </w:rPr>
+        <w:t xml:space="preserve">: {type}</w:t>
+      </w:r>
+    </w:p>
+    <w:p>
+      <w:pPr>
+        <w:pStyle w:val="ListParagraph"/>
+        <w:numPr>
+          <w:ilvl w:val="0"/>
+          <w:numId w:val="3"/>
+        </w:numPr>
+        <w:spacing w:line="480" w:lineRule="auto"/>
+        <w:ind w:left="1134"/>
+        <w:rPr>
+          <w:rFonts w:ascii="Arial" w:hAnsi="Arial" w:cs="Arial"/>
+          <w:sz w:val="22"/>
+          <w:szCs w:val="22"/>
+        </w:rPr>
+      </w:pPr>
+      <w:r>
+        <w:rPr>
+          <w:rFonts w:ascii="Arial" w:hAnsi="Arial" w:cs="Arial"/>
+          <w:sz w:val="22"/>
+          <w:szCs w:val="22"/>
+        </w:rPr>
+        <w:t>No Seri</w:t>
+      </w:r>
+      <w:r>
+        <w:rPr>
+          <w:rFonts w:ascii="Arial" w:hAnsi="Arial" w:cs="Arial"/>
+          <w:sz w:val="22"/>
+          <w:szCs w:val="22"/>
+        </w:rPr>
+        <w:tab/>
+      </w:r>
+      <w:r>
+        <w:rPr>
+          <w:rFonts w:ascii="Arial" w:hAnsi="Arial" w:cs="Arial"/>
+          <w:sz w:val="22"/>
+          <w:szCs w:val="22"/>
+        </w:rPr>
+        <w:tab/>
+      </w:r>
+      <w:r>
+        <w:rPr>
+          <w:rFonts w:ascii="Arial" w:hAnsi="Arial" w:cs="Arial"/>
+          <w:sz w:val="22"/>
+          <w:szCs w:val="22"/>
+        </w:rPr>
+        <w:tab/>
+      </w:r>
+      <w:r>
+        <w:rPr>
+          <w:rFonts w:ascii="Arial" w:hAnsi="Arial" w:cs="Arial"/>
+          <w:sz w:val="22"/>
+          <w:szCs w:val="22"/>
+        </w:rPr>
+        <w:tab/>
+        <w:t>:</w:t>
+      </w:r>
+      <w:r>
+        <w:rPr>
+          <w:rFonts w:ascii="Arial" w:hAnsi="Arial" w:cs="Arial"/>
+          <w:sz w:val="22"/>
+          <w:szCs w:val="22"/>
+          <w:lang w:val="en-US"/>
+        </w:rPr>
+        <w:t xml:space="preserve">: {noSeri}</w:t>
+      </w:r>
+    </w:p>
+    <w:p>
+      <w:pPr>
+        <w:pStyle w:val="ListParagraph"/>
+        <w:numPr>
+          <w:ilvl w:val="0"/>
+          <w:numId w:val="3"/>
+        </w:numPr>
+        <w:spacing w:line="480" w:lineRule="auto"/>
+        <w:ind w:left="1134"/>
+        <w:rPr>
+          <w:rFonts w:ascii="Arial" w:hAnsi="Arial" w:cs="Arial"/>
+          <w:sz w:val="22"/>
+          <w:szCs w:val="22"/>
+        </w:rPr>
+      </w:pPr>
+      <w:r>
+        <w:rPr>
+          <w:rFonts w:ascii="Arial" w:hAnsi="Arial" w:cs="Arial"/>
+          <w:sz w:val="22"/>
+          <w:szCs w:val="22"/>
+        </w:rPr>
+        <w:t>Harga</w:t>
+      </w:r>
+      <w:r>
+        <w:rPr>
+          <w:rFonts w:ascii="Arial" w:hAnsi="Arial" w:cs="Arial"/>
+          <w:sz w:val="22"/>
+          <w:szCs w:val="22"/>
+        </w:rPr>
+        <w:tab/>
+      </w:r>
+      <w:r>
+        <w:rPr>
+          <w:rFonts w:ascii="Arial" w:hAnsi="Arial" w:cs="Arial"/>
+          <w:sz w:val="22"/>
+          <w:szCs w:val="22"/>
+        </w:rPr>
+        <w:tab/>
+      </w:r>
+      <w:r>
+        <w:rPr>
+          <w:rFonts w:ascii="Arial" w:hAnsi="Arial" w:cs="Arial"/>
+          <w:sz w:val="22"/>
+          <w:szCs w:val="22"/>
+        </w:rPr>
+        <w:tab/>
+      </w:r>
+      <w:r>
+        <w:rPr>
+          <w:rFonts w:ascii="Arial" w:hAnsi="Arial" w:cs="Arial"/>
+          <w:sz w:val="22"/>
+          <w:szCs w:val="22"/>
+        </w:rPr>
+        <w:tab/>
+        <w:t>:</w:t>
+      </w:r>
+      <w:r>
+        <w:rPr>
+          <w:rFonts w:ascii="Arial" w:hAnsi="Arial" w:cs="Arial"/>
+          <w:sz w:val="22"/>
+          <w:szCs w:val="22"/>
+          <w:lang w:val="en-US"/>
+        </w:rPr>
+        <w:t xml:space="preserve">: {harga}</w:t>
+      </w:r>
+    </w:p>
+    <w:p>
+      <w:pPr>
+        <w:pStyle w:val="ListParagraph"/>
+        <w:numPr>
+          <w:ilvl w:val="0"/>
+          <w:numId w:val="3"/>
+        </w:numPr>
+        <w:spacing w:line="480" w:lineRule="auto"/>
+        <w:ind w:left="1134"/>
+        <w:rPr>
+          <w:rFonts w:ascii="Arial" w:hAnsi="Arial" w:cs="Arial"/>
+          <w:sz w:val="22"/>
+          <w:szCs w:val="22"/>
+        </w:rPr>
+      </w:pPr>
+      <w:r>
+        <w:rPr>
+          <w:rFonts w:ascii="Arial" w:hAnsi="Arial" w:cs="Arial"/>
+          <w:sz w:val="22"/>
+          <w:szCs w:val="22"/>
+        </w:rPr>
+        <w:t>Kode Asset</w:t>
+      </w:r>
+      <w:r>
+        <w:rPr>
+          <w:rFonts w:ascii="Arial" w:hAnsi="Arial" w:cs="Arial"/>
+          <w:sz w:val="22"/>
+          <w:szCs w:val="22"/>
+        </w:rPr>
+        <w:tab/>
+      </w:r>
+      <w:r>
+        <w:rPr>
+          <w:rFonts w:ascii="Arial" w:hAnsi="Arial" w:cs="Arial"/>
+          <w:sz w:val="22"/>
+          <w:szCs w:val="22"/>
+        </w:rPr>
+        <w:tab/>
+      </w:r>
+      <w:r>
+        <w:rPr>
+          <w:rFonts w:ascii="Arial" w:hAnsi="Arial" w:cs="Arial"/>
+          <w:sz w:val="22"/>
+          <w:szCs w:val="22"/>
+        </w:rPr>
+        <w:tab/>
+        <w:t>:</w:t>
+      </w:r>
+      <w:r>
+        <w:rPr>
+          <w:rFonts w:ascii="Arial" w:hAnsi="Arial" w:cs="Arial"/>
+          <w:sz w:val="22"/>
+          <w:szCs w:val="22"/>
+          <w:lang w:val="en-US"/>
+        </w:rPr>
+        <w:t xml:space="preserve">: {kodeAsset}</w:t>
+      </w:r>
+    </w:p>
+    <w:p>
+      <w:pPr>
+        <w:pStyle w:val="ListParagraph"/>
+        <w:numPr>
+          <w:ilvl w:val="0"/>
+          <w:numId w:val="3"/>
+        </w:numPr>
+        <w:spacing w:line="480" w:lineRule="auto"/>
+        <w:ind w:left="1134"/>
+        <w:rPr>
+          <w:rFonts w:ascii="Arial" w:hAnsi="Arial" w:cs="Arial"/>
+          <w:sz w:val="22"/>
+          <w:szCs w:val="22"/>
+        </w:rPr>
+      </w:pPr>
+      <w:proofErr w:type="spellStart"/>
+      <w:r>
+        <w:rPr>
+          <w:rFonts w:ascii="Arial" w:hAnsi="Arial" w:cs="Arial"/>
+          <w:sz w:val="22"/>
+          <w:szCs w:val="22"/>
+        </w:rPr>
+        <w:t>Tahun</w:t>
+      </w:r>
+      <w:proofErr w:type="spellEnd"/>
+      <w:r>
+        <w:rPr>
+          <w:rFonts w:ascii="Arial" w:hAnsi="Arial" w:cs="Arial"/>
+          <w:sz w:val="22"/>
+          <w:szCs w:val="22"/>
+        </w:rPr>
+        <w:t xml:space="preserve">: {tahunOperasi}</w:t>
+      </w:r>
+      <w:proofErr w:type="spellStart"/>
+      <w:r>
+        <w:rPr>
+          <w:rFonts w:ascii="Arial" w:hAnsi="Arial" w:cs="Arial"/>
+          <w:sz w:val="22"/>
+          <w:szCs w:val="22"/>
+        </w:rPr>
+        <w:t>Operasi</w:t>
+      </w:r>
+      <w:proofErr w:type="spellEnd"/>
+      <w:r>
+        <w:rPr>
+          <w:rFonts w:ascii="Arial" w:hAnsi="Arial" w:cs="Arial"/>
+          <w:sz w:val="22"/>
+          <w:szCs w:val="22"/>
+        </w:rPr>
+        <w:tab/>
+      </w:r>
+      <w:r>
+        <w:rPr>
+          <w:rFonts w:ascii="Arial" w:hAnsi="Arial" w:cs="Arial"/>
+          <w:sz w:val="22"/>
+          <w:szCs w:val="22"/>
+        </w:rPr>
+        <w:tab/>
+      </w:r>
+      <w:r>
+        <w:rPr>
+          <w:rFonts w:ascii="Arial" w:hAnsi="Arial" w:cs="Arial"/>
+          <w:sz w:val="22"/>
+          <w:szCs w:val="22"/>
+        </w:rPr>
+        <w:tab/>
+        <w:t>:</w:t>
+      </w:r>
+      <w:r>
+        <w:rPr>
+          <w:rFonts w:ascii="Arial" w:hAnsi="Arial" w:cs="Arial"/>
+          <w:sz w:val="22"/>
+          <w:szCs w:val="22"/>
+          <w:lang w:val="en-US"/>
+        </w:rPr>
+        <w:t xml:space="preserve"> </w:t>
+      </w:r>
+    </w:p>
+    <w:p>
+      <w:pPr>
+        <w:pStyle w:val="ListParagraph"/>
+        <w:numPr>
+          <w:ilvl w:val="0"/>
+          <w:numId w:val="3"/>
+        </w:numPr>
+        <w:spacing w:line="480" w:lineRule="auto"/>
+        <w:ind w:left="1134"/>
+        <w:rPr>
+          <w:rFonts w:ascii="Arial" w:hAnsi="Arial" w:cs="Arial"/>
+          <w:sz w:val="22"/>
+          <w:szCs w:val="22"/>
+        </w:rPr>
+      </w:pPr>
+      <w:proofErr w:type="spellStart"/>
+      <w:r>
+        <w:rPr>
+          <w:rFonts w:ascii="Arial" w:hAnsi="Arial" w:cs="Arial"/>
+          <w:sz w:val="22"/>
+          <w:szCs w:val="22"/>
+        </w:rPr>
+        <w:t>Tahun</w:t>
+      </w:r>
+      <w:proofErr w:type="spellEnd"/>
+      <w:r>
+        <w:rPr>
+          <w:rFonts w:ascii="Arial" w:hAnsi="Arial" w:cs="Arial"/>
+          <w:sz w:val="22"/>
+          <w:szCs w:val="22"/>
+        </w:rPr>
+        <w:t xml:space="preserve">: {tahunBuat}</w:t>
+      </w:r>
+      <w:proofErr w:type="spellStart"/>
+      <w:r>
+        <w:rPr>
+          <w:rFonts w:ascii="Arial" w:hAnsi="Arial" w:cs="Arial"/>
+          <w:sz w:val="22"/>
+          <w:szCs w:val="22"/>
+        </w:rPr>
+        <w:t>Buat</w:t>
+      </w:r>
+      <w:proofErr w:type="spellEnd"/>
+      <w:r>
+        <w:rPr>
+          <w:rFonts w:ascii="Arial" w:hAnsi="Arial" w:cs="Arial"/>
+          <w:sz w:val="22"/>
+          <w:szCs w:val="22"/>
+        </w:rPr>
+        <w:tab/>
+      </w:r>
+      <w:r>
+        <w:rPr>
+          <w:rFonts w:ascii="Arial" w:hAnsi="Arial" w:cs="Arial"/>
+          <w:sz w:val="22"/>
+          <w:szCs w:val="22"/>
+        </w:rPr>
+        <w:tab/>
+      </w:r>
+      <w:r>
+        <w:rPr>
+          <w:rFonts w:ascii="Arial" w:hAnsi="Arial" w:cs="Arial"/>
+          <w:sz w:val="22"/>
+          <w:szCs w:val="22"/>
+        </w:rPr>
+        <w:tab/>
+        <w:t>:</w:t>
+      </w:r>
+      <w:r>
+        <w:rPr>
+          <w:rFonts w:ascii="Arial" w:hAnsi="Arial" w:cs="Arial"/>
+          <w:sz w:val="22"/>
+          <w:szCs w:val="22"/>
+          <w:lang w:val="en-US"/>
+        </w:rPr>
+        <w:t xml:space="preserve"> </w:t>
+      </w:r>
+    </w:p>
+    <w:p>
+      <w:pPr>
+        <w:pStyle w:val="ListParagraph"/>
+        <w:numPr>
+          <w:ilvl w:val="0"/>
+          <w:numId w:val="2"/>
+        </w:numPr>
+        <w:spacing w:line="480" w:lineRule="auto"/>
+        <w:rPr>
+          <w:rFonts w:ascii="Arial" w:hAnsi="Arial" w:cs="Arial"/>
+          <w:sz w:val="22"/>
+          <w:szCs w:val="22"/>
+          <w:lang w:val="sv-SE"/>
+        </w:rPr>
+      </w:pPr>
+      <w:r>
+        <w:rPr>
+          <w:rFonts w:ascii="Arial" w:hAnsi="Arial" w:cs="Arial"/>
+          <w:sz w:val="22"/>
+          <w:szCs w:val="22"/>
+          <w:lang w:val="sv-SE"/>
+        </w:rPr>
+        <w:t>PENEMPATAN PERALATAN</w:t>
+      </w:r>
+      <w:r>
+        <w:rPr>
+          <w:rFonts w:ascii="Arial" w:hAnsi="Arial" w:cs="Arial"/>
+          <w:sz w:val="22"/>
+          <w:szCs w:val="22"/>
+          <w:lang w:val="sv-SE"/>
+        </w:rPr>
+        <w:tab/>
+        <w:t xml:space="preserve">: {penempatanPeralatan}</w:t>
+      </w:r>
+    </w:p>
+    <w:p>
+      <w:pPr>
+        <w:pStyle w:val="ListParagraph"/>
+        <w:numPr>
+          <w:ilvl w:val="0"/>
+          <w:numId w:val="2"/>
+        </w:numPr>
+        <w:spacing w:line="480" w:lineRule="auto"/>
+        <w:rPr>
+          <w:rFonts w:ascii="Arial" w:hAnsi="Arial" w:cs="Arial"/>
+          <w:sz w:val="22"/>
+          <w:szCs w:val="22"/>
+        </w:rPr>
+      </w:pPr>
+      <w:r>
+        <w:rPr>
+          <w:rFonts w:ascii="Arial" w:hAnsi="Arial" w:cs="Arial"/>
+          <w:sz w:val="22"/>
+          <w:szCs w:val="22"/>
+        </w:rPr>
+        <w:t>TANGGAL KEJADIAN</w:t>
+      </w:r>
+      <w:r>
+        <w:rPr>
+          <w:rFonts w:ascii="Arial" w:hAnsi="Arial" w:cs="Arial"/>
+          <w:sz w:val="22"/>
+          <w:szCs w:val="22"/>
+        </w:rPr>
+        <w:tab/>
+      </w:r>
+      <w:r>
+        <w:rPr>
+          <w:rFonts w:ascii="Arial" w:hAnsi="Arial" w:cs="Arial"/>
+          <w:sz w:val="22"/>
+          <w:szCs w:val="22"/>
+        </w:rPr>
+        <w:tab/>
+        <w:t>:</w:t>
+      </w:r>
+      <w:r>
+        <w:rPr>
+          <w:rFonts w:ascii="Arial" w:hAnsi="Arial" w:cs="Arial"/>
+          <w:sz w:val="22"/>
+          <w:szCs w:val="22"/>
+          <w:lang w:val="en-US"/>
+        </w:rPr>
+        <w:t xml:space="preserve">: {tanggalKejadian}</w:t>
+      </w:r>
+    </w:p>
+    <w:p>
+      <w:pPr>
+        <w:pStyle w:val="ListParagraph"/>
+        <w:numPr>
+          <w:ilvl w:val="0"/>
+          <w:numId w:val="2"/>
+        </w:numPr>
+        <w:spacing w:line="480" w:lineRule="auto"/>
+        <w:rPr>
+          <w:rFonts w:ascii="Arial" w:hAnsi="Arial" w:cs="Arial"/>
+          <w:sz w:val="22"/>
+          <w:szCs w:val="22"/>
+        </w:rPr>
+      </w:pPr>
+      <w:r>
+        <w:rPr>
+          <w:rFonts w:ascii="Arial" w:hAnsi="Arial" w:cs="Arial"/>
+          <w:sz w:val="22"/>
+          <w:szCs w:val="22"/>
+        </w:rPr>
+        <w:t>JENIS KERUSAKAN</w:t>
+      </w:r>
+      <w:r>
+        <w:rPr>
+          <w:rFonts w:ascii="Arial" w:hAnsi="Arial" w:cs="Arial"/>
+          <w:sz w:val="22"/>
+          <w:szCs w:val="22"/>
+        </w:rPr>
+        <w:tab/>
+      </w:r>
+      <w:r>
+        <w:rPr>
+          <w:rFonts w:ascii="Arial" w:hAnsi="Arial" w:cs="Arial"/>
+          <w:sz w:val="22"/>
+          <w:szCs w:val="22"/>
+        </w:rPr>
+        <w:tab/>
+      </w:r>
+      <w:r>
+        <w:rPr>
+          <w:rFonts w:ascii="Arial" w:hAnsi="Arial" w:cs="Arial"/>
+          <w:sz w:val="22"/>
+          <w:szCs w:val="22"/>
+        </w:rPr>
+        <w:tab/>
+        <w:t>:</w:t>
+      </w:r>
+      <w:r>
+        <w:rPr>
+          <w:rFonts w:ascii="Arial" w:hAnsi="Arial" w:cs="Arial"/>
+          <w:sz w:val="22"/>
+          <w:szCs w:val="22"/>
+          <w:lang w:val="en-US"/>
+        </w:rPr>
+        <w:t xml:space="preserve">: {jenisKerusakan}</w:t>
+      </w:r>
+    </w:p>
+    <w:p>
+      <w:pPr>
+        <w:pStyle w:val="ListParagraph"/>
+        <w:numPr>
+          <w:ilvl w:val="0"/>
+          <w:numId w:val="2"/>
+        </w:numPr>
+        <w:spacing w:line="480" w:lineRule="auto"/>
+        <w:rPr>
+          <w:rFonts w:ascii="Arial" w:hAnsi="Arial" w:cs="Arial"/>
+          <w:sz w:val="22"/>
+          <w:szCs w:val="22"/>
+          <w:lang w:val="sv-SE"/>
+        </w:rPr>
+      </w:pPr>
+      <w:r>
+        <w:rPr>
+          <w:rFonts w:ascii="Arial" w:hAnsi="Arial" w:cs="Arial"/>
+          <w:sz w:val="22"/>
+          <w:szCs w:val="22"/>
+          <w:lang w:val="sv-SE"/>
+        </w:rPr>
+        <w:t>PENYEBAB KERUSAKAN</w:t>
+      </w:r>
+      <w:r>
+        <w:rPr>
+          <w:rFonts w:ascii="Arial" w:hAnsi="Arial" w:cs="Arial"/>
+          <w:sz w:val="22"/>
+          <w:szCs w:val="22"/>
+          <w:lang w:val="sv-SE"/>
+        </w:rPr>
+        <w:tab/>
+      </w:r>
+      <w:r>
+        <w:rPr>
+          <w:rFonts w:ascii="Arial" w:hAnsi="Arial" w:cs="Arial"/>
+          <w:sz w:val="22"/>
+          <w:szCs w:val="22"/>
+          <w:lang w:val="sv-SE"/>
+        </w:rPr>
+        <w:tab/>
+        <w:t xml:space="preserve">: {penyebabKerusakan}</w:t>
+      </w:r>
+    </w:p>
+    <w:p>
+      <w:pPr>
+        <w:pStyle w:val="ListParagraph"/>
+        <w:numPr>
+          <w:ilvl w:val="0"/>
+          <w:numId w:val="2"/>
+        </w:numPr>
+        <w:spacing w:line="480" w:lineRule="auto"/>
+        <w:rPr>
+          <w:rFonts w:ascii="Arial" w:hAnsi="Arial" w:cs="Arial"/>
+          <w:sz w:val="22"/>
+          <w:szCs w:val="22"/>
+          <w:lang w:val="sv-SE"/>
+        </w:rPr>
+      </w:pPr>
+      <w:r>
+        <w:rPr>
+          <w:rFonts w:ascii="Arial" w:hAnsi="Arial" w:cs="Arial"/>
+          <w:sz w:val="22"/>
+          <w:szCs w:val="22"/>
+          <w:lang w:val="sv-SE"/>
+        </w:rPr>
+        <w:t>AKIBAT KERUSAKAN</w:t>
+      </w:r>
+      <w:r>
+        <w:rPr>
+          <w:rFonts w:ascii="Arial" w:hAnsi="Arial" w:cs="Arial"/>
+          <w:sz w:val="22"/>
+          <w:szCs w:val="22"/>
+          <w:lang w:val="sv-SE"/>
+        </w:rPr>
+        <w:tab/>
+      </w:r>
+      <w:r>
+        <w:rPr>
+          <w:rFonts w:ascii="Arial" w:hAnsi="Arial" w:cs="Arial"/>
+          <w:sz w:val="22"/>
+          <w:szCs w:val="22"/>
+          <w:lang w:val="sv-SE"/>
+        </w:rPr>
+        <w:tab/>
+        <w:t xml:space="preserve">: {akibatKerusakan}</w:t>
+      </w:r>
+    </w:p>
+    <w:p>
+      <w:pPr>
+        <w:pStyle w:val="ListParagraph"/>
+        <w:numPr>
+          <w:ilvl w:val="0"/>
+          <w:numId w:val="2"/>
+        </w:numPr>
+        <w:spacing w:line="480" w:lineRule="auto"/>
+        <w:rPr>
+          <w:rFonts w:ascii="Arial" w:hAnsi="Arial" w:cs="Arial"/>
+          <w:sz w:val="22"/>
+          <w:szCs w:val="22"/>
+          <w:lang w:val="sv-SE"/>
+        </w:rPr>
+      </w:pPr>
+      <w:r>
+        <w:rPr>
+          <w:rFonts w:ascii="Arial" w:hAnsi="Arial" w:cs="Arial"/>
+          <w:sz w:val="22"/>
+          <w:szCs w:val="22"/>
+          <w:lang w:val="sv-SE"/>
+        </w:rPr>
+        <w:t>USUL DAN SARAN</w:t>
+      </w:r>
+      <w:r>
+        <w:rPr>
+          <w:rFonts w:ascii="Arial" w:hAnsi="Arial" w:cs="Arial"/>
+          <w:sz w:val="22"/>
+          <w:szCs w:val="22"/>
+          <w:lang w:val="sv-SE"/>
+        </w:rPr>
+        <w:tab/>
+      </w:r>
+      <w:r>
+        <w:rPr>
+          <w:rFonts w:ascii="Arial" w:hAnsi="Arial" w:cs="Arial"/>
+          <w:sz w:val="22"/>
+          <w:szCs w:val="22"/>
+          <w:lang w:val="sv-SE"/>
+        </w:rPr>
+        <w:tab/>
+      </w:r>
+      <w:r>
+        <w:rPr>
+          <w:rFonts w:ascii="Arial" w:hAnsi="Arial" w:cs="Arial"/>
+          <w:sz w:val="22"/>
+          <w:szCs w:val="22"/>
+          <w:lang w:val="sv-SE"/>
+        </w:rPr>
+        <w:tab/>
+        <w:t xml:space="preserve">: {usulDanSaran}</w:t>
+      </w:r>
+    </w:p>
+    <w:p>
+      <w:pPr>
+        <w:pStyle w:val="ListParagraph"/>
+        <w:numPr>
+          <w:ilvl w:val="0"/>
+          <w:numId w:val="2"/>
+        </w:numPr>
+        <w:spacing w:line="480" w:lineRule="auto"/>
+        <w:rPr>
+          <w:rFonts w:ascii="Arial" w:hAnsi="Arial" w:cs="Arial"/>
+          <w:sz w:val="22"/>
+          <w:szCs w:val="22"/>
+        </w:rPr>
+      </w:pPr>
+      <w:r>
+        <w:rPr>
+          <w:rFonts w:ascii="Arial" w:hAnsi="Arial" w:cs="Arial"/>
+          <w:sz w:val="22"/>
+          <w:szCs w:val="22"/>
+        </w:rPr>
+        <w:t>LAMPIRAN</w:t>
+      </w:r>
+      <w:r>
+        <w:rPr>
+          <w:rFonts w:ascii="Arial" w:hAnsi="Arial" w:cs="Arial"/>
+          <w:sz w:val="22"/>
+          <w:szCs w:val="22"/>
+        </w:rPr>
+        <w:tab/>
+      </w:r>
+      <w:r>
+        <w:rPr>
+          <w:rFonts w:ascii="Arial" w:hAnsi="Arial" w:cs="Arial"/>
+          <w:sz w:val="22"/>
+          <w:szCs w:val="22"/>
+        </w:rPr>
+        <w:tab/>
+      </w:r>
+      <w:r>
+        <w:rPr>
+          <w:rFonts w:ascii="Arial" w:hAnsi="Arial" w:cs="Arial"/>
+          <w:sz w:val="22"/>
+          <w:szCs w:val="22"/>
+        </w:rPr>
+        <w:tab/>
+      </w:r>
+      <w:r>
+        <w:rPr>
+          <w:rFonts w:ascii="Arial" w:hAnsi="Arial" w:cs="Arial"/>
+          <w:sz w:val="22"/>
+          <w:szCs w:val="22"/>
+        </w:rPr>
+        <w:tab/>
+        <w:t xml:space="preserve">: </w:t>
+      </w:r>
+      <w:r>
+        <w:rPr>
+          <w:rFonts w:ascii="Arial" w:hAnsi="Arial" w:cs="Arial"/>
+          <w:sz w:val="22"/>
+          <w:szCs w:val="22"/>
+        </w:rPr>
+        <w:tab/>
+      </w:r>
+      <w:r>
+        <w:rPr>
+          <w:rFonts w:ascii="Arial" w:hAnsi="Arial" w:cs="Arial"/>
+          <w:sz w:val="22"/>
+          <w:szCs w:val="22"/>
+        </w:rPr>
+        <w:tab/>
+      </w:r>
+      <w:r>
+        <w:rPr>
+          <w:rFonts w:ascii="Arial" w:hAnsi="Arial" w:cs="Arial"/>
+          <w:sz w:val="22"/>
+          <w:szCs w:val="22"/>
+        </w:rPr>
+        <w:tab/>
+      </w:r>
+      <w:r>
+        <w:rPr>
+          <w:rFonts w:ascii="Arial" w:hAnsi="Arial" w:cs="Arial"/>
+          <w:sz w:val="22"/>
+          <w:szCs w:val="22"/>
+        </w:rPr>
+        <w:tab/>
+      </w:r>
+      <w:r>
+        <w:rPr>
+          <w:rFonts w:ascii="Arial" w:hAnsi="Arial" w:cs="Arial"/>
+          <w:sz w:val="22"/>
+          <w:szCs w:val="22"/>
+        </w:rPr>
+        <w:tab/>
+      </w:r>
+      <w:r>
+        <w:rPr>
+          <w:rFonts w:ascii="Arial" w:hAnsi="Arial" w:cs="Arial"/>
+          <w:sz w:val="22"/>
+          <w:szCs w:val="22"/>
+        </w:rPr>
+        <w:tab/>
+      </w:r>
+      <w:r>
+        <w:rPr>
+          <w:rFonts w:ascii="Arial" w:hAnsi="Arial" w:cs="Arial"/>
+          <w:sz w:val="22"/>
+          <w:szCs w:val="22"/>
+        </w:rPr>
+        <w:tab/>
+      </w:r>
+      <w:r>
+        <w:rPr>
+          <w:rFonts w:ascii="Arial" w:hAnsi="Arial" w:cs="Arial"/>
+          <w:sz w:val="22"/>
+          <w:szCs w:val="22"/>
+        </w:rPr>
+        <w:tab/>
+        <w:t xml:space="preserve">: {lampiranText}</w:t>
+      </w:r>
+    </w:p>
+    <w:p>
+      <w:pPr>
+        <w:spacing w:line="480" w:lineRule="auto"/>
+        <w:ind w:left="5954" w:firstLineChars="150" w:firstLine="330"/>
+        <w:rPr>
+          <w:rFonts w:ascii="Arial" w:hAnsi="Arial" w:cs="Arial"/>
+          <w:sz w:val="22"/>
+          <w:szCs w:val="22"/>
+          <w:lang w:val="en-US"/>
+        </w:rPr>
+      </w:pPr>
+    </w:p>
+    <w:p>
+      <w:pPr>
+        <w:spacing w:line="480" w:lineRule="auto"/>
+        <w:ind w:left="5954" w:firstLineChars="150" w:firstLine="330"/>
+        <w:rPr>
+          <w:rFonts w:ascii="Arial" w:hAnsi="Arial" w:cs="Arial"/>
+          <w:sz w:val="22"/>
+          <w:szCs w:val="22"/>
+          <w:lang w:val="en-US"/>
+        </w:rPr>
+      </w:pPr>
+      <w:r>
+        <w:rPr>
+          <w:rFonts w:ascii="Arial" w:hAnsi="Arial" w:cs="Arial"/>
+          <w:sz w:val="22"/>
+          <w:szCs w:val="22"/>
+          <w:lang w:val="en-US"/>
+        </w:rPr>
+        <w:t>Bekasi</w:t>
+      </w:r>
+      <w:r>
+        <w:rPr>
+          <w:rFonts w:ascii="Arial" w:hAnsi="Arial" w:cs="Arial"/>
+          <w:sz w:val="22"/>
+          <w:szCs w:val="22"/>
+        </w:rPr>
+        <w:t xml:space="preserve">, </w:t>
+      </w:r>
+      <w:r>
+        <w:rPr>
+          <w:rFonts w:ascii="Arial" w:hAnsi="Arial" w:cs="Arial"/>
+          <w:sz w:val="22"/>
+          <w:szCs w:val="22"/>
+        </w:rPr>
+        <w:t>8</w:t>
+      </w:r>
+      <w:r>
+        <w:rPr>
+          <w:rFonts w:ascii="Arial" w:hAnsi="Arial" w:cs="Arial"/>
+          <w:sz w:val="22"/>
+          <w:szCs w:val="22"/>
+          <w:lang w:val="en-US"/>
+        </w:rPr>
+        <w:t xml:space="preserve"> </w:t>
+      </w:r>
+      <w:r>
+        <w:rPr>
+          <w:rFonts w:ascii="Arial" w:hAnsi="Arial" w:cs="Arial"/>
+          <w:sz w:val="22"/>
+          <w:szCs w:val="22"/>
+          <w:lang w:val="en-US"/>
+        </w:rPr>
+        <w:t>Juli</w:t>
+      </w:r>
+      <w:r>
+        <w:rPr>
+          <w:rFonts w:ascii="Arial" w:hAnsi="Arial" w:cs="Arial"/>
+          <w:sz w:val="22"/>
+          <w:szCs w:val="22"/>
+        </w:rPr>
+        <w:t xml:space="preserve"> 20</w:t>
+      </w:r>
+      <w:r>
+        <w:rPr>
+          <w:rFonts w:ascii="Arial" w:hAnsi="Arial" w:cs="Arial"/>
+          <w:sz w:val="22"/>
+          <w:szCs w:val="22"/>
+          <w:lang w:val="en-US"/>
+        </w:rPr>
+        <w:t xml:space="preserve">: {tanggalLokasi}</w:t>
+      </w:r>
+    </w:p>
+    <w:tbl>
+      <w:tblPr>
+        <w:tblStyle w:val="TableGrid"/>
+        <w:tblW w:w="0" w:type="auto"/>
+        <w:tblBorders>
+          <w:top w:val="none" w:sz="0" w:space="0" w:color="auto"/>
+          <w:left w:val="none" w:sz="0" w:space="0" w:color="auto"/>
+          <w:bottom w:val="none" w:sz="0" w:space="0" w:color="auto"/>
+          <w:right w:val="none" w:sz="0" w:space="0" w:color="auto"/>
+          <w:insideH w:val="none" w:sz="0" w:space="0" w:color="auto"/>
+          <w:insideV w:val="none" w:sz="0" w:space="0" w:color="auto"/>
+        </w:tblBorders>
+        <w:tblLook w:val="04A0" w:firstRow="1" w:lastRow="0" w:firstColumn="1" w:lastColumn="0" w:noHBand="0" w:noVBand="1"/>
+      </w:tblPr>
+      <w:tblGrid>
+        <w:gridCol w:w="3003"/>
+        <w:gridCol w:w="3003"/>
+        <w:gridCol w:w="3004"/>
+      </w:tblGrid>
+      <w:tr>
+        <w:trPr>
+          <w:trHeight w:val="618"/>
+        </w:trPr>
+        <w:tc>
+          <w:tcPr>
+            <w:tcW w:w="3003" w:type="dxa"/>
+            <w:vAlign w:val="center"/>
+          </w:tcPr>
+          <w:p>
+            <w:pPr>
+              <w:widowControl w:val="0"/>
+              <w:autoSpaceDE w:val="0"/>
+              <w:autoSpaceDN w:val="0"/>
+              <w:adjustRightInd w:val="0"/>
+              <w:jc w:val="center"/>
+              <w:rPr>
+                <w:rFonts w:ascii="Arial" w:hAnsi="Arial" w:cs="Arial"/>
+                <w:b/>
+              </w:rPr>
+            </w:pPr>
+            <w:proofErr w:type="spellStart"/>
+            <w:r>
+              <w:rPr>
+                <w:rFonts w:ascii="Arial" w:hAnsi="Arial" w:cs="Arial"/>
+                <w:b/>
+              </w:rPr>
+              <w:t>Mengetahui</w:t>
+            </w:r>
+            <w:proofErr w:type="spellEnd"/>
+            <w:r>
+              <w:rPr>
+                <w:rFonts w:ascii="Arial" w:hAnsi="Arial" w:cs="Arial"/>
+                <w:b/>
+              </w:rPr>
+              <w:t>,</w:t>
+            </w:r>
+          </w:p>
+        </w:tc>
+        <w:tc>
+          <w:tcPr>
+            <w:tcW w:w="3003" w:type="dxa"/>
+          </w:tcPr>
+          <w:p>
+            <w:pPr>
+              <w:widowControl w:val="0"/>
+              <w:autoSpaceDE w:val="0"/>
+              <w:autoSpaceDN w:val="0"/>
+              <w:adjustRightInd w:val="0"/>
+              <w:jc w:val="center"/>
+              <w:rPr>
+                <w:rFonts w:ascii="Arial" w:hAnsi="Arial" w:cs="Arial"/>
+                <w:b/>
+              </w:rPr>
+            </w:pPr>
+          </w:p>
+        </w:tc>
+        <w:tc>
+          <w:tcPr>
+            <w:tcW w:w="3004" w:type="dxa"/>
+          </w:tcPr>
+          <w:p>
+            <w:pPr>
+              <w:widowControl w:val="0"/>
+              <w:autoSpaceDE w:val="0"/>
+              <w:autoSpaceDN w:val="0"/>
+              <w:adjustRightInd w:val="0"/>
+              <w:jc w:val="center"/>
+              <w:rPr>
+                <w:rFonts w:ascii="Arial" w:hAnsi="Arial" w:cs="Arial"/>
+                <w:b/>
+              </w:rPr>
+            </w:pPr>
+          </w:p>
+        </w:tc>
+      </w:tr>
+      <w:tr>
+        <w:tc>
+          <w:tcPr>
+            <w:tcW w:w="3003" w:type="dxa"/>
+          </w:tcPr>
+          <w:p>
+            <w:pPr>
+              <w:widowControl w:val="0"/>
+              <w:autoSpaceDE w:val="0"/>
+              <w:autoSpaceDN w:val="0"/>
+              <w:adjustRightInd w:val="0"/>
+              <w:spacing w:line="288" w:lineRule="auto"/>
+              <w:jc w:val="center"/>
+              <w:rPr>
+                <w:rFonts w:ascii="Arial" w:hAnsi="Arial" w:cs="Arial"/>
+                <w:b/>
+              </w:rPr>
+            </w:pPr>
+          </w:p>
+          <w:p>
+            <w:pPr>
+              <w:widowControl w:val="0"/>
+              <w:autoSpaceDE w:val="0"/>
+              <w:autoSpaceDN w:val="0"/>
+              <w:adjustRightInd w:val="0"/>
+              <w:spacing w:line="288" w:lineRule="auto"/>
+              <w:jc w:val="center"/>
+              <w:rPr>
+                <w:rFonts w:ascii="Arial" w:hAnsi="Arial" w:cs="Arial"/>
+                <w:b/>
+              </w:rPr>
+            </w:pPr>
+          </w:p>
+          <w:p>
+            <w:pPr>
+              <w:widowControl w:val="0"/>
+              <w:autoSpaceDE w:val="0"/>
+              <w:autoSpaceDN w:val="0"/>
+              <w:adjustRightInd w:val="0"/>
+              <w:spacing w:line="288" w:lineRule="auto"/>
+              <w:jc w:val="center"/>
+              <w:rPr>
+                <w:rFonts w:ascii="Arial" w:hAnsi="Arial" w:cs="Arial"/>
+                <w:b/>
+              </w:rPr>
+            </w:pPr>
+          </w:p>
+          <w:p>
+            <w:pPr>
+              <w:widowControl w:val="0"/>
+              <w:autoSpaceDE w:val="0"/>
+              <w:autoSpaceDN w:val="0"/>
+              <w:adjustRightInd w:val="0"/>
+              <w:spacing w:line="288" w:lineRule="auto"/>
+              <w:jc w:val="center"/>
+              <w:rPr>
+                <w:rFonts w:ascii="Arial" w:hAnsi="Arial" w:cs="Arial"/>
+                <w:b/>
+              </w:rPr>
+            </w:pPr>
+          </w:p>
+          <w:p>
+            <w:pPr>
+              <w:widowControl w:val="0"/>
+              <w:autoSpaceDE w:val="0"/>
+              <w:autoSpaceDN w:val="0"/>
+              <w:adjustRightInd w:val="0"/>
+              <w:spacing w:line="288" w:lineRule="auto"/>
+              <w:jc w:val="center"/>
+              <w:rPr>
+                <w:rFonts w:ascii="Arial" w:hAnsi="Arial" w:cs="Arial"/>
+                <w:b/>
+              </w:rPr>
+            </w:pPr>
+          </w:p>
+          <w:p>
+            <w:pPr>
+              <w:widowControl w:val="0"/>
+              <w:autoSpaceDE w:val="0"/>
+              <w:autoSpaceDN w:val="0"/>
+              <w:adjustRightInd w:val="0"/>
+              <w:spacing w:line="288" w:lineRule="auto"/>
+              <w:jc w:val="center"/>
+              <w:rPr>
+                <w:rFonts w:ascii="Arial" w:hAnsi="Arial" w:cs="Arial"/>
+                <w:b/>
+              </w:rPr>
+            </w:pPr>
+          </w:p>
+          <w:p>
+            <w:pPr>
+              <w:widowControl w:val="0"/>
+              <w:autoSpaceDE w:val="0"/>
+              <w:autoSpaceDN w:val="0"/>
+              <w:adjustRightInd w:val="0"/>
+              <w:spacing w:line="288" w:lineRule="auto"/>
+              <w:jc w:val="center"/>
+              <w:rPr>
+                <w:rFonts w:ascii="Arial" w:hAnsi="Arial" w:cs="Arial"/>
+                <w:b/>
+                <w:u w:val="thick"/>
+                <w:lang w:val="en-US"/>
+              </w:rPr>
+            </w:pPr>
+            <w:r>
+              <w:rPr>
+                <w:rFonts w:ascii="Arial" w:hAnsi="Arial" w:cs="Arial"/>
+                <w:b/>
+                <w:u w:val="thick"/>
+                <w:lang w:val="en-US"/>
+              </w:rPr>
+              <w:t>{managerNama}</w:t>
+            </w:r>
+          </w:p>
+          <w:p>
+            <w:pPr>
+              <w:widowControl w:val="0"/>
+              <w:autoSpaceDE w:val="0"/>
+              <w:autoSpaceDN w:val="0"/>
+              <w:adjustRightInd w:val="0"/>
+              <w:spacing w:line="288" w:lineRule="auto"/>
+              <w:jc w:val="center"/>
+              <w:rPr>
+                <w:rFonts w:ascii="Arial" w:hAnsi="Arial" w:cs="Arial"/>
+                <w:b/>
+                <w:lang w:val="en-US"/>
+              </w:rPr>
+            </w:pPr>
+            <w:r>
+              <w:rPr>
+                <w:rFonts w:ascii="Arial" w:hAnsi="Arial" w:cs="Arial"/>
+                <w:b/>
+              </w:rPr>
+              <w:t xml:space="preserve">MANAGER ULTG </w:t>
+            </w:r>
+            <w:r>
+              <w:rPr>
+                <w:rFonts w:ascii="Arial" w:hAnsi="Arial" w:cs="Arial"/>
+                <w:b/>
+                <w:lang w:val="en-US"/>
+              </w:rPr>
+              <w:t>BEKASI</w:t>
+            </w:r>
+          </w:p>
+          <w:p>
+            <w:pPr>
+              <w:widowControl w:val="0"/>
+              <w:autoSpaceDE w:val="0"/>
+              <w:autoSpaceDN w:val="0"/>
+              <w:adjustRightInd w:val="0"/>
+              <w:spacing w:line="288" w:lineRule="auto"/>
+              <w:jc w:val="center"/>
+              <w:rPr>
+                <w:rFonts w:ascii="Arial" w:hAnsi="Arial" w:cs="Arial"/>
+                <w:b/>
+              </w:rPr>
+            </w:pPr>
+          </w:p>
+        </w:tc>
+        <w:tc>
+          <w:tcPr>
+            <w:tcW w:w="3003" w:type="dxa"/>
+          </w:tcPr>
+          <w:p>
+            <w:pPr>
+              <w:widowControl w:val="0"/>
+              <w:autoSpaceDE w:val="0"/>
+              <w:autoSpaceDN w:val="0"/>
+              <w:adjustRightInd w:val="0"/>
+              <w:spacing w:line="288" w:lineRule="auto"/>
+              <w:jc w:val="center"/>
+              <w:rPr>
+                <w:rFonts w:ascii="Arial" w:hAnsi="Arial" w:cs="Arial"/>
+                <w:b/>
+                <w:lang w:val="en-US"/>
+              </w:rPr>
+            </w:pPr>
+          </w:p>
+        </w:tc>
+        <w:tc>
+          <w:tcPr>
+            <w:tcW w:w="3004" w:type="dxa"/>
+          </w:tcPr>
+          <w:p>
+            <w:pPr>
+              <w:widowControl w:val="0"/>
+              <w:autoSpaceDE w:val="0"/>
+              <w:autoSpaceDN w:val="0"/>
+              <w:adjustRightInd w:val="0"/>
+              <w:spacing w:line="288" w:lineRule="auto"/>
+              <w:jc w:val="center"/>
+              <w:rPr>
+                <w:rFonts w:ascii="Arial" w:hAnsi="Arial" w:cs="Arial"/>
+                <w:b/>
+              </w:rPr>
+            </w:pPr>
+          </w:p>
+          <w:p>
+            <w:pPr>
+              <w:widowControl w:val="0"/>
+              <w:autoSpaceDE w:val="0"/>
+              <w:autoSpaceDN w:val="0"/>
+              <w:adjustRightInd w:val="0"/>
+              <w:spacing w:line="288" w:lineRule="auto"/>
+              <w:jc w:val="center"/>
+              <w:rPr>
+                <w:rFonts w:ascii="Arial" w:hAnsi="Arial" w:cs="Arial"/>
+                <w:b/>
+              </w:rPr>
+            </w:pPr>
+            <w:r>
+              <w:rPr>
+                <w:rFonts w:ascii="Arial" w:hAnsi="Arial" w:cs="Arial"/>
+                <w:noProof/>
+                <w:sz w:val="22"/>
+                <w:szCs w:val="22"/>
+                <w:lang w:val="en-US"/>
+              </w:rPr>
+              <w:drawing>
+                <wp:anchor distT="0" distB="0" distL="114300" distR="114300" simplePos="0" relativeHeight="251665408" behindDoc="1" locked="0" layoutInCell="1" allowOverlap="1" wp14:anchorId="73A78779" wp14:editId="7D05230A">
+                  <wp:simplePos x="0" y="0"/>
+                  <wp:positionH relativeFrom="column">
+                    <wp:posOffset>447675</wp:posOffset>
+                  </wp:positionH>
+                  <wp:positionV relativeFrom="paragraph">
+                    <wp:posOffset>64135</wp:posOffset>
+                  </wp:positionV>
+                  <wp:extent cx="871855" cy="866140"/>
+                  <wp:effectExtent l="0" t="0" r="4445" b="0"/>
+                  <wp:wrapNone/>
+                  <wp:docPr id="1" name="Picture 1"/>
+                  <wp:cNvGraphicFramePr>
+                    <a:graphicFrameLocks xmlns:a="http://schemas.openxmlformats.org/drawingml/2006/main" noChangeAspect="1"/>
+                  </wp:cNvGraphicFramePr>
+                  <a:graphic xmlns:a="http://schemas.openxmlformats.org/drawingml/2006/main">
+                    <a:graphicData uri="http://schemas.openxmlformats.org/drawingml/2006/picture">
+                      <pic:pic xmlns:pic="http://schemas.openxmlformats.org/drawingml/2006/picture">
+                        <pic:nvPicPr>
+                          <pic:cNvPr id="1" name="Picture 1"/>
+                          <pic:cNvPicPr>
+                            <a:picLocks noChangeAspect="1" noChangeArrowheads="1"/>
+                          </pic:cNvPicPr>
+                        </pic:nvPicPr>
+                        <pic:blipFill>
+                          <a:blip r:embed="rId9">
+                            <a:extLst>
+                              <a:ext uri="{28A0092B-C50C-407E-A947-70E740481C1C}">
+                                <a14:useLocalDpi xmlns:a14="http://schemas.microsoft.com/office/drawing/2010/main" val="0"/>
+                              </a:ext>
+                            </a:extLst>
+                          </a:blip>
+                          <a:srcRect l="15773" r="23107"/>
+                          <a:stretch>
+                            <a:fillRect/>
+                          </a:stretch>
+                        </pic:blipFill>
+                        <pic:spPr>
+                          <a:xfrm>
+                            <a:off x="0" y="0"/>
+                            <a:ext cx="872142" cy="866140"/>
+                          </a:xfrm>
+                          <a:prstGeom prst="rect">
+                            <a:avLst/>
+                          </a:prstGeom>
+                          <a:noFill/>
+                          <a:ln>
+                            <a:noFill/>
+                          </a:ln>
+                        </pic:spPr>
+                      </pic:pic>
+                    </a:graphicData>
+                  </a:graphic>
+                </wp:anchor>
+              </w:drawing>
+            </w:r>
+          </w:p>
+          <w:p>
+            <w:pPr>
+              <w:widowControl w:val="0"/>
+              <w:autoSpaceDE w:val="0"/>
+              <w:autoSpaceDN w:val="0"/>
+              <w:adjustRightInd w:val="0"/>
+              <w:spacing w:line="288" w:lineRule="auto"/>
+              <w:jc w:val="center"/>
+              <w:rPr>
+                <w:rFonts w:ascii="Arial" w:hAnsi="Arial" w:cs="Arial"/>
+                <w:b/>
+              </w:rPr>
+            </w:pPr>
+          </w:p>
+          <w:p>
+            <w:pPr>
+              <w:widowControl w:val="0"/>
+              <w:autoSpaceDE w:val="0"/>
+              <w:autoSpaceDN w:val="0"/>
+              <w:adjustRightInd w:val="0"/>
+              <w:spacing w:line="288" w:lineRule="auto"/>
+              <w:jc w:val="center"/>
+              <w:rPr>
+                <w:rFonts w:ascii="Arial" w:hAnsi="Arial" w:cs="Arial"/>
+                <w:b/>
+              </w:rPr>
+            </w:pPr>
+          </w:p>
+          <w:p>
+            <w:pPr>
+              <w:widowControl w:val="0"/>
+              <w:autoSpaceDE w:val="0"/>
+              <w:autoSpaceDN w:val="0"/>
+              <w:adjustRightInd w:val="0"/>
+              <w:spacing w:line="288" w:lineRule="auto"/>
+              <w:jc w:val="center"/>
+              <w:rPr>
+                <w:rFonts w:ascii="Arial" w:hAnsi="Arial" w:cs="Arial"/>
+                <w:b/>
+              </w:rPr>
+            </w:pPr>
+          </w:p>
+          <w:p>
+            <w:pPr>
+              <w:widowControl w:val="0"/>
+              <w:autoSpaceDE w:val="0"/>
+              <w:autoSpaceDN w:val="0"/>
+              <w:adjustRightInd w:val="0"/>
+              <w:spacing w:line="288" w:lineRule="auto"/>
+              <w:jc w:val="center"/>
+              <w:rPr>
+                <w:rFonts w:ascii="Arial" w:hAnsi="Arial" w:cs="Arial"/>
+                <w:b/>
+              </w:rPr>
+            </w:pPr>
+          </w:p>
+          <w:p>
+            <w:pPr>
+              <w:widowControl w:val="0"/>
+              <w:autoSpaceDE w:val="0"/>
+              <w:autoSpaceDN w:val="0"/>
+              <w:adjustRightInd w:val="0"/>
+              <w:spacing w:line="288" w:lineRule="auto"/>
+              <w:jc w:val="center"/>
+              <w:rPr>
+                <w:rFonts w:ascii="Arial" w:hAnsi="Arial" w:cs="Arial"/>
+                <w:b/>
+                <w:u w:val="thick"/>
+                <w:lang w:val="sv-SE"/>
+              </w:rPr>
+            </w:pPr>
+            <w:r>
+              <w:rPr>
+                <w:rFonts w:ascii="Arial" w:hAnsi="Arial" w:cs="Arial"/>
+                <w:b/>
+                <w:u w:val="thick"/>
+                <w:lang w:val="sv-SE"/>
+              </w:rPr>
+              <w:t>{tlNama}</w:t>
+            </w:r>
+          </w:p>
+          <w:p>
+            <w:pPr>
+              <w:widowControl w:val="0"/>
+              <w:autoSpaceDE w:val="0"/>
+              <w:autoSpaceDN w:val="0"/>
+              <w:adjustRightInd w:val="0"/>
+              <w:spacing w:line="288" w:lineRule="auto"/>
+              <w:jc w:val="center"/>
+              <w:rPr>
+                <w:rFonts w:ascii="Arial" w:hAnsi="Arial" w:cs="Arial"/>
+                <w:b/>
+                <w:lang w:val="sv-SE"/>
+              </w:rPr>
+            </w:pPr>
+            <w:r>
+              <w:rPr>
+                <w:rFonts w:ascii="Arial" w:hAnsi="Arial" w:cs="Arial"/>
+                <w:b/>
+                <w:lang w:val="sv-SE"/>
+              </w:rPr>
+              <w:t>{tlJabatan}</w:t>
+            </w:r>
+          </w:p>
+        </w:tc>
+      </w:tr>
+    </w:tbl>
+    <w:p>
+      <w:pPr>
+        <w:widowControl w:val="0"/>
+        <w:autoSpaceDE w:val="0"/>
+        <w:autoSpaceDN w:val="0"/>
+        <w:adjustRightInd w:val="0"/>
+        <w:spacing w:line="288" w:lineRule="auto"/>
+        <w:jc w:val="center"/>
+        <w:rPr>
+          <w:rFonts w:ascii="Arial" w:hAnsi="Arial" w:cs="Arial"/>
+          <w:b/>
+          <w:u w:val="thick"/>
+          <w:lang w:val="sv-SE"/>
+        </w:rPr>
+      </w:pPr>
+    </w:p>
+    <w:p>
+      <w:pPr>
+        <w:widowControl w:val="0"/>
+        <w:autoSpaceDE w:val="0"/>
+        <w:autoSpaceDN w:val="0"/>
+        <w:adjustRightInd w:val="0"/>
+        <w:spacing w:line="288" w:lineRule="auto"/>
+        <w:jc w:val="center"/>
+        <w:rPr>
+          <w:rFonts w:ascii="Arial" w:hAnsi="Arial" w:cs="Arial"/>
+          <w:b/>
+          <w:u w:val="thick"/>
+          <w:lang w:val="en-US"/>
+        </w:rPr>
+      </w:pPr>
+      <w:r>
+        <w:rPr>
+          <w:rFonts w:ascii="Arial" w:hAnsi="Arial" w:cs="Arial"/>
+          <w:b/>
+          <w:u w:val="thick"/>
+          <w:lang w:val="en-US"/>
+        </w:rPr>
+        <w:lastRenderedPageBreak/>
+        <w:t>LAMPIRAN</w:t>
+      </w:r>
+    </w:p>
+    <w:p/>
+    <w:p/>
+    <w:sectPr>
+      <w:headerReference w:type="even" r:id="rId10"/>
+      <w:headerReference w:type="default" r:id="rId11"/>
+      <w:footerReference w:type="even" r:id="rId12"/>
+      <w:footerReference w:type="default" r:id="rId13"/>
+      <w:headerReference w:type="first" r:id="rId14"/>
+      <w:footerReference w:type="first" r:id="rId15"/>
+      <w:pgSz w:w="11907" w:h="16839"/>
+      <w:pgMar w:top="964" w:right="851" w:bottom="1021" w:left="1134" w:header="709" w:footer="709" w:gutter="0"/>
+      <w:pgBorders w:offsetFrom="page">
+        <w:top w:val="pushPinNote1" w:sz="10" w:space="24" w:color="000000"/>
+        <w:left w:val="pushPinNote1" w:sz="10" w:space="24" w:color="000000"/>
+        <w:bottom w:val="pushPinNote1" w:sz="10" w:space="24" w:color="000000"/>
+        <w:right w:val="pushPinNote1" w:sz="10" w:space="24" w:color="000000"/>
+      </w:pgBorders>
+      <w:pgNumType w:start="1" w:chapStyle="1"/>
+      <w:cols w:space="720"/>
+      <w:docGrid w:linePitch="360"/>
+    </w:sectPr>
+  </w:body>
+</w:document>
 </file>
 
 <file path=word/endnotes.xml><?xml version="1.0" encoding="utf-8"?>

</xml_diff>

<commit_message>
fix: eliminate all double colons (::), fix split run replacements (Tahun Operasi, Bekasi date duplication)
</commit_message>
<xml_diff>
--- a/public/templates/LKP_TEMPLATE_OFFICIAL.docx
+++ b/public/templates/LKP_TEMPLATE_OFFICIAL.docx
@@ -166,7 +166,7 @@
           <w:szCs w:val="22"/>
           <w:lang w:val="en-US"/>
         </w:rPr>
-        <w:t xml:space="preserve">: {merk}</w:t>
+        <w:t xml:space="preserve"> {merk}</w:t>
       </w:r>
     </w:p>
     <w:p>
@@ -232,7 +232,7 @@
           <w:szCs w:val="22"/>
           <w:lang w:val="en-US"/>
         </w:rPr>
-        <w:t xml:space="preserve">: {type}</w:t>
+        <w:t xml:space="preserve"> {type}</w:t>
       </w:r>
     </w:p>
     <w:p>
@@ -298,7 +298,7 @@
           <w:szCs w:val="22"/>
           <w:lang w:val="en-US"/>
         </w:rPr>
-        <w:t xml:space="preserve">: {noSeri}</w:t>
+        <w:t xml:space="preserve"> {noSeri}</w:t>
       </w:r>
     </w:p>
     <w:p>
@@ -364,7 +364,7 @@
           <w:szCs w:val="22"/>
           <w:lang w:val="en-US"/>
         </w:rPr>
-        <w:t xml:space="preserve">: {harga}</w:t>
+        <w:t xml:space="preserve"> {harga}</w:t>
       </w:r>
     </w:p>
     <w:p>
@@ -422,7 +422,7 @@
           <w:szCs w:val="22"/>
           <w:lang w:val="en-US"/>
         </w:rPr>
-        <w:t xml:space="preserve">: {kodeAsset}</w:t>
+        <w:t xml:space="preserve"> {kodeAsset}</w:t>
       </w:r>
     </w:p>
     <w:p>
@@ -456,7 +456,7 @@
           <w:sz w:val="22"/>
           <w:szCs w:val="22"/>
         </w:rPr>
-        <w:t xml:space="preserve">: {tahunOperasi}</w:t>
+        <w:t xml:space="preserve"> </w:t>
       </w:r>
       <w:proofErr w:type="spellStart"/>
       <w:r>
@@ -500,7 +500,7 @@
           <w:szCs w:val="22"/>
           <w:lang w:val="en-US"/>
         </w:rPr>
-        <w:t xml:space="preserve"> </w:t>
+        <w:t xml:space="preserve"> {tahunOperasi}</w:t>
       </w:r>
     </w:p>
     <w:p>
@@ -534,7 +534,7 @@
           <w:sz w:val="22"/>
           <w:szCs w:val="22"/>
         </w:rPr>
-        <w:t xml:space="preserve">: {tahunBuat}</w:t>
+        <w:t xml:space="preserve"> </w:t>
       </w:r>
       <w:proofErr w:type="spellStart"/>
       <w:r>
@@ -578,7 +578,7 @@
           <w:szCs w:val="22"/>
           <w:lang w:val="en-US"/>
         </w:rPr>
-        <w:t xml:space="preserve"> </w:t>
+        <w:t xml:space="preserve"> {tahunBuat}</w:t>
       </w:r>
     </w:p>
     <w:p>
@@ -662,7 +662,7 @@
           <w:szCs w:val="22"/>
           <w:lang w:val="en-US"/>
         </w:rPr>
-        <w:t xml:space="preserve">: {tanggalKejadian}</w:t>
+        <w:t xml:space="preserve"> {tanggalKejadian}</w:t>
       </w:r>
     </w:p>
     <w:p>
@@ -719,7 +719,7 @@
           <w:szCs w:val="22"/>
           <w:lang w:val="en-US"/>
         </w:rPr>
-        <w:t xml:space="preserve">: {jenisKerusakan}</w:t>
+        <w:t xml:space="preserve"> {jenisKerusakan}</w:t>
       </w:r>
     </w:p>
     <w:p>
@@ -916,72 +916,71 @@
           <w:szCs w:val="22"/>
         </w:rPr>
         <w:tab/>
-        <w:t xml:space="preserve">: </w:t>
-      </w:r>
-      <w:r>
-        <w:rPr>
-          <w:rFonts w:ascii="Arial" w:hAnsi="Arial" w:cs="Arial"/>
-          <w:sz w:val="22"/>
-          <w:szCs w:val="22"/>
-        </w:rPr>
-        <w:tab/>
-      </w:r>
-      <w:r>
-        <w:rPr>
-          <w:rFonts w:ascii="Arial" w:hAnsi="Arial" w:cs="Arial"/>
-          <w:sz w:val="22"/>
-          <w:szCs w:val="22"/>
-        </w:rPr>
-        <w:tab/>
-      </w:r>
-      <w:r>
-        <w:rPr>
-          <w:rFonts w:ascii="Arial" w:hAnsi="Arial" w:cs="Arial"/>
-          <w:sz w:val="22"/>
-          <w:szCs w:val="22"/>
-        </w:rPr>
-        <w:tab/>
-      </w:r>
-      <w:r>
-        <w:rPr>
-          <w:rFonts w:ascii="Arial" w:hAnsi="Arial" w:cs="Arial"/>
-          <w:sz w:val="22"/>
-          <w:szCs w:val="22"/>
-        </w:rPr>
-        <w:tab/>
-      </w:r>
-      <w:r>
-        <w:rPr>
-          <w:rFonts w:ascii="Arial" w:hAnsi="Arial" w:cs="Arial"/>
-          <w:sz w:val="22"/>
-          <w:szCs w:val="22"/>
-        </w:rPr>
-        <w:tab/>
-      </w:r>
-      <w:r>
-        <w:rPr>
-          <w:rFonts w:ascii="Arial" w:hAnsi="Arial" w:cs="Arial"/>
-          <w:sz w:val="22"/>
-          <w:szCs w:val="22"/>
-        </w:rPr>
-        <w:tab/>
-      </w:r>
-      <w:r>
-        <w:rPr>
-          <w:rFonts w:ascii="Arial" w:hAnsi="Arial" w:cs="Arial"/>
-          <w:sz w:val="22"/>
-          <w:szCs w:val="22"/>
-        </w:rPr>
-        <w:tab/>
-      </w:r>
-      <w:r>
-        <w:rPr>
-          <w:rFonts w:ascii="Arial" w:hAnsi="Arial" w:cs="Arial"/>
-          <w:sz w:val="22"/>
-          <w:szCs w:val="22"/>
-        </w:rPr>
-        <w:tab/>
         <w:t xml:space="preserve">: {lampiranText}</w:t>
+      </w:r>
+      <w:r>
+        <w:rPr>
+          <w:rFonts w:ascii="Arial" w:hAnsi="Arial" w:cs="Arial"/>
+          <w:sz w:val="22"/>
+          <w:szCs w:val="22"/>
+        </w:rPr>
+        <w:tab/>
+      </w:r>
+      <w:r>
+        <w:rPr>
+          <w:rFonts w:ascii="Arial" w:hAnsi="Arial" w:cs="Arial"/>
+          <w:sz w:val="22"/>
+          <w:szCs w:val="22"/>
+        </w:rPr>
+        <w:tab/>
+      </w:r>
+      <w:r>
+        <w:rPr>
+          <w:rFonts w:ascii="Arial" w:hAnsi="Arial" w:cs="Arial"/>
+          <w:sz w:val="22"/>
+          <w:szCs w:val="22"/>
+        </w:rPr>
+        <w:tab/>
+      </w:r>
+      <w:r>
+        <w:rPr>
+          <w:rFonts w:ascii="Arial" w:hAnsi="Arial" w:cs="Arial"/>
+          <w:sz w:val="22"/>
+          <w:szCs w:val="22"/>
+        </w:rPr>
+        <w:tab/>
+      </w:r>
+      <w:r>
+        <w:rPr>
+          <w:rFonts w:ascii="Arial" w:hAnsi="Arial" w:cs="Arial"/>
+          <w:sz w:val="22"/>
+          <w:szCs w:val="22"/>
+        </w:rPr>
+        <w:tab/>
+      </w:r>
+      <w:r>
+        <w:rPr>
+          <w:rFonts w:ascii="Arial" w:hAnsi="Arial" w:cs="Arial"/>
+          <w:sz w:val="22"/>
+          <w:szCs w:val="22"/>
+        </w:rPr>
+        <w:tab/>
+      </w:r>
+      <w:r>
+        <w:rPr>
+          <w:rFonts w:ascii="Arial" w:hAnsi="Arial" w:cs="Arial"/>
+          <w:sz w:val="22"/>
+          <w:szCs w:val="22"/>
+        </w:rPr>
+        <w:tab/>
+      </w:r>
+      <w:r>
+        <w:rPr>
+          <w:rFonts w:ascii="Arial" w:hAnsi="Arial" w:cs="Arial"/>
+          <w:sz w:val="22"/>
+          <w:szCs w:val="22"/>
+        </w:rPr>
+        <w:tab/>
       </w:r>
     </w:p>
     <w:p>
@@ -1014,23 +1013,21 @@
           <w:szCs w:val="22"/>
           <w:lang w:val="en-US"/>
         </w:rPr>
-        <w:t>Bekasi</w:t>
-      </w:r>
-      <w:r>
-        <w:rPr>
-          <w:rFonts w:ascii="Arial" w:hAnsi="Arial" w:cs="Arial"/>
-          <w:sz w:val="22"/>
-          <w:szCs w:val="22"/>
-        </w:rPr>
-        <w:t xml:space="preserve">, </w:t>
-      </w:r>
-      <w:r>
-        <w:rPr>
-          <w:rFonts w:ascii="Arial" w:hAnsi="Arial" w:cs="Arial"/>
-          <w:sz w:val="22"/>
-          <w:szCs w:val="22"/>
-        </w:rPr>
-        <w:t>8</w:t>
+        <w:t>{tanggalLokasi}</w:t>
+      </w:r>
+      <w:r>
+        <w:rPr>
+          <w:rFonts w:ascii="Arial" w:hAnsi="Arial" w:cs="Arial"/>
+          <w:sz w:val="22"/>
+          <w:szCs w:val="22"/>
+        </w:rPr>
+      </w:r>
+      <w:r>
+        <w:rPr>
+          <w:rFonts w:ascii="Arial" w:hAnsi="Arial" w:cs="Arial"/>
+          <w:sz w:val="22"/>
+          <w:szCs w:val="22"/>
+        </w:rPr>
       </w:r>
       <w:r>
         <w:rPr>
@@ -1039,7 +1036,6 @@
           <w:szCs w:val="22"/>
           <w:lang w:val="en-US"/>
         </w:rPr>
-        <w:t xml:space="preserve"> </w:t>
       </w:r>
       <w:r>
         <w:rPr>
@@ -1048,15 +1044,13 @@
           <w:szCs w:val="22"/>
           <w:lang w:val="en-US"/>
         </w:rPr>
-        <w:t>Juli</w:t>
-      </w:r>
-      <w:r>
-        <w:rPr>
-          <w:rFonts w:ascii="Arial" w:hAnsi="Arial" w:cs="Arial"/>
-          <w:sz w:val="22"/>
-          <w:szCs w:val="22"/>
-        </w:rPr>
-        <w:t xml:space="preserve"> 20</w:t>
+      </w:r>
+      <w:r>
+        <w:rPr>
+          <w:rFonts w:ascii="Arial" w:hAnsi="Arial" w:cs="Arial"/>
+          <w:sz w:val="22"/>
+          <w:szCs w:val="22"/>
+        </w:rPr>
       </w:r>
       <w:r>
         <w:rPr>
@@ -1065,7 +1059,6 @@
           <w:szCs w:val="22"/>
           <w:lang w:val="en-US"/>
         </w:rPr>
-        <w:t xml:space="preserve">: {tanggalLokasi}</w:t>
       </w:r>
     </w:p>
     <w:tbl>
@@ -1296,7 +1289,7 @@
                 <w:rFonts w:ascii="Arial" w:hAnsi="Arial" w:cs="Arial"/>
                 <w:b/>
               </w:rPr>
-              <w:t xml:space="preserve">MANAGER ULTG </w:t>
+              <w:t xml:space="preserve">{managerJabatan}</w:t>
             </w:r>
             <w:r>
               <w:rPr>
@@ -1304,7 +1297,6 @@
                 <w:b/>
                 <w:lang w:val="en-US"/>
               </w:rPr>
-              <w:t>BEKASI</w:t>
             </w:r>
           </w:p>
           <w:p>

</xml_diff>

<commit_message>
feat: set all font sizes to 10pt and prevent signature block page break split
</commit_message>
<xml_diff>
--- a/public/templates/LKP_TEMPLATE_OFFICIAL.docx
+++ b/public/templates/LKP_TEMPLATE_OFFICIAL.docx
@@ -12,39 +12,39 @@
         <w:spacing w:line="480" w:lineRule="auto"/>
         <w:rPr>
           <w:rFonts w:ascii="Arial" w:hAnsi="Arial" w:cs="Arial"/>
-          <w:sz w:val="22"/>
-          <w:szCs w:val="22"/>
+          <w:sz w:val="20"/>
+          <w:szCs w:val="20"/>
         </w:rPr>
       </w:pPr>
       <w:r>
         <w:rPr>
           <w:rFonts w:ascii="Arial" w:hAnsi="Arial" w:cs="Arial"/>
-          <w:sz w:val="22"/>
-          <w:szCs w:val="22"/>
+          <w:sz w:val="20"/>
+          <w:szCs w:val="20"/>
         </w:rPr>
         <w:t>DATA PERALATAN</w:t>
       </w:r>
       <w:r>
         <w:rPr>
           <w:rFonts w:ascii="Arial" w:hAnsi="Arial" w:cs="Arial"/>
-          <w:sz w:val="22"/>
-          <w:szCs w:val="22"/>
-        </w:rPr>
-        <w:tab/>
-      </w:r>
-      <w:r>
-        <w:rPr>
-          <w:rFonts w:ascii="Arial" w:hAnsi="Arial" w:cs="Arial"/>
-          <w:sz w:val="22"/>
-          <w:szCs w:val="22"/>
-        </w:rPr>
-        <w:tab/>
-      </w:r>
-      <w:r>
-        <w:rPr>
-          <w:rFonts w:ascii="Arial" w:hAnsi="Arial" w:cs="Arial"/>
-          <w:sz w:val="22"/>
-          <w:szCs w:val="22"/>
+          <w:sz w:val="20"/>
+          <w:szCs w:val="20"/>
+        </w:rPr>
+        <w:tab/>
+      </w:r>
+      <w:r>
+        <w:rPr>
+          <w:rFonts w:ascii="Arial" w:hAnsi="Arial" w:cs="Arial"/>
+          <w:sz w:val="20"/>
+          <w:szCs w:val="20"/>
+        </w:rPr>
+        <w:tab/>
+      </w:r>
+      <w:r>
+        <w:rPr>
+          <w:rFonts w:ascii="Arial" w:hAnsi="Arial" w:cs="Arial"/>
+          <w:sz w:val="20"/>
+          <w:szCs w:val="20"/>
         </w:rPr>
         <w:tab/>
       </w:r>
@@ -60,16 +60,16 @@
         <w:ind w:left="1134"/>
         <w:rPr>
           <w:rFonts w:ascii="Arial" w:hAnsi="Arial" w:cs="Arial"/>
-          <w:sz w:val="22"/>
-          <w:szCs w:val="22"/>
+          <w:sz w:val="20"/>
+          <w:szCs w:val="20"/>
           <w:lang w:val="sv-SE"/>
         </w:rPr>
       </w:pPr>
       <w:r>
         <w:rPr>
           <w:rFonts w:ascii="Arial" w:hAnsi="Arial" w:cs="Arial"/>
-          <w:sz w:val="22"/>
-          <w:szCs w:val="22"/>
+          <w:sz w:val="20"/>
+          <w:szCs w:val="20"/>
           <w:lang w:val="sv-SE"/>
         </w:rPr>
         <w:t>Nama Peralatan</w:t>
@@ -77,8 +77,8 @@
       <w:r>
         <w:rPr>
           <w:rFonts w:ascii="Arial" w:hAnsi="Arial" w:cs="Arial"/>
-          <w:sz w:val="22"/>
-          <w:szCs w:val="22"/>
+          <w:sz w:val="20"/>
+          <w:szCs w:val="20"/>
           <w:lang w:val="sv-SE"/>
         </w:rPr>
         <w:tab/>
@@ -86,8 +86,8 @@
       <w:r>
         <w:rPr>
           <w:rFonts w:ascii="Arial" w:hAnsi="Arial" w:cs="Arial"/>
-          <w:sz w:val="22"/>
-          <w:szCs w:val="22"/>
+          <w:sz w:val="20"/>
+          <w:szCs w:val="20"/>
           <w:lang w:val="sv-SE"/>
         </w:rPr>
         <w:tab/>
@@ -95,8 +95,8 @@
       <w:r>
         <w:rPr>
           <w:rFonts w:ascii="Arial" w:hAnsi="Arial" w:cs="Arial"/>
-          <w:sz w:val="22"/>
-          <w:szCs w:val="22"/>
+          <w:sz w:val="20"/>
+          <w:szCs w:val="20"/>
           <w:lang w:val="sv-SE"/>
         </w:rPr>
         <w:tab/>
@@ -114,47 +114,47 @@
         <w:ind w:left="1134"/>
         <w:rPr>
           <w:rFonts w:ascii="Arial" w:hAnsi="Arial" w:cs="Arial"/>
-          <w:sz w:val="22"/>
-          <w:szCs w:val="22"/>
+          <w:sz w:val="20"/>
+          <w:szCs w:val="20"/>
         </w:rPr>
       </w:pPr>
       <w:r>
         <w:rPr>
           <w:rFonts w:ascii="Arial" w:hAnsi="Arial" w:cs="Arial"/>
-          <w:sz w:val="22"/>
-          <w:szCs w:val="22"/>
+          <w:sz w:val="20"/>
+          <w:szCs w:val="20"/>
         </w:rPr>
         <w:t>Merk</w:t>
       </w:r>
       <w:r>
         <w:rPr>
           <w:rFonts w:ascii="Arial" w:hAnsi="Arial" w:cs="Arial"/>
-          <w:sz w:val="22"/>
-          <w:szCs w:val="22"/>
-        </w:rPr>
-        <w:tab/>
-      </w:r>
-      <w:r>
-        <w:rPr>
-          <w:rFonts w:ascii="Arial" w:hAnsi="Arial" w:cs="Arial"/>
-          <w:sz w:val="22"/>
-          <w:szCs w:val="22"/>
-        </w:rPr>
-        <w:tab/>
-      </w:r>
-      <w:r>
-        <w:rPr>
-          <w:rFonts w:ascii="Arial" w:hAnsi="Arial" w:cs="Arial"/>
-          <w:sz w:val="22"/>
-          <w:szCs w:val="22"/>
-        </w:rPr>
-        <w:tab/>
-      </w:r>
-      <w:r>
-        <w:rPr>
-          <w:rFonts w:ascii="Arial" w:hAnsi="Arial" w:cs="Arial"/>
-          <w:sz w:val="22"/>
-          <w:szCs w:val="22"/>
+          <w:sz w:val="20"/>
+          <w:szCs w:val="20"/>
+        </w:rPr>
+        <w:tab/>
+      </w:r>
+      <w:r>
+        <w:rPr>
+          <w:rFonts w:ascii="Arial" w:hAnsi="Arial" w:cs="Arial"/>
+          <w:sz w:val="20"/>
+          <w:szCs w:val="20"/>
+        </w:rPr>
+        <w:tab/>
+      </w:r>
+      <w:r>
+        <w:rPr>
+          <w:rFonts w:ascii="Arial" w:hAnsi="Arial" w:cs="Arial"/>
+          <w:sz w:val="20"/>
+          <w:szCs w:val="20"/>
+        </w:rPr>
+        <w:tab/>
+      </w:r>
+      <w:r>
+        <w:rPr>
+          <w:rFonts w:ascii="Arial" w:hAnsi="Arial" w:cs="Arial"/>
+          <w:sz w:val="20"/>
+          <w:szCs w:val="20"/>
         </w:rPr>
         <w:tab/>
         <w:t>:</w:t>
@@ -162,8 +162,8 @@
       <w:r>
         <w:rPr>
           <w:rFonts w:ascii="Arial" w:hAnsi="Arial" w:cs="Arial"/>
-          <w:sz w:val="22"/>
-          <w:szCs w:val="22"/>
+          <w:sz w:val="20"/>
+          <w:szCs w:val="20"/>
           <w:lang w:val="en-US"/>
         </w:rPr>
         <w:t xml:space="preserve"> {merk}</w:t>
@@ -180,47 +180,47 @@
         <w:ind w:left="1134"/>
         <w:rPr>
           <w:rFonts w:ascii="Arial" w:hAnsi="Arial" w:cs="Arial"/>
-          <w:sz w:val="22"/>
-          <w:szCs w:val="22"/>
+          <w:sz w:val="20"/>
+          <w:szCs w:val="20"/>
         </w:rPr>
       </w:pPr>
       <w:r>
         <w:rPr>
           <w:rFonts w:ascii="Arial" w:hAnsi="Arial" w:cs="Arial"/>
-          <w:sz w:val="22"/>
-          <w:szCs w:val="22"/>
+          <w:sz w:val="20"/>
+          <w:szCs w:val="20"/>
         </w:rPr>
         <w:t xml:space="preserve">Type </w:t>
       </w:r>
       <w:r>
         <w:rPr>
           <w:rFonts w:ascii="Arial" w:hAnsi="Arial" w:cs="Arial"/>
-          <w:sz w:val="22"/>
-          <w:szCs w:val="22"/>
-        </w:rPr>
-        <w:tab/>
-      </w:r>
-      <w:r>
-        <w:rPr>
-          <w:rFonts w:ascii="Arial" w:hAnsi="Arial" w:cs="Arial"/>
-          <w:sz w:val="22"/>
-          <w:szCs w:val="22"/>
-        </w:rPr>
-        <w:tab/>
-      </w:r>
-      <w:r>
-        <w:rPr>
-          <w:rFonts w:ascii="Arial" w:hAnsi="Arial" w:cs="Arial"/>
-          <w:sz w:val="22"/>
-          <w:szCs w:val="22"/>
-        </w:rPr>
-        <w:tab/>
-      </w:r>
-      <w:r>
-        <w:rPr>
-          <w:rFonts w:ascii="Arial" w:hAnsi="Arial" w:cs="Arial"/>
-          <w:sz w:val="22"/>
-          <w:szCs w:val="22"/>
+          <w:sz w:val="20"/>
+          <w:szCs w:val="20"/>
+        </w:rPr>
+        <w:tab/>
+      </w:r>
+      <w:r>
+        <w:rPr>
+          <w:rFonts w:ascii="Arial" w:hAnsi="Arial" w:cs="Arial"/>
+          <w:sz w:val="20"/>
+          <w:szCs w:val="20"/>
+        </w:rPr>
+        <w:tab/>
+      </w:r>
+      <w:r>
+        <w:rPr>
+          <w:rFonts w:ascii="Arial" w:hAnsi="Arial" w:cs="Arial"/>
+          <w:sz w:val="20"/>
+          <w:szCs w:val="20"/>
+        </w:rPr>
+        <w:tab/>
+      </w:r>
+      <w:r>
+        <w:rPr>
+          <w:rFonts w:ascii="Arial" w:hAnsi="Arial" w:cs="Arial"/>
+          <w:sz w:val="20"/>
+          <w:szCs w:val="20"/>
         </w:rPr>
         <w:tab/>
         <w:t>:</w:t>
@@ -228,8 +228,8 @@
       <w:r>
         <w:rPr>
           <w:rFonts w:ascii="Arial" w:hAnsi="Arial" w:cs="Arial"/>
-          <w:sz w:val="22"/>
-          <w:szCs w:val="22"/>
+          <w:sz w:val="20"/>
+          <w:szCs w:val="20"/>
           <w:lang w:val="en-US"/>
         </w:rPr>
         <w:t xml:space="preserve"> {type}</w:t>
@@ -246,47 +246,47 @@
         <w:ind w:left="1134"/>
         <w:rPr>
           <w:rFonts w:ascii="Arial" w:hAnsi="Arial" w:cs="Arial"/>
-          <w:sz w:val="22"/>
-          <w:szCs w:val="22"/>
+          <w:sz w:val="20"/>
+          <w:szCs w:val="20"/>
         </w:rPr>
       </w:pPr>
       <w:r>
         <w:rPr>
           <w:rFonts w:ascii="Arial" w:hAnsi="Arial" w:cs="Arial"/>
-          <w:sz w:val="22"/>
-          <w:szCs w:val="22"/>
+          <w:sz w:val="20"/>
+          <w:szCs w:val="20"/>
         </w:rPr>
         <w:t>No Seri</w:t>
       </w:r>
       <w:r>
         <w:rPr>
           <w:rFonts w:ascii="Arial" w:hAnsi="Arial" w:cs="Arial"/>
-          <w:sz w:val="22"/>
-          <w:szCs w:val="22"/>
-        </w:rPr>
-        <w:tab/>
-      </w:r>
-      <w:r>
-        <w:rPr>
-          <w:rFonts w:ascii="Arial" w:hAnsi="Arial" w:cs="Arial"/>
-          <w:sz w:val="22"/>
-          <w:szCs w:val="22"/>
-        </w:rPr>
-        <w:tab/>
-      </w:r>
-      <w:r>
-        <w:rPr>
-          <w:rFonts w:ascii="Arial" w:hAnsi="Arial" w:cs="Arial"/>
-          <w:sz w:val="22"/>
-          <w:szCs w:val="22"/>
-        </w:rPr>
-        <w:tab/>
-      </w:r>
-      <w:r>
-        <w:rPr>
-          <w:rFonts w:ascii="Arial" w:hAnsi="Arial" w:cs="Arial"/>
-          <w:sz w:val="22"/>
-          <w:szCs w:val="22"/>
+          <w:sz w:val="20"/>
+          <w:szCs w:val="20"/>
+        </w:rPr>
+        <w:tab/>
+      </w:r>
+      <w:r>
+        <w:rPr>
+          <w:rFonts w:ascii="Arial" w:hAnsi="Arial" w:cs="Arial"/>
+          <w:sz w:val="20"/>
+          <w:szCs w:val="20"/>
+        </w:rPr>
+        <w:tab/>
+      </w:r>
+      <w:r>
+        <w:rPr>
+          <w:rFonts w:ascii="Arial" w:hAnsi="Arial" w:cs="Arial"/>
+          <w:sz w:val="20"/>
+          <w:szCs w:val="20"/>
+        </w:rPr>
+        <w:tab/>
+      </w:r>
+      <w:r>
+        <w:rPr>
+          <w:rFonts w:ascii="Arial" w:hAnsi="Arial" w:cs="Arial"/>
+          <w:sz w:val="20"/>
+          <w:szCs w:val="20"/>
         </w:rPr>
         <w:tab/>
         <w:t>:</w:t>
@@ -294,8 +294,8 @@
       <w:r>
         <w:rPr>
           <w:rFonts w:ascii="Arial" w:hAnsi="Arial" w:cs="Arial"/>
-          <w:sz w:val="22"/>
-          <w:szCs w:val="22"/>
+          <w:sz w:val="20"/>
+          <w:szCs w:val="20"/>
           <w:lang w:val="en-US"/>
         </w:rPr>
         <w:t xml:space="preserve"> {noSeri}</w:t>
@@ -312,47 +312,47 @@
         <w:ind w:left="1134"/>
         <w:rPr>
           <w:rFonts w:ascii="Arial" w:hAnsi="Arial" w:cs="Arial"/>
-          <w:sz w:val="22"/>
-          <w:szCs w:val="22"/>
+          <w:sz w:val="20"/>
+          <w:szCs w:val="20"/>
         </w:rPr>
       </w:pPr>
       <w:r>
         <w:rPr>
           <w:rFonts w:ascii="Arial" w:hAnsi="Arial" w:cs="Arial"/>
-          <w:sz w:val="22"/>
-          <w:szCs w:val="22"/>
+          <w:sz w:val="20"/>
+          <w:szCs w:val="20"/>
         </w:rPr>
         <w:t>Harga</w:t>
       </w:r>
       <w:r>
         <w:rPr>
           <w:rFonts w:ascii="Arial" w:hAnsi="Arial" w:cs="Arial"/>
-          <w:sz w:val="22"/>
-          <w:szCs w:val="22"/>
-        </w:rPr>
-        <w:tab/>
-      </w:r>
-      <w:r>
-        <w:rPr>
-          <w:rFonts w:ascii="Arial" w:hAnsi="Arial" w:cs="Arial"/>
-          <w:sz w:val="22"/>
-          <w:szCs w:val="22"/>
-        </w:rPr>
-        <w:tab/>
-      </w:r>
-      <w:r>
-        <w:rPr>
-          <w:rFonts w:ascii="Arial" w:hAnsi="Arial" w:cs="Arial"/>
-          <w:sz w:val="22"/>
-          <w:szCs w:val="22"/>
-        </w:rPr>
-        <w:tab/>
-      </w:r>
-      <w:r>
-        <w:rPr>
-          <w:rFonts w:ascii="Arial" w:hAnsi="Arial" w:cs="Arial"/>
-          <w:sz w:val="22"/>
-          <w:szCs w:val="22"/>
+          <w:sz w:val="20"/>
+          <w:szCs w:val="20"/>
+        </w:rPr>
+        <w:tab/>
+      </w:r>
+      <w:r>
+        <w:rPr>
+          <w:rFonts w:ascii="Arial" w:hAnsi="Arial" w:cs="Arial"/>
+          <w:sz w:val="20"/>
+          <w:szCs w:val="20"/>
+        </w:rPr>
+        <w:tab/>
+      </w:r>
+      <w:r>
+        <w:rPr>
+          <w:rFonts w:ascii="Arial" w:hAnsi="Arial" w:cs="Arial"/>
+          <w:sz w:val="20"/>
+          <w:szCs w:val="20"/>
+        </w:rPr>
+        <w:tab/>
+      </w:r>
+      <w:r>
+        <w:rPr>
+          <w:rFonts w:ascii="Arial" w:hAnsi="Arial" w:cs="Arial"/>
+          <w:sz w:val="20"/>
+          <w:szCs w:val="20"/>
         </w:rPr>
         <w:tab/>
         <w:t>:</w:t>
@@ -360,8 +360,8 @@
       <w:r>
         <w:rPr>
           <w:rFonts w:ascii="Arial" w:hAnsi="Arial" w:cs="Arial"/>
-          <w:sz w:val="22"/>
-          <w:szCs w:val="22"/>
+          <w:sz w:val="20"/>
+          <w:szCs w:val="20"/>
           <w:lang w:val="en-US"/>
         </w:rPr>
         <w:t xml:space="preserve"> {harga}</w:t>
@@ -378,39 +378,39 @@
         <w:ind w:left="1134"/>
         <w:rPr>
           <w:rFonts w:ascii="Arial" w:hAnsi="Arial" w:cs="Arial"/>
-          <w:sz w:val="22"/>
-          <w:szCs w:val="22"/>
+          <w:sz w:val="20"/>
+          <w:szCs w:val="20"/>
         </w:rPr>
       </w:pPr>
       <w:r>
         <w:rPr>
           <w:rFonts w:ascii="Arial" w:hAnsi="Arial" w:cs="Arial"/>
-          <w:sz w:val="22"/>
-          <w:szCs w:val="22"/>
+          <w:sz w:val="20"/>
+          <w:szCs w:val="20"/>
         </w:rPr>
         <w:t>Kode Asset</w:t>
       </w:r>
       <w:r>
         <w:rPr>
           <w:rFonts w:ascii="Arial" w:hAnsi="Arial" w:cs="Arial"/>
-          <w:sz w:val="22"/>
-          <w:szCs w:val="22"/>
-        </w:rPr>
-        <w:tab/>
-      </w:r>
-      <w:r>
-        <w:rPr>
-          <w:rFonts w:ascii="Arial" w:hAnsi="Arial" w:cs="Arial"/>
-          <w:sz w:val="22"/>
-          <w:szCs w:val="22"/>
-        </w:rPr>
-        <w:tab/>
-      </w:r>
-      <w:r>
-        <w:rPr>
-          <w:rFonts w:ascii="Arial" w:hAnsi="Arial" w:cs="Arial"/>
-          <w:sz w:val="22"/>
-          <w:szCs w:val="22"/>
+          <w:sz w:val="20"/>
+          <w:szCs w:val="20"/>
+        </w:rPr>
+        <w:tab/>
+      </w:r>
+      <w:r>
+        <w:rPr>
+          <w:rFonts w:ascii="Arial" w:hAnsi="Arial" w:cs="Arial"/>
+          <w:sz w:val="20"/>
+          <w:szCs w:val="20"/>
+        </w:rPr>
+        <w:tab/>
+      </w:r>
+      <w:r>
+        <w:rPr>
+          <w:rFonts w:ascii="Arial" w:hAnsi="Arial" w:cs="Arial"/>
+          <w:sz w:val="20"/>
+          <w:szCs w:val="20"/>
         </w:rPr>
         <w:tab/>
         <w:t>:</w:t>
@@ -418,8 +418,8 @@
       <w:r>
         <w:rPr>
           <w:rFonts w:ascii="Arial" w:hAnsi="Arial" w:cs="Arial"/>
-          <w:sz w:val="22"/>
-          <w:szCs w:val="22"/>
+          <w:sz w:val="20"/>
+          <w:szCs w:val="20"/>
           <w:lang w:val="en-US"/>
         </w:rPr>
         <w:t xml:space="preserve"> {kodeAsset}</w:t>
@@ -436,16 +436,16 @@
         <w:ind w:left="1134"/>
         <w:rPr>
           <w:rFonts w:ascii="Arial" w:hAnsi="Arial" w:cs="Arial"/>
-          <w:sz w:val="22"/>
-          <w:szCs w:val="22"/>
+          <w:sz w:val="20"/>
+          <w:szCs w:val="20"/>
         </w:rPr>
       </w:pPr>
       <w:proofErr w:type="spellStart"/>
       <w:r>
         <w:rPr>
           <w:rFonts w:ascii="Arial" w:hAnsi="Arial" w:cs="Arial"/>
-          <w:sz w:val="22"/>
-          <w:szCs w:val="22"/>
+          <w:sz w:val="20"/>
+          <w:szCs w:val="20"/>
         </w:rPr>
         <w:t>Tahun</w:t>
       </w:r>
@@ -453,8 +453,8 @@
       <w:r>
         <w:rPr>
           <w:rFonts w:ascii="Arial" w:hAnsi="Arial" w:cs="Arial"/>
-          <w:sz w:val="22"/>
-          <w:szCs w:val="22"/>
+          <w:sz w:val="20"/>
+          <w:szCs w:val="20"/>
         </w:rPr>
         <w:t xml:space="preserve"> </w:t>
       </w:r>
@@ -462,8 +462,8 @@
       <w:r>
         <w:rPr>
           <w:rFonts w:ascii="Arial" w:hAnsi="Arial" w:cs="Arial"/>
-          <w:sz w:val="22"/>
-          <w:szCs w:val="22"/>
+          <w:sz w:val="20"/>
+          <w:szCs w:val="20"/>
         </w:rPr>
         <w:t>Operasi</w:t>
       </w:r>
@@ -471,24 +471,24 @@
       <w:r>
         <w:rPr>
           <w:rFonts w:ascii="Arial" w:hAnsi="Arial" w:cs="Arial"/>
-          <w:sz w:val="22"/>
-          <w:szCs w:val="22"/>
-        </w:rPr>
-        <w:tab/>
-      </w:r>
-      <w:r>
-        <w:rPr>
-          <w:rFonts w:ascii="Arial" w:hAnsi="Arial" w:cs="Arial"/>
-          <w:sz w:val="22"/>
-          <w:szCs w:val="22"/>
-        </w:rPr>
-        <w:tab/>
-      </w:r>
-      <w:r>
-        <w:rPr>
-          <w:rFonts w:ascii="Arial" w:hAnsi="Arial" w:cs="Arial"/>
-          <w:sz w:val="22"/>
-          <w:szCs w:val="22"/>
+          <w:sz w:val="20"/>
+          <w:szCs w:val="20"/>
+        </w:rPr>
+        <w:tab/>
+      </w:r>
+      <w:r>
+        <w:rPr>
+          <w:rFonts w:ascii="Arial" w:hAnsi="Arial" w:cs="Arial"/>
+          <w:sz w:val="20"/>
+          <w:szCs w:val="20"/>
+        </w:rPr>
+        <w:tab/>
+      </w:r>
+      <w:r>
+        <w:rPr>
+          <w:rFonts w:ascii="Arial" w:hAnsi="Arial" w:cs="Arial"/>
+          <w:sz w:val="20"/>
+          <w:szCs w:val="20"/>
         </w:rPr>
         <w:tab/>
         <w:t>:</w:t>
@@ -496,8 +496,8 @@
       <w:r>
         <w:rPr>
           <w:rFonts w:ascii="Arial" w:hAnsi="Arial" w:cs="Arial"/>
-          <w:sz w:val="22"/>
-          <w:szCs w:val="22"/>
+          <w:sz w:val="20"/>
+          <w:szCs w:val="20"/>
           <w:lang w:val="en-US"/>
         </w:rPr>
         <w:t xml:space="preserve"> {tahunOperasi}</w:t>
@@ -514,16 +514,16 @@
         <w:ind w:left="1134"/>
         <w:rPr>
           <w:rFonts w:ascii="Arial" w:hAnsi="Arial" w:cs="Arial"/>
-          <w:sz w:val="22"/>
-          <w:szCs w:val="22"/>
+          <w:sz w:val="20"/>
+          <w:szCs w:val="20"/>
         </w:rPr>
       </w:pPr>
       <w:proofErr w:type="spellStart"/>
       <w:r>
         <w:rPr>
           <w:rFonts w:ascii="Arial" w:hAnsi="Arial" w:cs="Arial"/>
-          <w:sz w:val="22"/>
-          <w:szCs w:val="22"/>
+          <w:sz w:val="20"/>
+          <w:szCs w:val="20"/>
         </w:rPr>
         <w:t>Tahun</w:t>
       </w:r>
@@ -531,8 +531,8 @@
       <w:r>
         <w:rPr>
           <w:rFonts w:ascii="Arial" w:hAnsi="Arial" w:cs="Arial"/>
-          <w:sz w:val="22"/>
-          <w:szCs w:val="22"/>
+          <w:sz w:val="20"/>
+          <w:szCs w:val="20"/>
         </w:rPr>
         <w:t xml:space="preserve"> </w:t>
       </w:r>
@@ -540,8 +540,8 @@
       <w:r>
         <w:rPr>
           <w:rFonts w:ascii="Arial" w:hAnsi="Arial" w:cs="Arial"/>
-          <w:sz w:val="22"/>
-          <w:szCs w:val="22"/>
+          <w:sz w:val="20"/>
+          <w:szCs w:val="20"/>
         </w:rPr>
         <w:t>Buat</w:t>
       </w:r>
@@ -549,24 +549,24 @@
       <w:r>
         <w:rPr>
           <w:rFonts w:ascii="Arial" w:hAnsi="Arial" w:cs="Arial"/>
-          <w:sz w:val="22"/>
-          <w:szCs w:val="22"/>
-        </w:rPr>
-        <w:tab/>
-      </w:r>
-      <w:r>
-        <w:rPr>
-          <w:rFonts w:ascii="Arial" w:hAnsi="Arial" w:cs="Arial"/>
-          <w:sz w:val="22"/>
-          <w:szCs w:val="22"/>
-        </w:rPr>
-        <w:tab/>
-      </w:r>
-      <w:r>
-        <w:rPr>
-          <w:rFonts w:ascii="Arial" w:hAnsi="Arial" w:cs="Arial"/>
-          <w:sz w:val="22"/>
-          <w:szCs w:val="22"/>
+          <w:sz w:val="20"/>
+          <w:szCs w:val="20"/>
+        </w:rPr>
+        <w:tab/>
+      </w:r>
+      <w:r>
+        <w:rPr>
+          <w:rFonts w:ascii="Arial" w:hAnsi="Arial" w:cs="Arial"/>
+          <w:sz w:val="20"/>
+          <w:szCs w:val="20"/>
+        </w:rPr>
+        <w:tab/>
+      </w:r>
+      <w:r>
+        <w:rPr>
+          <w:rFonts w:ascii="Arial" w:hAnsi="Arial" w:cs="Arial"/>
+          <w:sz w:val="20"/>
+          <w:szCs w:val="20"/>
         </w:rPr>
         <w:tab/>
         <w:t>:</w:t>
@@ -574,8 +574,8 @@
       <w:r>
         <w:rPr>
           <w:rFonts w:ascii="Arial" w:hAnsi="Arial" w:cs="Arial"/>
-          <w:sz w:val="22"/>
-          <w:szCs w:val="22"/>
+          <w:sz w:val="20"/>
+          <w:szCs w:val="20"/>
           <w:lang w:val="en-US"/>
         </w:rPr>
         <w:t xml:space="preserve"> {tahunBuat}</w:t>
@@ -591,16 +591,16 @@
         <w:spacing w:line="480" w:lineRule="auto"/>
         <w:rPr>
           <w:rFonts w:ascii="Arial" w:hAnsi="Arial" w:cs="Arial"/>
-          <w:sz w:val="22"/>
-          <w:szCs w:val="22"/>
+          <w:sz w:val="20"/>
+          <w:szCs w:val="20"/>
           <w:lang w:val="sv-SE"/>
         </w:rPr>
       </w:pPr>
       <w:r>
         <w:rPr>
           <w:rFonts w:ascii="Arial" w:hAnsi="Arial" w:cs="Arial"/>
-          <w:sz w:val="22"/>
-          <w:szCs w:val="22"/>
+          <w:sz w:val="20"/>
+          <w:szCs w:val="20"/>
           <w:lang w:val="sv-SE"/>
         </w:rPr>
         <w:t>PENEMPATAN PERALATAN</w:t>
@@ -608,8 +608,8 @@
       <w:r>
         <w:rPr>
           <w:rFonts w:ascii="Arial" w:hAnsi="Arial" w:cs="Arial"/>
-          <w:sz w:val="22"/>
-          <w:szCs w:val="22"/>
+          <w:sz w:val="20"/>
+          <w:szCs w:val="20"/>
           <w:lang w:val="sv-SE"/>
         </w:rPr>
         <w:tab/>
@@ -626,31 +626,31 @@
         <w:spacing w:line="480" w:lineRule="auto"/>
         <w:rPr>
           <w:rFonts w:ascii="Arial" w:hAnsi="Arial" w:cs="Arial"/>
-          <w:sz w:val="22"/>
-          <w:szCs w:val="22"/>
+          <w:sz w:val="20"/>
+          <w:szCs w:val="20"/>
         </w:rPr>
       </w:pPr>
       <w:r>
         <w:rPr>
           <w:rFonts w:ascii="Arial" w:hAnsi="Arial" w:cs="Arial"/>
-          <w:sz w:val="22"/>
-          <w:szCs w:val="22"/>
+          <w:sz w:val="20"/>
+          <w:szCs w:val="20"/>
         </w:rPr>
         <w:t>TANGGAL KEJADIAN</w:t>
       </w:r>
       <w:r>
         <w:rPr>
           <w:rFonts w:ascii="Arial" w:hAnsi="Arial" w:cs="Arial"/>
-          <w:sz w:val="22"/>
-          <w:szCs w:val="22"/>
-        </w:rPr>
-        <w:tab/>
-      </w:r>
-      <w:r>
-        <w:rPr>
-          <w:rFonts w:ascii="Arial" w:hAnsi="Arial" w:cs="Arial"/>
-          <w:sz w:val="22"/>
-          <w:szCs w:val="22"/>
+          <w:sz w:val="20"/>
+          <w:szCs w:val="20"/>
+        </w:rPr>
+        <w:tab/>
+      </w:r>
+      <w:r>
+        <w:rPr>
+          <w:rFonts w:ascii="Arial" w:hAnsi="Arial" w:cs="Arial"/>
+          <w:sz w:val="20"/>
+          <w:szCs w:val="20"/>
         </w:rPr>
         <w:tab/>
         <w:t>:</w:t>
@@ -658,8 +658,8 @@
       <w:r>
         <w:rPr>
           <w:rFonts w:ascii="Arial" w:hAnsi="Arial" w:cs="Arial"/>
-          <w:sz w:val="22"/>
-          <w:szCs w:val="22"/>
+          <w:sz w:val="20"/>
+          <w:szCs w:val="20"/>
           <w:lang w:val="en-US"/>
         </w:rPr>
         <w:t xml:space="preserve"> {tanggalKejadian}</w:t>
@@ -675,39 +675,39 @@
         <w:spacing w:line="480" w:lineRule="auto"/>
         <w:rPr>
           <w:rFonts w:ascii="Arial" w:hAnsi="Arial" w:cs="Arial"/>
-          <w:sz w:val="22"/>
-          <w:szCs w:val="22"/>
+          <w:sz w:val="20"/>
+          <w:szCs w:val="20"/>
         </w:rPr>
       </w:pPr>
       <w:r>
         <w:rPr>
           <w:rFonts w:ascii="Arial" w:hAnsi="Arial" w:cs="Arial"/>
-          <w:sz w:val="22"/>
-          <w:szCs w:val="22"/>
+          <w:sz w:val="20"/>
+          <w:szCs w:val="20"/>
         </w:rPr>
         <w:t>JENIS KERUSAKAN</w:t>
       </w:r>
       <w:r>
         <w:rPr>
           <w:rFonts w:ascii="Arial" w:hAnsi="Arial" w:cs="Arial"/>
-          <w:sz w:val="22"/>
-          <w:szCs w:val="22"/>
-        </w:rPr>
-        <w:tab/>
-      </w:r>
-      <w:r>
-        <w:rPr>
-          <w:rFonts w:ascii="Arial" w:hAnsi="Arial" w:cs="Arial"/>
-          <w:sz w:val="22"/>
-          <w:szCs w:val="22"/>
-        </w:rPr>
-        <w:tab/>
-      </w:r>
-      <w:r>
-        <w:rPr>
-          <w:rFonts w:ascii="Arial" w:hAnsi="Arial" w:cs="Arial"/>
-          <w:sz w:val="22"/>
-          <w:szCs w:val="22"/>
+          <w:sz w:val="20"/>
+          <w:szCs w:val="20"/>
+        </w:rPr>
+        <w:tab/>
+      </w:r>
+      <w:r>
+        <w:rPr>
+          <w:rFonts w:ascii="Arial" w:hAnsi="Arial" w:cs="Arial"/>
+          <w:sz w:val="20"/>
+          <w:szCs w:val="20"/>
+        </w:rPr>
+        <w:tab/>
+      </w:r>
+      <w:r>
+        <w:rPr>
+          <w:rFonts w:ascii="Arial" w:hAnsi="Arial" w:cs="Arial"/>
+          <w:sz w:val="20"/>
+          <w:szCs w:val="20"/>
         </w:rPr>
         <w:tab/>
         <w:t>:</w:t>
@@ -715,8 +715,8 @@
       <w:r>
         <w:rPr>
           <w:rFonts w:ascii="Arial" w:hAnsi="Arial" w:cs="Arial"/>
-          <w:sz w:val="22"/>
-          <w:szCs w:val="22"/>
+          <w:sz w:val="20"/>
+          <w:szCs w:val="20"/>
           <w:lang w:val="en-US"/>
         </w:rPr>
         <w:t xml:space="preserve"> {jenisKerusakan}</w:t>
@@ -732,16 +732,16 @@
         <w:spacing w:line="480" w:lineRule="auto"/>
         <w:rPr>
           <w:rFonts w:ascii="Arial" w:hAnsi="Arial" w:cs="Arial"/>
-          <w:sz w:val="22"/>
-          <w:szCs w:val="22"/>
+          <w:sz w:val="20"/>
+          <w:szCs w:val="20"/>
           <w:lang w:val="sv-SE"/>
         </w:rPr>
       </w:pPr>
       <w:r>
         <w:rPr>
           <w:rFonts w:ascii="Arial" w:hAnsi="Arial" w:cs="Arial"/>
-          <w:sz w:val="22"/>
-          <w:szCs w:val="22"/>
+          <w:sz w:val="20"/>
+          <w:szCs w:val="20"/>
           <w:lang w:val="sv-SE"/>
         </w:rPr>
         <w:t>PENYEBAB KERUSAKAN</w:t>
@@ -749,8 +749,8 @@
       <w:r>
         <w:rPr>
           <w:rFonts w:ascii="Arial" w:hAnsi="Arial" w:cs="Arial"/>
-          <w:sz w:val="22"/>
-          <w:szCs w:val="22"/>
+          <w:sz w:val="20"/>
+          <w:szCs w:val="20"/>
           <w:lang w:val="sv-SE"/>
         </w:rPr>
         <w:tab/>
@@ -758,8 +758,8 @@
       <w:r>
         <w:rPr>
           <w:rFonts w:ascii="Arial" w:hAnsi="Arial" w:cs="Arial"/>
-          <w:sz w:val="22"/>
-          <w:szCs w:val="22"/>
+          <w:sz w:val="20"/>
+          <w:szCs w:val="20"/>
           <w:lang w:val="sv-SE"/>
         </w:rPr>
         <w:tab/>
@@ -776,16 +776,16 @@
         <w:spacing w:line="480" w:lineRule="auto"/>
         <w:rPr>
           <w:rFonts w:ascii="Arial" w:hAnsi="Arial" w:cs="Arial"/>
-          <w:sz w:val="22"/>
-          <w:szCs w:val="22"/>
+          <w:sz w:val="20"/>
+          <w:szCs w:val="20"/>
           <w:lang w:val="sv-SE"/>
         </w:rPr>
       </w:pPr>
       <w:r>
         <w:rPr>
           <w:rFonts w:ascii="Arial" w:hAnsi="Arial" w:cs="Arial"/>
-          <w:sz w:val="22"/>
-          <w:szCs w:val="22"/>
+          <w:sz w:val="20"/>
+          <w:szCs w:val="20"/>
           <w:lang w:val="sv-SE"/>
         </w:rPr>
         <w:t>AKIBAT KERUSAKAN</w:t>
@@ -793,8 +793,8 @@
       <w:r>
         <w:rPr>
           <w:rFonts w:ascii="Arial" w:hAnsi="Arial" w:cs="Arial"/>
-          <w:sz w:val="22"/>
-          <w:szCs w:val="22"/>
+          <w:sz w:val="20"/>
+          <w:szCs w:val="20"/>
           <w:lang w:val="sv-SE"/>
         </w:rPr>
         <w:tab/>
@@ -802,8 +802,8 @@
       <w:r>
         <w:rPr>
           <w:rFonts w:ascii="Arial" w:hAnsi="Arial" w:cs="Arial"/>
-          <w:sz w:val="22"/>
-          <w:szCs w:val="22"/>
+          <w:sz w:val="20"/>
+          <w:szCs w:val="20"/>
           <w:lang w:val="sv-SE"/>
         </w:rPr>
         <w:tab/>
@@ -820,16 +820,16 @@
         <w:spacing w:line="480" w:lineRule="auto"/>
         <w:rPr>
           <w:rFonts w:ascii="Arial" w:hAnsi="Arial" w:cs="Arial"/>
-          <w:sz w:val="22"/>
-          <w:szCs w:val="22"/>
+          <w:sz w:val="20"/>
+          <w:szCs w:val="20"/>
           <w:lang w:val="sv-SE"/>
         </w:rPr>
       </w:pPr>
       <w:r>
         <w:rPr>
           <w:rFonts w:ascii="Arial" w:hAnsi="Arial" w:cs="Arial"/>
-          <w:sz w:val="22"/>
-          <w:szCs w:val="22"/>
+          <w:sz w:val="20"/>
+          <w:szCs w:val="20"/>
           <w:lang w:val="sv-SE"/>
         </w:rPr>
         <w:t>USUL DAN SARAN</w:t>
@@ -837,8 +837,8 @@
       <w:r>
         <w:rPr>
           <w:rFonts w:ascii="Arial" w:hAnsi="Arial" w:cs="Arial"/>
-          <w:sz w:val="22"/>
-          <w:szCs w:val="22"/>
+          <w:sz w:val="20"/>
+          <w:szCs w:val="20"/>
           <w:lang w:val="sv-SE"/>
         </w:rPr>
         <w:tab/>
@@ -846,8 +846,8 @@
       <w:r>
         <w:rPr>
           <w:rFonts w:ascii="Arial" w:hAnsi="Arial" w:cs="Arial"/>
-          <w:sz w:val="22"/>
-          <w:szCs w:val="22"/>
+          <w:sz w:val="20"/>
+          <w:szCs w:val="20"/>
           <w:lang w:val="sv-SE"/>
         </w:rPr>
         <w:tab/>
@@ -855,8 +855,8 @@
       <w:r>
         <w:rPr>
           <w:rFonts w:ascii="Arial" w:hAnsi="Arial" w:cs="Arial"/>
-          <w:sz w:val="22"/>
-          <w:szCs w:val="22"/>
+          <w:sz w:val="20"/>
+          <w:szCs w:val="20"/>
           <w:lang w:val="sv-SE"/>
         </w:rPr>
         <w:tab/>
@@ -873,47 +873,47 @@
         <w:spacing w:line="480" w:lineRule="auto"/>
         <w:rPr>
           <w:rFonts w:ascii="Arial" w:hAnsi="Arial" w:cs="Arial"/>
-          <w:sz w:val="22"/>
-          <w:szCs w:val="22"/>
+          <w:sz w:val="20"/>
+          <w:szCs w:val="20"/>
         </w:rPr>
       </w:pPr>
       <w:r>
         <w:rPr>
           <w:rFonts w:ascii="Arial" w:hAnsi="Arial" w:cs="Arial"/>
-          <w:sz w:val="22"/>
-          <w:szCs w:val="22"/>
+          <w:sz w:val="20"/>
+          <w:szCs w:val="20"/>
         </w:rPr>
         <w:t>LAMPIRAN</w:t>
       </w:r>
       <w:r>
         <w:rPr>
           <w:rFonts w:ascii="Arial" w:hAnsi="Arial" w:cs="Arial"/>
-          <w:sz w:val="22"/>
-          <w:szCs w:val="22"/>
-        </w:rPr>
-        <w:tab/>
-      </w:r>
-      <w:r>
-        <w:rPr>
-          <w:rFonts w:ascii="Arial" w:hAnsi="Arial" w:cs="Arial"/>
-          <w:sz w:val="22"/>
-          <w:szCs w:val="22"/>
-        </w:rPr>
-        <w:tab/>
-      </w:r>
-      <w:r>
-        <w:rPr>
-          <w:rFonts w:ascii="Arial" w:hAnsi="Arial" w:cs="Arial"/>
-          <w:sz w:val="22"/>
-          <w:szCs w:val="22"/>
-        </w:rPr>
-        <w:tab/>
-      </w:r>
-      <w:r>
-        <w:rPr>
-          <w:rFonts w:ascii="Arial" w:hAnsi="Arial" w:cs="Arial"/>
-          <w:sz w:val="22"/>
-          <w:szCs w:val="22"/>
+          <w:sz w:val="20"/>
+          <w:szCs w:val="20"/>
+        </w:rPr>
+        <w:tab/>
+      </w:r>
+      <w:r>
+        <w:rPr>
+          <w:rFonts w:ascii="Arial" w:hAnsi="Arial" w:cs="Arial"/>
+          <w:sz w:val="20"/>
+          <w:szCs w:val="20"/>
+        </w:rPr>
+        <w:tab/>
+      </w:r>
+      <w:r>
+        <w:rPr>
+          <w:rFonts w:ascii="Arial" w:hAnsi="Arial" w:cs="Arial"/>
+          <w:sz w:val="20"/>
+          <w:szCs w:val="20"/>
+        </w:rPr>
+        <w:tab/>
+      </w:r>
+      <w:r>
+        <w:rPr>
+          <w:rFonts w:ascii="Arial" w:hAnsi="Arial" w:cs="Arial"/>
+          <w:sz w:val="20"/>
+          <w:szCs w:val="20"/>
         </w:rPr>
         <w:tab/>
         <w:t xml:space="preserve">: {lampiranText}</w:t>
@@ -921,64 +921,64 @@
       <w:r>
         <w:rPr>
           <w:rFonts w:ascii="Arial" w:hAnsi="Arial" w:cs="Arial"/>
-          <w:sz w:val="22"/>
-          <w:szCs w:val="22"/>
-        </w:rPr>
-        <w:tab/>
-      </w:r>
-      <w:r>
-        <w:rPr>
-          <w:rFonts w:ascii="Arial" w:hAnsi="Arial" w:cs="Arial"/>
-          <w:sz w:val="22"/>
-          <w:szCs w:val="22"/>
-        </w:rPr>
-        <w:tab/>
-      </w:r>
-      <w:r>
-        <w:rPr>
-          <w:rFonts w:ascii="Arial" w:hAnsi="Arial" w:cs="Arial"/>
-          <w:sz w:val="22"/>
-          <w:szCs w:val="22"/>
-        </w:rPr>
-        <w:tab/>
-      </w:r>
-      <w:r>
-        <w:rPr>
-          <w:rFonts w:ascii="Arial" w:hAnsi="Arial" w:cs="Arial"/>
-          <w:sz w:val="22"/>
-          <w:szCs w:val="22"/>
-        </w:rPr>
-        <w:tab/>
-      </w:r>
-      <w:r>
-        <w:rPr>
-          <w:rFonts w:ascii="Arial" w:hAnsi="Arial" w:cs="Arial"/>
-          <w:sz w:val="22"/>
-          <w:szCs w:val="22"/>
-        </w:rPr>
-        <w:tab/>
-      </w:r>
-      <w:r>
-        <w:rPr>
-          <w:rFonts w:ascii="Arial" w:hAnsi="Arial" w:cs="Arial"/>
-          <w:sz w:val="22"/>
-          <w:szCs w:val="22"/>
-        </w:rPr>
-        <w:tab/>
-      </w:r>
-      <w:r>
-        <w:rPr>
-          <w:rFonts w:ascii="Arial" w:hAnsi="Arial" w:cs="Arial"/>
-          <w:sz w:val="22"/>
-          <w:szCs w:val="22"/>
-        </w:rPr>
-        <w:tab/>
-      </w:r>
-      <w:r>
-        <w:rPr>
-          <w:rFonts w:ascii="Arial" w:hAnsi="Arial" w:cs="Arial"/>
-          <w:sz w:val="22"/>
-          <w:szCs w:val="22"/>
+          <w:sz w:val="20"/>
+          <w:szCs w:val="20"/>
+        </w:rPr>
+        <w:tab/>
+      </w:r>
+      <w:r>
+        <w:rPr>
+          <w:rFonts w:ascii="Arial" w:hAnsi="Arial" w:cs="Arial"/>
+          <w:sz w:val="20"/>
+          <w:szCs w:val="20"/>
+        </w:rPr>
+        <w:tab/>
+      </w:r>
+      <w:r>
+        <w:rPr>
+          <w:rFonts w:ascii="Arial" w:hAnsi="Arial" w:cs="Arial"/>
+          <w:sz w:val="20"/>
+          <w:szCs w:val="20"/>
+        </w:rPr>
+        <w:tab/>
+      </w:r>
+      <w:r>
+        <w:rPr>
+          <w:rFonts w:ascii="Arial" w:hAnsi="Arial" w:cs="Arial"/>
+          <w:sz w:val="20"/>
+          <w:szCs w:val="20"/>
+        </w:rPr>
+        <w:tab/>
+      </w:r>
+      <w:r>
+        <w:rPr>
+          <w:rFonts w:ascii="Arial" w:hAnsi="Arial" w:cs="Arial"/>
+          <w:sz w:val="20"/>
+          <w:szCs w:val="20"/>
+        </w:rPr>
+        <w:tab/>
+      </w:r>
+      <w:r>
+        <w:rPr>
+          <w:rFonts w:ascii="Arial" w:hAnsi="Arial" w:cs="Arial"/>
+          <w:sz w:val="20"/>
+          <w:szCs w:val="20"/>
+        </w:rPr>
+        <w:tab/>
+      </w:r>
+      <w:r>
+        <w:rPr>
+          <w:rFonts w:ascii="Arial" w:hAnsi="Arial" w:cs="Arial"/>
+          <w:sz w:val="20"/>
+          <w:szCs w:val="20"/>
+        </w:rPr>
+        <w:tab/>
+      </w:r>
+      <w:r>
+        <w:rPr>
+          <w:rFonts w:ascii="Arial" w:hAnsi="Arial" w:cs="Arial"/>
+          <w:sz w:val="20"/>
+          <w:szCs w:val="20"/>
         </w:rPr>
         <w:tab/>
       </w:r>
@@ -989,8 +989,8 @@
         <w:ind w:left="5954" w:firstLineChars="150" w:firstLine="330"/>
         <w:rPr>
           <w:rFonts w:ascii="Arial" w:hAnsi="Arial" w:cs="Arial"/>
-          <w:sz w:val="22"/>
-          <w:szCs w:val="22"/>
+          <w:sz w:val="20"/>
+          <w:szCs w:val="20"/>
           <w:lang w:val="en-US"/>
         </w:rPr>
       </w:pPr>
@@ -1001,16 +1001,16 @@
         <w:ind w:left="5954" w:firstLineChars="150" w:firstLine="330"/>
         <w:rPr>
           <w:rFonts w:ascii="Arial" w:hAnsi="Arial" w:cs="Arial"/>
-          <w:sz w:val="22"/>
-          <w:szCs w:val="22"/>
+          <w:sz w:val="20"/>
+          <w:szCs w:val="20"/>
           <w:lang w:val="en-US"/>
         </w:rPr>
       </w:pPr>
       <w:r>
         <w:rPr>
           <w:rFonts w:ascii="Arial" w:hAnsi="Arial" w:cs="Arial"/>
-          <w:sz w:val="22"/>
-          <w:szCs w:val="22"/>
+          <w:sz w:val="20"/>
+          <w:szCs w:val="20"/>
           <w:lang w:val="en-US"/>
         </w:rPr>
         <w:t>{tanggalLokasi}</w:t>
@@ -1018,45 +1018,45 @@
       <w:r>
         <w:rPr>
           <w:rFonts w:ascii="Arial" w:hAnsi="Arial" w:cs="Arial"/>
-          <w:sz w:val="22"/>
-          <w:szCs w:val="22"/>
-        </w:rPr>
-      </w:r>
-      <w:r>
-        <w:rPr>
-          <w:rFonts w:ascii="Arial" w:hAnsi="Arial" w:cs="Arial"/>
-          <w:sz w:val="22"/>
-          <w:szCs w:val="22"/>
-        </w:rPr>
-      </w:r>
-      <w:r>
-        <w:rPr>
-          <w:rFonts w:ascii="Arial" w:hAnsi="Arial" w:cs="Arial"/>
-          <w:sz w:val="22"/>
-          <w:szCs w:val="22"/>
+          <w:sz w:val="20"/>
+          <w:szCs w:val="20"/>
+        </w:rPr>
+      </w:r>
+      <w:r>
+        <w:rPr>
+          <w:rFonts w:ascii="Arial" w:hAnsi="Arial" w:cs="Arial"/>
+          <w:sz w:val="20"/>
+          <w:szCs w:val="20"/>
+        </w:rPr>
+      </w:r>
+      <w:r>
+        <w:rPr>
+          <w:rFonts w:ascii="Arial" w:hAnsi="Arial" w:cs="Arial"/>
+          <w:sz w:val="20"/>
+          <w:szCs w:val="20"/>
           <w:lang w:val="en-US"/>
         </w:rPr>
       </w:r>
       <w:r>
         <w:rPr>
           <w:rFonts w:ascii="Arial" w:hAnsi="Arial" w:cs="Arial"/>
-          <w:sz w:val="22"/>
-          <w:szCs w:val="22"/>
+          <w:sz w:val="20"/>
+          <w:szCs w:val="20"/>
           <w:lang w:val="en-US"/>
         </w:rPr>
       </w:r>
       <w:r>
         <w:rPr>
           <w:rFonts w:ascii="Arial" w:hAnsi="Arial" w:cs="Arial"/>
-          <w:sz w:val="22"/>
-          <w:szCs w:val="22"/>
-        </w:rPr>
-      </w:r>
-      <w:r>
-        <w:rPr>
-          <w:rFonts w:ascii="Arial" w:hAnsi="Arial" w:cs="Arial"/>
-          <w:sz w:val="22"/>
-          <w:szCs w:val="22"/>
+          <w:sz w:val="20"/>
+          <w:szCs w:val="20"/>
+        </w:rPr>
+      </w:r>
+      <w:r>
+        <w:rPr>
+          <w:rFonts w:ascii="Arial" w:hAnsi="Arial" w:cs="Arial"/>
+          <w:sz w:val="20"/>
+          <w:szCs w:val="20"/>
           <w:lang w:val="en-US"/>
         </w:rPr>
       </w:r>
@@ -1091,6 +1091,8 @@
           </w:tcPr>
           <w:p>
             <w:pPr>
+              <w:keepNext/>
+              <w:cantSplit/>
               <w:widowControl w:val="0"/>
               <w:autoSpaceDE w:val="0"/>
               <w:autoSpaceDN w:val="0"/>
@@ -1247,6 +1249,8 @@
           </w:p>
           <w:p>
             <w:pPr>
+              <w:keepNext/>
+              <w:cantSplit/>
               <w:widowControl w:val="0"/>
               <w:autoSpaceDE w:val="0"/>
               <w:autoSpaceDN w:val="0"/>
@@ -1272,6 +1276,8 @@
           </w:p>
           <w:p>
             <w:pPr>
+              <w:keepNext/>
+              <w:cantSplit/>
               <w:widowControl w:val="0"/>
               <w:autoSpaceDE w:val="0"/>
               <w:autoSpaceDN w:val="0"/>
@@ -1369,8 +1375,8 @@
               <w:rPr>
                 <w:rFonts w:ascii="Arial" w:hAnsi="Arial" w:cs="Arial"/>
                 <w:noProof/>
-                <w:sz w:val="22"/>
-                <w:szCs w:val="22"/>
+                <w:sz w:val="20"/>
+                <w:szCs w:val="20"/>
                 <w:lang w:val="en-US"/>
               </w:rPr>
               <w:drawing>
@@ -1489,6 +1495,8 @@
           </w:p>
           <w:p>
             <w:pPr>
+              <w:keepNext/>
+              <w:cantSplit/>
               <w:widowControl w:val="0"/>
               <w:autoSpaceDE w:val="0"/>
               <w:autoSpaceDN w:val="0"/>
@@ -1514,6 +1522,8 @@
           </w:p>
           <w:p>
             <w:pPr>
+              <w:keepNext/>
+              <w:cantSplit/>
               <w:widowControl w:val="0"/>
               <w:autoSpaceDE w:val="0"/>
               <w:autoSpaceDN w:val="0"/>

</xml_diff>

<commit_message>
fix: align all colons (:) in Word document output using exact tab stop alignment (4350 dxa)
</commit_message>
<xml_diff>
--- a/public/templates/LKP_TEMPLATE_OFFICIAL.docx
+++ b/public/templates/LKP_TEMPLATE_OFFICIAL.docx
@@ -51,6 +51,9 @@
     </w:p>
     <w:p>
       <w:pPr>
+        <w:tabs>
+          <w:tab w:val="left" w:pos="4350"/>
+        </w:tabs>
         <w:pStyle w:val="ListParagraph"/>
         <w:numPr>
           <w:ilvl w:val="0"/>
@@ -72,25 +75,7 @@
           <w:szCs w:val="20"/>
           <w:lang w:val="sv-SE"/>
         </w:rPr>
-        <w:t>Nama Peralatan</w:t>
-      </w:r>
-      <w:r>
-        <w:rPr>
-          <w:rFonts w:ascii="Arial" w:hAnsi="Arial" w:cs="Arial"/>
-          <w:sz w:val="20"/>
-          <w:szCs w:val="20"/>
-          <w:lang w:val="sv-SE"/>
-        </w:rPr>
-        <w:tab/>
-      </w:r>
-      <w:r>
-        <w:rPr>
-          <w:rFonts w:ascii="Arial" w:hAnsi="Arial" w:cs="Arial"/>
-          <w:sz w:val="20"/>
-          <w:szCs w:val="20"/>
-          <w:lang w:val="sv-SE"/>
-        </w:rPr>
-        <w:tab/>
+        <w:t xml:space="preserve">Nama Peralatan</w:t>
       </w:r>
       <w:r>
         <w:rPr>
@@ -105,6 +90,9 @@
     </w:p>
     <w:p>
       <w:pPr>
+        <w:tabs>
+          <w:tab w:val="left" w:pos="4350"/>
+        </w:tabs>
         <w:pStyle w:val="ListParagraph"/>
         <w:numPr>
           <w:ilvl w:val="0"/>
@@ -124,7 +112,7 @@
           <w:sz w:val="20"/>
           <w:szCs w:val="20"/>
         </w:rPr>
-        <w:t>Merk</w:t>
+        <w:t xml:space="preserve">Merk</w:t>
       </w:r>
       <w:r>
         <w:rPr>
@@ -133,44 +121,14 @@
           <w:szCs w:val="20"/>
         </w:rPr>
         <w:tab/>
-      </w:r>
-      <w:r>
-        <w:rPr>
-          <w:rFonts w:ascii="Arial" w:hAnsi="Arial" w:cs="Arial"/>
-          <w:sz w:val="20"/>
-          <w:szCs w:val="20"/>
-        </w:rPr>
-        <w:tab/>
-      </w:r>
-      <w:r>
-        <w:rPr>
-          <w:rFonts w:ascii="Arial" w:hAnsi="Arial" w:cs="Arial"/>
-          <w:sz w:val="20"/>
-          <w:szCs w:val="20"/>
-        </w:rPr>
-        <w:tab/>
-      </w:r>
-      <w:r>
-        <w:rPr>
-          <w:rFonts w:ascii="Arial" w:hAnsi="Arial" w:cs="Arial"/>
-          <w:sz w:val="20"/>
-          <w:szCs w:val="20"/>
-        </w:rPr>
-        <w:tab/>
-        <w:t>:</w:t>
-      </w:r>
-      <w:r>
-        <w:rPr>
-          <w:rFonts w:ascii="Arial" w:hAnsi="Arial" w:cs="Arial"/>
-          <w:sz w:val="20"/>
-          <w:szCs w:val="20"/>
-          <w:lang w:val="en-US"/>
-        </w:rPr>
-        <w:t xml:space="preserve"> {merk}</w:t>
+        <w:t xml:space="preserve">: {merk}</w:t>
       </w:r>
     </w:p>
     <w:p>
       <w:pPr>
+        <w:tabs>
+          <w:tab w:val="left" w:pos="4350"/>
+        </w:tabs>
         <w:pStyle w:val="ListParagraph"/>
         <w:numPr>
           <w:ilvl w:val="0"/>
@@ -190,7 +148,7 @@
           <w:sz w:val="20"/>
           <w:szCs w:val="20"/>
         </w:rPr>
-        <w:t xml:space="preserve">Type </w:t>
+        <w:t xml:space="preserve">Type</w:t>
       </w:r>
       <w:r>
         <w:rPr>
@@ -199,44 +157,14 @@
           <w:szCs w:val="20"/>
         </w:rPr>
         <w:tab/>
-      </w:r>
-      <w:r>
-        <w:rPr>
-          <w:rFonts w:ascii="Arial" w:hAnsi="Arial" w:cs="Arial"/>
-          <w:sz w:val="20"/>
-          <w:szCs w:val="20"/>
-        </w:rPr>
-        <w:tab/>
-      </w:r>
-      <w:r>
-        <w:rPr>
-          <w:rFonts w:ascii="Arial" w:hAnsi="Arial" w:cs="Arial"/>
-          <w:sz w:val="20"/>
-          <w:szCs w:val="20"/>
-        </w:rPr>
-        <w:tab/>
-      </w:r>
-      <w:r>
-        <w:rPr>
-          <w:rFonts w:ascii="Arial" w:hAnsi="Arial" w:cs="Arial"/>
-          <w:sz w:val="20"/>
-          <w:szCs w:val="20"/>
-        </w:rPr>
-        <w:tab/>
-        <w:t>:</w:t>
-      </w:r>
-      <w:r>
-        <w:rPr>
-          <w:rFonts w:ascii="Arial" w:hAnsi="Arial" w:cs="Arial"/>
-          <w:sz w:val="20"/>
-          <w:szCs w:val="20"/>
-          <w:lang w:val="en-US"/>
-        </w:rPr>
-        <w:t xml:space="preserve"> {type}</w:t>
+        <w:t xml:space="preserve">: {type}</w:t>
       </w:r>
     </w:p>
     <w:p>
       <w:pPr>
+        <w:tabs>
+          <w:tab w:val="left" w:pos="4350"/>
+        </w:tabs>
         <w:pStyle w:val="ListParagraph"/>
         <w:numPr>
           <w:ilvl w:val="0"/>
@@ -256,7 +184,7 @@
           <w:sz w:val="20"/>
           <w:szCs w:val="20"/>
         </w:rPr>
-        <w:t>No Seri</w:t>
+        <w:t xml:space="preserve">No Seri</w:t>
       </w:r>
       <w:r>
         <w:rPr>
@@ -265,44 +193,14 @@
           <w:szCs w:val="20"/>
         </w:rPr>
         <w:tab/>
-      </w:r>
-      <w:r>
-        <w:rPr>
-          <w:rFonts w:ascii="Arial" w:hAnsi="Arial" w:cs="Arial"/>
-          <w:sz w:val="20"/>
-          <w:szCs w:val="20"/>
-        </w:rPr>
-        <w:tab/>
-      </w:r>
-      <w:r>
-        <w:rPr>
-          <w:rFonts w:ascii="Arial" w:hAnsi="Arial" w:cs="Arial"/>
-          <w:sz w:val="20"/>
-          <w:szCs w:val="20"/>
-        </w:rPr>
-        <w:tab/>
-      </w:r>
-      <w:r>
-        <w:rPr>
-          <w:rFonts w:ascii="Arial" w:hAnsi="Arial" w:cs="Arial"/>
-          <w:sz w:val="20"/>
-          <w:szCs w:val="20"/>
-        </w:rPr>
-        <w:tab/>
-        <w:t>:</w:t>
-      </w:r>
-      <w:r>
-        <w:rPr>
-          <w:rFonts w:ascii="Arial" w:hAnsi="Arial" w:cs="Arial"/>
-          <w:sz w:val="20"/>
-          <w:szCs w:val="20"/>
-          <w:lang w:val="en-US"/>
-        </w:rPr>
-        <w:t xml:space="preserve"> {noSeri}</w:t>
+        <w:t xml:space="preserve">: {noSeri}</w:t>
       </w:r>
     </w:p>
     <w:p>
       <w:pPr>
+        <w:tabs>
+          <w:tab w:val="left" w:pos="4350"/>
+        </w:tabs>
         <w:pStyle w:val="ListParagraph"/>
         <w:numPr>
           <w:ilvl w:val="0"/>
@@ -322,7 +220,7 @@
           <w:sz w:val="20"/>
           <w:szCs w:val="20"/>
         </w:rPr>
-        <w:t>Harga</w:t>
+        <w:t xml:space="preserve">Harga</w:t>
       </w:r>
       <w:r>
         <w:rPr>
@@ -331,44 +229,14 @@
           <w:szCs w:val="20"/>
         </w:rPr>
         <w:tab/>
-      </w:r>
-      <w:r>
-        <w:rPr>
-          <w:rFonts w:ascii="Arial" w:hAnsi="Arial" w:cs="Arial"/>
-          <w:sz w:val="20"/>
-          <w:szCs w:val="20"/>
-        </w:rPr>
-        <w:tab/>
-      </w:r>
-      <w:r>
-        <w:rPr>
-          <w:rFonts w:ascii="Arial" w:hAnsi="Arial" w:cs="Arial"/>
-          <w:sz w:val="20"/>
-          <w:szCs w:val="20"/>
-        </w:rPr>
-        <w:tab/>
-      </w:r>
-      <w:r>
-        <w:rPr>
-          <w:rFonts w:ascii="Arial" w:hAnsi="Arial" w:cs="Arial"/>
-          <w:sz w:val="20"/>
-          <w:szCs w:val="20"/>
-        </w:rPr>
-        <w:tab/>
-        <w:t>:</w:t>
-      </w:r>
-      <w:r>
-        <w:rPr>
-          <w:rFonts w:ascii="Arial" w:hAnsi="Arial" w:cs="Arial"/>
-          <w:sz w:val="20"/>
-          <w:szCs w:val="20"/>
-          <w:lang w:val="en-US"/>
-        </w:rPr>
-        <w:t xml:space="preserve"> {harga}</w:t>
+        <w:t xml:space="preserve">: {harga}</w:t>
       </w:r>
     </w:p>
     <w:p>
       <w:pPr>
+        <w:tabs>
+          <w:tab w:val="left" w:pos="4350"/>
+        </w:tabs>
         <w:pStyle w:val="ListParagraph"/>
         <w:numPr>
           <w:ilvl w:val="0"/>
@@ -388,7 +256,7 @@
           <w:sz w:val="20"/>
           <w:szCs w:val="20"/>
         </w:rPr>
-        <w:t>Kode Asset</w:t>
+        <w:t xml:space="preserve">Kode Asset</w:t>
       </w:r>
       <w:r>
         <w:rPr>
@@ -397,36 +265,14 @@
           <w:szCs w:val="20"/>
         </w:rPr>
         <w:tab/>
-      </w:r>
-      <w:r>
-        <w:rPr>
-          <w:rFonts w:ascii="Arial" w:hAnsi="Arial" w:cs="Arial"/>
-          <w:sz w:val="20"/>
-          <w:szCs w:val="20"/>
-        </w:rPr>
-        <w:tab/>
-      </w:r>
-      <w:r>
-        <w:rPr>
-          <w:rFonts w:ascii="Arial" w:hAnsi="Arial" w:cs="Arial"/>
-          <w:sz w:val="20"/>
-          <w:szCs w:val="20"/>
-        </w:rPr>
-        <w:tab/>
-        <w:t>:</w:t>
-      </w:r>
-      <w:r>
-        <w:rPr>
-          <w:rFonts w:ascii="Arial" w:hAnsi="Arial" w:cs="Arial"/>
-          <w:sz w:val="20"/>
-          <w:szCs w:val="20"/>
-          <w:lang w:val="en-US"/>
-        </w:rPr>
-        <w:t xml:space="preserve"> {kodeAsset}</w:t>
+        <w:t xml:space="preserve">: {kodeAsset}</w:t>
       </w:r>
     </w:p>
     <w:p>
       <w:pPr>
+        <w:tabs>
+          <w:tab w:val="left" w:pos="4350"/>
+        </w:tabs>
         <w:pStyle w:val="ListParagraph"/>
         <w:numPr>
           <w:ilvl w:val="0"/>
@@ -440,41 +286,13 @@
           <w:szCs w:val="20"/>
         </w:rPr>
       </w:pPr>
-      <w:proofErr w:type="spellStart"/>
       <w:r>
         <w:rPr>
           <w:rFonts w:ascii="Arial" w:hAnsi="Arial" w:cs="Arial"/>
           <w:sz w:val="20"/>
           <w:szCs w:val="20"/>
         </w:rPr>
-        <w:t>Tahun</w:t>
-      </w:r>
-      <w:proofErr w:type="spellEnd"/>
-      <w:r>
-        <w:rPr>
-          <w:rFonts w:ascii="Arial" w:hAnsi="Arial" w:cs="Arial"/>
-          <w:sz w:val="20"/>
-          <w:szCs w:val="20"/>
-        </w:rPr>
-        <w:t xml:space="preserve"> </w:t>
-      </w:r>
-      <w:proofErr w:type="spellStart"/>
-      <w:r>
-        <w:rPr>
-          <w:rFonts w:ascii="Arial" w:hAnsi="Arial" w:cs="Arial"/>
-          <w:sz w:val="20"/>
-          <w:szCs w:val="20"/>
-        </w:rPr>
-        <w:t>Operasi</w:t>
-      </w:r>
-      <w:proofErr w:type="spellEnd"/>
-      <w:r>
-        <w:rPr>
-          <w:rFonts w:ascii="Arial" w:hAnsi="Arial" w:cs="Arial"/>
-          <w:sz w:val="20"/>
-          <w:szCs w:val="20"/>
-        </w:rPr>
-        <w:tab/>
+        <w:t xml:space="preserve">Tahun Operasi</w:t>
       </w:r>
       <w:r>
         <w:rPr>
@@ -483,28 +301,14 @@
           <w:szCs w:val="20"/>
         </w:rPr>
         <w:tab/>
-      </w:r>
-      <w:r>
-        <w:rPr>
-          <w:rFonts w:ascii="Arial" w:hAnsi="Arial" w:cs="Arial"/>
-          <w:sz w:val="20"/>
-          <w:szCs w:val="20"/>
-        </w:rPr>
-        <w:tab/>
-        <w:t>:</w:t>
-      </w:r>
-      <w:r>
-        <w:rPr>
-          <w:rFonts w:ascii="Arial" w:hAnsi="Arial" w:cs="Arial"/>
-          <w:sz w:val="20"/>
-          <w:szCs w:val="20"/>
-          <w:lang w:val="en-US"/>
-        </w:rPr>
-        <w:t xml:space="preserve"> {tahunOperasi}</w:t>
+        <w:t xml:space="preserve">: {tahunOperasi}</w:t>
       </w:r>
     </w:p>
     <w:p>
       <w:pPr>
+        <w:tabs>
+          <w:tab w:val="left" w:pos="4350"/>
+        </w:tabs>
         <w:pStyle w:val="ListParagraph"/>
         <w:numPr>
           <w:ilvl w:val="0"/>
@@ -518,41 +322,13 @@
           <w:szCs w:val="20"/>
         </w:rPr>
       </w:pPr>
-      <w:proofErr w:type="spellStart"/>
       <w:r>
         <w:rPr>
           <w:rFonts w:ascii="Arial" w:hAnsi="Arial" w:cs="Arial"/>
           <w:sz w:val="20"/>
           <w:szCs w:val="20"/>
         </w:rPr>
-        <w:t>Tahun</w:t>
-      </w:r>
-      <w:proofErr w:type="spellEnd"/>
-      <w:r>
-        <w:rPr>
-          <w:rFonts w:ascii="Arial" w:hAnsi="Arial" w:cs="Arial"/>
-          <w:sz w:val="20"/>
-          <w:szCs w:val="20"/>
-        </w:rPr>
-        <w:t xml:space="preserve"> </w:t>
-      </w:r>
-      <w:proofErr w:type="spellStart"/>
-      <w:r>
-        <w:rPr>
-          <w:rFonts w:ascii="Arial" w:hAnsi="Arial" w:cs="Arial"/>
-          <w:sz w:val="20"/>
-          <w:szCs w:val="20"/>
-        </w:rPr>
-        <w:t>Buat</w:t>
-      </w:r>
-      <w:proofErr w:type="spellEnd"/>
-      <w:r>
-        <w:rPr>
-          <w:rFonts w:ascii="Arial" w:hAnsi="Arial" w:cs="Arial"/>
-          <w:sz w:val="20"/>
-          <w:szCs w:val="20"/>
-        </w:rPr>
-        <w:tab/>
+        <w:t xml:space="preserve">Tahun Buat</w:t>
       </w:r>
       <w:r>
         <w:rPr>
@@ -561,28 +337,14 @@
           <w:szCs w:val="20"/>
         </w:rPr>
         <w:tab/>
-      </w:r>
-      <w:r>
-        <w:rPr>
-          <w:rFonts w:ascii="Arial" w:hAnsi="Arial" w:cs="Arial"/>
-          <w:sz w:val="20"/>
-          <w:szCs w:val="20"/>
-        </w:rPr>
-        <w:tab/>
-        <w:t>:</w:t>
-      </w:r>
-      <w:r>
-        <w:rPr>
-          <w:rFonts w:ascii="Arial" w:hAnsi="Arial" w:cs="Arial"/>
-          <w:sz w:val="20"/>
-          <w:szCs w:val="20"/>
-          <w:lang w:val="en-US"/>
-        </w:rPr>
-        <w:t xml:space="preserve"> {tahunBuat}</w:t>
+        <w:t xml:space="preserve">: {tahunBuat}</w:t>
       </w:r>
     </w:p>
     <w:p>
       <w:pPr>
+        <w:tabs>
+          <w:tab w:val="left" w:pos="4350"/>
+        </w:tabs>
         <w:pStyle w:val="ListParagraph"/>
         <w:numPr>
           <w:ilvl w:val="0"/>
@@ -603,7 +365,7 @@
           <w:szCs w:val="20"/>
           <w:lang w:val="sv-SE"/>
         </w:rPr>
-        <w:t>PENEMPATAN PERALATAN</w:t>
+        <w:t xml:space="preserve">PENEMPATAN PERALATAN</w:t>
       </w:r>
       <w:r>
         <w:rPr>
@@ -618,6 +380,9 @@
     </w:p>
     <w:p>
       <w:pPr>
+        <w:tabs>
+          <w:tab w:val="left" w:pos="4350"/>
+        </w:tabs>
         <w:pStyle w:val="ListParagraph"/>
         <w:numPr>
           <w:ilvl w:val="0"/>
@@ -636,7 +401,7 @@
           <w:sz w:val="20"/>
           <w:szCs w:val="20"/>
         </w:rPr>
-        <w:t>TANGGAL KEJADIAN</w:t>
+        <w:t xml:space="preserve">TANGGAL KEJADIAN</w:t>
       </w:r>
       <w:r>
         <w:rPr>
@@ -645,28 +410,14 @@
           <w:szCs w:val="20"/>
         </w:rPr>
         <w:tab/>
-      </w:r>
-      <w:r>
-        <w:rPr>
-          <w:rFonts w:ascii="Arial" w:hAnsi="Arial" w:cs="Arial"/>
-          <w:sz w:val="20"/>
-          <w:szCs w:val="20"/>
-        </w:rPr>
-        <w:tab/>
-        <w:t>:</w:t>
-      </w:r>
-      <w:r>
-        <w:rPr>
-          <w:rFonts w:ascii="Arial" w:hAnsi="Arial" w:cs="Arial"/>
-          <w:sz w:val="20"/>
-          <w:szCs w:val="20"/>
-          <w:lang w:val="en-US"/>
-        </w:rPr>
-        <w:t xml:space="preserve"> {tanggalKejadian}</w:t>
+        <w:t xml:space="preserve">: {tanggalKejadian}</w:t>
       </w:r>
     </w:p>
     <w:p>
       <w:pPr>
+        <w:tabs>
+          <w:tab w:val="left" w:pos="4350"/>
+        </w:tabs>
         <w:pStyle w:val="ListParagraph"/>
         <w:numPr>
           <w:ilvl w:val="0"/>
@@ -685,7 +436,7 @@
           <w:sz w:val="20"/>
           <w:szCs w:val="20"/>
         </w:rPr>
-        <w:t>JENIS KERUSAKAN</w:t>
+        <w:t xml:space="preserve">JENIS KERUSAKAN</w:t>
       </w:r>
       <w:r>
         <w:rPr>
@@ -694,36 +445,14 @@
           <w:szCs w:val="20"/>
         </w:rPr>
         <w:tab/>
-      </w:r>
-      <w:r>
-        <w:rPr>
-          <w:rFonts w:ascii="Arial" w:hAnsi="Arial" w:cs="Arial"/>
-          <w:sz w:val="20"/>
-          <w:szCs w:val="20"/>
-        </w:rPr>
-        <w:tab/>
-      </w:r>
-      <w:r>
-        <w:rPr>
-          <w:rFonts w:ascii="Arial" w:hAnsi="Arial" w:cs="Arial"/>
-          <w:sz w:val="20"/>
-          <w:szCs w:val="20"/>
-        </w:rPr>
-        <w:tab/>
-        <w:t>:</w:t>
-      </w:r>
-      <w:r>
-        <w:rPr>
-          <w:rFonts w:ascii="Arial" w:hAnsi="Arial" w:cs="Arial"/>
-          <w:sz w:val="20"/>
-          <w:szCs w:val="20"/>
-          <w:lang w:val="en-US"/>
-        </w:rPr>
-        <w:t xml:space="preserve"> {jenisKerusakan}</w:t>
+        <w:t xml:space="preserve">: {jenisKerusakan}</w:t>
       </w:r>
     </w:p>
     <w:p>
       <w:pPr>
+        <w:tabs>
+          <w:tab w:val="left" w:pos="4350"/>
+        </w:tabs>
         <w:pStyle w:val="ListParagraph"/>
         <w:numPr>
           <w:ilvl w:val="0"/>
@@ -744,16 +473,7 @@
           <w:szCs w:val="20"/>
           <w:lang w:val="sv-SE"/>
         </w:rPr>
-        <w:t>PENYEBAB KERUSAKAN</w:t>
-      </w:r>
-      <w:r>
-        <w:rPr>
-          <w:rFonts w:ascii="Arial" w:hAnsi="Arial" w:cs="Arial"/>
-          <w:sz w:val="20"/>
-          <w:szCs w:val="20"/>
-          <w:lang w:val="sv-SE"/>
-        </w:rPr>
-        <w:tab/>
+        <w:t xml:space="preserve">PENYEBAB KERUSAKAN</w:t>
       </w:r>
       <w:r>
         <w:rPr>
@@ -768,6 +488,9 @@
     </w:p>
     <w:p>
       <w:pPr>
+        <w:tabs>
+          <w:tab w:val="left" w:pos="4350"/>
+        </w:tabs>
         <w:pStyle w:val="ListParagraph"/>
         <w:numPr>
           <w:ilvl w:val="0"/>
@@ -788,16 +511,7 @@
           <w:szCs w:val="20"/>
           <w:lang w:val="sv-SE"/>
         </w:rPr>
-        <w:t>AKIBAT KERUSAKAN</w:t>
-      </w:r>
-      <w:r>
-        <w:rPr>
-          <w:rFonts w:ascii="Arial" w:hAnsi="Arial" w:cs="Arial"/>
-          <w:sz w:val="20"/>
-          <w:szCs w:val="20"/>
-          <w:lang w:val="sv-SE"/>
-        </w:rPr>
-        <w:tab/>
+        <w:t xml:space="preserve">AKIBAT KERUSAKAN</w:t>
       </w:r>
       <w:r>
         <w:rPr>
@@ -812,6 +526,9 @@
     </w:p>
     <w:p>
       <w:pPr>
+        <w:tabs>
+          <w:tab w:val="left" w:pos="4350"/>
+        </w:tabs>
         <w:pStyle w:val="ListParagraph"/>
         <w:numPr>
           <w:ilvl w:val="0"/>
@@ -832,25 +549,7 @@
           <w:szCs w:val="20"/>
           <w:lang w:val="sv-SE"/>
         </w:rPr>
-        <w:t>USUL DAN SARAN</w:t>
-      </w:r>
-      <w:r>
-        <w:rPr>
-          <w:rFonts w:ascii="Arial" w:hAnsi="Arial" w:cs="Arial"/>
-          <w:sz w:val="20"/>
-          <w:szCs w:val="20"/>
-          <w:lang w:val="sv-SE"/>
-        </w:rPr>
-        <w:tab/>
-      </w:r>
-      <w:r>
-        <w:rPr>
-          <w:rFonts w:ascii="Arial" w:hAnsi="Arial" w:cs="Arial"/>
-          <w:sz w:val="20"/>
-          <w:szCs w:val="20"/>
-          <w:lang w:val="sv-SE"/>
-        </w:rPr>
-        <w:tab/>
+        <w:t xml:space="preserve">USUL DAN SARAN</w:t>
       </w:r>
       <w:r>
         <w:rPr>
@@ -865,6 +564,9 @@
     </w:p>
     <w:p>
       <w:pPr>
+        <w:tabs>
+          <w:tab w:val="left" w:pos="4350"/>
+        </w:tabs>
         <w:pStyle w:val="ListParagraph"/>
         <w:numPr>
           <w:ilvl w:val="0"/>
@@ -883,7 +585,7 @@
           <w:sz w:val="20"/>
           <w:szCs w:val="20"/>
         </w:rPr>
-        <w:t>LAMPIRAN</w:t>
+        <w:t xml:space="preserve">LAMPIRAN</w:t>
       </w:r>
       <w:r>
         <w:rPr>
@@ -892,95 +594,7 @@
           <w:szCs w:val="20"/>
         </w:rPr>
         <w:tab/>
-      </w:r>
-      <w:r>
-        <w:rPr>
-          <w:rFonts w:ascii="Arial" w:hAnsi="Arial" w:cs="Arial"/>
-          <w:sz w:val="20"/>
-          <w:szCs w:val="20"/>
-        </w:rPr>
-        <w:tab/>
-      </w:r>
-      <w:r>
-        <w:rPr>
-          <w:rFonts w:ascii="Arial" w:hAnsi="Arial" w:cs="Arial"/>
-          <w:sz w:val="20"/>
-          <w:szCs w:val="20"/>
-        </w:rPr>
-        <w:tab/>
-      </w:r>
-      <w:r>
-        <w:rPr>
-          <w:rFonts w:ascii="Arial" w:hAnsi="Arial" w:cs="Arial"/>
-          <w:sz w:val="20"/>
-          <w:szCs w:val="20"/>
-        </w:rPr>
-        <w:tab/>
         <w:t xml:space="preserve">: {lampiranText}</w:t>
-      </w:r>
-      <w:r>
-        <w:rPr>
-          <w:rFonts w:ascii="Arial" w:hAnsi="Arial" w:cs="Arial"/>
-          <w:sz w:val="20"/>
-          <w:szCs w:val="20"/>
-        </w:rPr>
-        <w:tab/>
-      </w:r>
-      <w:r>
-        <w:rPr>
-          <w:rFonts w:ascii="Arial" w:hAnsi="Arial" w:cs="Arial"/>
-          <w:sz w:val="20"/>
-          <w:szCs w:val="20"/>
-        </w:rPr>
-        <w:tab/>
-      </w:r>
-      <w:r>
-        <w:rPr>
-          <w:rFonts w:ascii="Arial" w:hAnsi="Arial" w:cs="Arial"/>
-          <w:sz w:val="20"/>
-          <w:szCs w:val="20"/>
-        </w:rPr>
-        <w:tab/>
-      </w:r>
-      <w:r>
-        <w:rPr>
-          <w:rFonts w:ascii="Arial" w:hAnsi="Arial" w:cs="Arial"/>
-          <w:sz w:val="20"/>
-          <w:szCs w:val="20"/>
-        </w:rPr>
-        <w:tab/>
-      </w:r>
-      <w:r>
-        <w:rPr>
-          <w:rFonts w:ascii="Arial" w:hAnsi="Arial" w:cs="Arial"/>
-          <w:sz w:val="20"/>
-          <w:szCs w:val="20"/>
-        </w:rPr>
-        <w:tab/>
-      </w:r>
-      <w:r>
-        <w:rPr>
-          <w:rFonts w:ascii="Arial" w:hAnsi="Arial" w:cs="Arial"/>
-          <w:sz w:val="20"/>
-          <w:szCs w:val="20"/>
-        </w:rPr>
-        <w:tab/>
-      </w:r>
-      <w:r>
-        <w:rPr>
-          <w:rFonts w:ascii="Arial" w:hAnsi="Arial" w:cs="Arial"/>
-          <w:sz w:val="20"/>
-          <w:szCs w:val="20"/>
-        </w:rPr>
-        <w:tab/>
-      </w:r>
-      <w:r>
-        <w:rPr>
-          <w:rFonts w:ascii="Arial" w:hAnsi="Arial" w:cs="Arial"/>
-          <w:sz w:val="20"/>
-          <w:szCs w:val="20"/>
-        </w:rPr>
-        <w:tab/>
       </w:r>
     </w:p>
     <w:p>
@@ -1013,52 +627,7 @@
           <w:szCs w:val="20"/>
           <w:lang w:val="en-US"/>
         </w:rPr>
-        <w:t>{tanggalLokasi}</w:t>
-      </w:r>
-      <w:r>
-        <w:rPr>
-          <w:rFonts w:ascii="Arial" w:hAnsi="Arial" w:cs="Arial"/>
-          <w:sz w:val="20"/>
-          <w:szCs w:val="20"/>
-        </w:rPr>
-      </w:r>
-      <w:r>
-        <w:rPr>
-          <w:rFonts w:ascii="Arial" w:hAnsi="Arial" w:cs="Arial"/>
-          <w:sz w:val="20"/>
-          <w:szCs w:val="20"/>
-        </w:rPr>
-      </w:r>
-      <w:r>
-        <w:rPr>
-          <w:rFonts w:ascii="Arial" w:hAnsi="Arial" w:cs="Arial"/>
-          <w:sz w:val="20"/>
-          <w:szCs w:val="20"/>
-          <w:lang w:val="en-US"/>
-        </w:rPr>
-      </w:r>
-      <w:r>
-        <w:rPr>
-          <w:rFonts w:ascii="Arial" w:hAnsi="Arial" w:cs="Arial"/>
-          <w:sz w:val="20"/>
-          <w:szCs w:val="20"/>
-          <w:lang w:val="en-US"/>
-        </w:rPr>
-      </w:r>
-      <w:r>
-        <w:rPr>
-          <w:rFonts w:ascii="Arial" w:hAnsi="Arial" w:cs="Arial"/>
-          <w:sz w:val="20"/>
-          <w:szCs w:val="20"/>
-        </w:rPr>
-      </w:r>
-      <w:r>
-        <w:rPr>
-          <w:rFonts w:ascii="Arial" w:hAnsi="Arial" w:cs="Arial"/>
-          <w:sz w:val="20"/>
-          <w:szCs w:val="20"/>
-          <w:lang w:val="en-US"/>
-        </w:rPr>
+        <w:t xml:space="preserve">{tanggalLokasi}</w:t>
       </w:r>
     </w:p>
     <w:tbl>
@@ -1271,7 +840,7 @@
                 <w:u w:val="thick"/>
                 <w:lang w:val="en-US"/>
               </w:rPr>
-              <w:t>{managerNama}</w:t>
+              <w:t xml:space="preserve">{managerNama}</w:t>
             </w:r>
           </w:p>
           <w:p>
@@ -1294,15 +863,9 @@
               <w:rPr>
                 <w:rFonts w:ascii="Arial" w:hAnsi="Arial" w:cs="Arial"/>
                 <w:b/>
+                <w:lang w:val="en-US"/>
               </w:rPr>
               <w:t xml:space="preserve">{managerJabatan}</w:t>
-            </w:r>
-            <w:r>
-              <w:rPr>
-                <w:rFonts w:ascii="Arial" w:hAnsi="Arial" w:cs="Arial"/>
-                <w:b/>
-                <w:lang w:val="en-US"/>
-              </w:rPr>
             </w:r>
           </w:p>
           <w:p>
@@ -1517,7 +1080,7 @@
                 <w:u w:val="thick"/>
                 <w:lang w:val="sv-SE"/>
               </w:rPr>
-              <w:t>{tlNama}</w:t>
+              <w:t xml:space="preserve">{tlNama}</w:t>
             </w:r>
           </w:p>
           <w:p>
@@ -1542,7 +1105,7 @@
                 <w:b/>
                 <w:lang w:val="sv-SE"/>
               </w:rPr>
-              <w:t>{tlJabatan}</w:t>
+              <w:t xml:space="preserve">{tlJabatan}</w:t>
             </w:r>
           </w:p>
         </w:tc>

</xml_diff>

<commit_message>
feat: add explicit page break before LAMPIRAN section (standalone final page)
</commit_message>
<xml_diff>
--- a/public/templates/LKP_TEMPLATE_OFFICIAL.docx
+++ b/public/templates/LKP_TEMPLATE_OFFICIAL.docx
@@ -2,6 +2,11 @@
 <file path=word/document.xml><?xml version="1.0" encoding="utf-8"?>
 <w:document xmlns:wpc="http://schemas.microsoft.com/office/word/2010/wordprocessingCanvas" xmlns:cx="http://schemas.microsoft.com/office/drawing/2014/chartex" xmlns:cx1="http://schemas.microsoft.com/office/drawing/2015/9/8/chartex" xmlns:cx2="http://schemas.microsoft.com/office/drawing/2015/10/21/chartex" xmlns:cx3="http://schemas.microsoft.com/office/drawing/2016/5/9/chartex" xmlns:cx4="http://schemas.microsoft.com/office/drawing/2016/5/10/chartex" xmlns:cx5="http://schemas.microsoft.com/office/drawing/2016/5/11/chartex" xmlns:cx6="http://schemas.microsoft.com/office/drawing/2016/5/12/chartex" xmlns:cx7="http://schemas.microsoft.com/office/drawing/2016/5/13/chartex" xmlns:cx8="http://schemas.microsoft.com/office/drawing/2016/5/14/chartex" xmlns:mc="http://schemas.openxmlformats.org/markup-compatibility/2006" xmlns:aink="http://schemas.microsoft.com/office/drawing/2016/ink" xmlns:am3d="http://schemas.microsoft.com/office/drawing/2017/model3d" xmlns:o="urn:schemas-microsoft-com:office:office" xmlns:oel="http://schemas.microsoft.com/office/2019/extlst" xmlns:r="http://schemas.openxmlformats.org/officeDocument/2006/relationships" xmlns:m="http://schemas.openxmlformats.org/officeDocument/2006/math" xmlns:v="urn:schemas-microsoft-com:vml" xmlns:wp14="http://schemas.microsoft.com/office/word/2010/wordprocessingDrawing" xmlns:wp="http://schemas.openxmlformats.org/drawingml/2006/wordprocessingDrawing" xmlns:w10="urn:schemas-microsoft-com:office:word" xmlns:w="http://schemas.openxmlformats.org/wordprocessingml/2006/main" xmlns:w14="http://schemas.microsoft.com/office/word/2010/wordml" xmlns:w15="http://schemas.microsoft.com/office/word/2012/wordml" xmlns:w16cex="http://schemas.microsoft.com/office/word/2018/wordml/cex" xmlns:w16cid="http://schemas.microsoft.com/office/word/2016/wordml/cid" xmlns:w16="http://schemas.microsoft.com/office/word/2018/wordml" xmlns:w16du="http://schemas.microsoft.com/office/word/2023/wordml/word16du" xmlns:w16sdtdh="http://schemas.microsoft.com/office/word/2020/wordml/sdtdatahash" xmlns:w16sdtfl="http://schemas.microsoft.com/office/word/2024/wordml/sdtformatlock" xmlns:w16se="http://schemas.microsoft.com/office/word/2015/wordml/symex" xmlns:wpg="http://schemas.microsoft.com/office/word/2010/wordprocessingGroup" xmlns:wpi="http://schemas.microsoft.com/office/word/2010/wordprocessingInk" xmlns:wne="http://schemas.microsoft.com/office/word/2006/wordml" xmlns:wps="http://schemas.microsoft.com/office/word/2010/wordprocessingShape" mc:Ignorable="w14 w15 w16se w16cid w16 w16cex w16sdtdh w16sdtfl w16du wp14">
   <w:body>
+    <w:p>
+      <w:r>
+        <w:br w:type="page"/>
+      </w:r>
+    </w:p>
     <w:p>
       <w:pPr>
         <w:pStyle w:val="ListParagraph"/>

</xml_diff>

<commit_message>
fix: remove conflicting keepNext rules in docx template to prevent blank page 1 and text merging
</commit_message>
<xml_diff>
--- a/public/templates/LKP_TEMPLATE_OFFICIAL.docx
+++ b/public/templates/LKP_TEMPLATE_OFFICIAL.docx
@@ -2,11 +2,6 @@
 <file path=word/document.xml><?xml version="1.0" encoding="utf-8"?>
 <w:document xmlns:wpc="http://schemas.microsoft.com/office/word/2010/wordprocessingCanvas" xmlns:cx="http://schemas.microsoft.com/office/drawing/2014/chartex" xmlns:cx1="http://schemas.microsoft.com/office/drawing/2015/9/8/chartex" xmlns:cx2="http://schemas.microsoft.com/office/drawing/2015/10/21/chartex" xmlns:cx3="http://schemas.microsoft.com/office/drawing/2016/5/9/chartex" xmlns:cx4="http://schemas.microsoft.com/office/drawing/2016/5/10/chartex" xmlns:cx5="http://schemas.microsoft.com/office/drawing/2016/5/11/chartex" xmlns:cx6="http://schemas.microsoft.com/office/drawing/2016/5/12/chartex" xmlns:cx7="http://schemas.microsoft.com/office/drawing/2016/5/13/chartex" xmlns:cx8="http://schemas.microsoft.com/office/drawing/2016/5/14/chartex" xmlns:mc="http://schemas.openxmlformats.org/markup-compatibility/2006" xmlns:aink="http://schemas.microsoft.com/office/drawing/2016/ink" xmlns:am3d="http://schemas.microsoft.com/office/drawing/2017/model3d" xmlns:o="urn:schemas-microsoft-com:office:office" xmlns:oel="http://schemas.microsoft.com/office/2019/extlst" xmlns:r="http://schemas.openxmlformats.org/officeDocument/2006/relationships" xmlns:m="http://schemas.openxmlformats.org/officeDocument/2006/math" xmlns:v="urn:schemas-microsoft-com:vml" xmlns:wp14="http://schemas.microsoft.com/office/word/2010/wordprocessingDrawing" xmlns:wp="http://schemas.openxmlformats.org/drawingml/2006/wordprocessingDrawing" xmlns:w10="urn:schemas-microsoft-com:office:word" xmlns:w="http://schemas.openxmlformats.org/wordprocessingml/2006/main" xmlns:w14="http://schemas.microsoft.com/office/word/2010/wordml" xmlns:w15="http://schemas.microsoft.com/office/word/2012/wordml" xmlns:w16cex="http://schemas.microsoft.com/office/word/2018/wordml/cex" xmlns:w16cid="http://schemas.microsoft.com/office/word/2016/wordml/cid" xmlns:w16="http://schemas.microsoft.com/office/word/2018/wordml" xmlns:w16du="http://schemas.microsoft.com/office/word/2023/wordml/word16du" xmlns:w16sdtdh="http://schemas.microsoft.com/office/word/2020/wordml/sdtdatahash" xmlns:w16sdtfl="http://schemas.microsoft.com/office/word/2024/wordml/sdtformatlock" xmlns:w16se="http://schemas.microsoft.com/office/word/2015/wordml/symex" xmlns:wpg="http://schemas.microsoft.com/office/word/2010/wordprocessingGroup" xmlns:wpi="http://schemas.microsoft.com/office/word/2010/wordprocessingInk" xmlns:wne="http://schemas.microsoft.com/office/word/2006/wordml" xmlns:wps="http://schemas.microsoft.com/office/word/2010/wordprocessingShape" mc:Ignorable="w14 w15 w16se w16cid w16 w16cex w16sdtdh w16sdtfl w16du wp14">
   <w:body>
-    <w:p>
-      <w:r>
-        <w:br w:type="page"/>
-      </w:r>
-    </w:p>
     <w:p>
       <w:pPr>
         <w:pStyle w:val="ListParagraph"/>
@@ -665,8 +660,6 @@
           </w:tcPr>
           <w:p>
             <w:pPr>
-              <w:keepNext/>
-              <w:cantSplit/>
               <w:widowControl w:val="0"/>
               <w:autoSpaceDE w:val="0"/>
               <w:autoSpaceDN w:val="0"/>
@@ -823,8 +816,6 @@
           </w:p>
           <w:p>
             <w:pPr>
-              <w:keepNext/>
-              <w:cantSplit/>
               <w:widowControl w:val="0"/>
               <w:autoSpaceDE w:val="0"/>
               <w:autoSpaceDN w:val="0"/>
@@ -850,8 +841,6 @@
           </w:p>
           <w:p>
             <w:pPr>
-              <w:keepNext/>
-              <w:cantSplit/>
               <w:widowControl w:val="0"/>
               <w:autoSpaceDE w:val="0"/>
               <w:autoSpaceDN w:val="0"/>
@@ -1063,8 +1052,6 @@
           </w:p>
           <w:p>
             <w:pPr>
-              <w:keepNext/>
-              <w:cantSplit/>
               <w:widowControl w:val="0"/>
               <w:autoSpaceDE w:val="0"/>
               <w:autoSpaceDN w:val="0"/>
@@ -1090,8 +1077,6 @@
           </w:p>
           <w:p>
             <w:pPr>
-              <w:keepNext/>
-              <w:cantSplit/>
               <w:widowControl w:val="0"/>
               <w:autoSpaceDE w:val="0"/>
               <w:autoSpaceDN w:val="0"/>

</xml_diff>

<commit_message>
feat: move LAMPIRAN text to standalone Page 2 with centered top heading
</commit_message>
<xml_diff>
--- a/public/templates/LKP_TEMPLATE_OFFICIAL.docx
+++ b/public/templates/LKP_TEMPLATE_OFFICIAL.docx
@@ -1117,32 +1117,6 @@
         </w:rPr>
       </w:pPr>
     </w:p>
-    <w:p>
-      <w:pPr>
-        <w:widowControl w:val="0"/>
-        <w:autoSpaceDE w:val="0"/>
-        <w:autoSpaceDN w:val="0"/>
-        <w:adjustRightInd w:val="0"/>
-        <w:spacing w:line="288" w:lineRule="auto"/>
-        <w:jc w:val="center"/>
-        <w:rPr>
-          <w:rFonts w:ascii="Arial" w:hAnsi="Arial" w:cs="Arial"/>
-          <w:b/>
-          <w:u w:val="thick"/>
-          <w:lang w:val="en-US"/>
-        </w:rPr>
-      </w:pPr>
-      <w:r>
-        <w:rPr>
-          <w:rFonts w:ascii="Arial" w:hAnsi="Arial" w:cs="Arial"/>
-          <w:b/>
-          <w:u w:val="thick"/>
-          <w:lang w:val="en-US"/>
-        </w:rPr>
-        <w:lastRenderedPageBreak/>
-        <w:t>LAMPIRAN</w:t>
-      </w:r>
-    </w:p>
     <w:p/>
     <w:p/>
     <w:sectPr>
@@ -1164,6 +1138,51 @@
       <w:cols w:space="720"/>
       <w:docGrid w:linePitch="360"/>
     </w:sectPr>
+    <w:p>
+      <w:r>
+        <w:br w:type="page"/>
+      </w:r>
+    </w:p>
+    <w:p>
+      <w:pPr>
+        <w:jc w:val="center"/>
+        <w:spacing w:before="0" w:after="240"/>
+        <w:rPr>
+          <w:rFonts w:ascii="Arial" w:hAnsi="Arial"/>
+          <w:b/>
+          <w:sz w:val="24"/>
+          <w:szCs w:val="24"/>
+        </w:rPr>
+      </w:pPr>
+      <w:r>
+        <w:rPr>
+          <w:rFonts w:ascii="Arial" w:hAnsi="Arial"/>
+          <w:b/>
+          <w:sz w:val="24"/>
+          <w:szCs w:val="24"/>
+        </w:rPr>
+        <w:t xml:space="preserve">LAMPIRAN</w:t>
+      </w:r>
+    </w:p>
+    <w:p>
+      <w:pPr>
+        <w:jc w:val="center"/>
+        <w:spacing w:before="240" w:after="240"/>
+        <w:rPr>
+          <w:rFonts w:ascii="Arial" w:hAnsi="Arial"/>
+          <w:sz w:val="20"/>
+          <w:szCs w:val="20"/>
+        </w:rPr>
+      </w:pPr>
+      <w:r>
+        <w:rPr>
+          <w:rFonts w:ascii="Arial" w:hAnsi="Arial"/>
+          <w:sz w:val="20"/>
+          <w:szCs w:val="20"/>
+        </w:rPr>
+        <w:t xml:space="preserve">{lampiranText}</w:t>
+      </w:r>
+    </w:p>
   </w:body>
 </w:document>
 </file>

</xml_diff>

<commit_message>
fix: remove repeating lampiran phrase from standalone attachment page
</commit_message>
<xml_diff>
--- a/public/templates/LKP_TEMPLATE_OFFICIAL.docx
+++ b/public/templates/LKP_TEMPLATE_OFFICIAL.docx
@@ -1170,6 +1170,7 @@
         <w:spacing w:before="240" w:after="240"/>
         <w:rPr>
           <w:rFonts w:ascii="Arial" w:hAnsi="Arial"/>
+          <w:b/>
           <w:sz w:val="20"/>
           <w:szCs w:val="20"/>
         </w:rPr>
@@ -1177,10 +1178,11 @@
       <w:r>
         <w:rPr>
           <w:rFonts w:ascii="Arial" w:hAnsi="Arial"/>
-          <w:sz w:val="20"/>
-          <w:szCs w:val="20"/>
-        </w:rPr>
-        <w:t xml:space="preserve">{lampiranText}</w:t>
+          <w:b/>
+          <w:sz w:val="20"/>
+          <w:szCs w:val="20"/>
+        </w:rPr>
+        <w:t xml:space="preserve">DOKUMENTASI FOTO KERUSAKAN &amp; HASIL PENGUJIAN</w:t>
       </w:r>
     </w:p>
   </w:body>

</xml_diff>

<commit_message>
fix: remove phrase DOKUMENTASI FOTO KERUSAKAN & HASIL PENGUJIAN completely from page 2
</commit_message>
<xml_diff>
--- a/public/templates/LKP_TEMPLATE_OFFICIAL.docx
+++ b/public/templates/LKP_TEMPLATE_OFFICIAL.docx
@@ -1162,27 +1162,6 @@
           <w:szCs w:val="24"/>
         </w:rPr>
         <w:t xml:space="preserve">LAMPIRAN</w:t>
-      </w:r>
-    </w:p>
-    <w:p>
-      <w:pPr>
-        <w:jc w:val="center"/>
-        <w:spacing w:before="240" w:after="240"/>
-        <w:rPr>
-          <w:rFonts w:ascii="Arial" w:hAnsi="Arial"/>
-          <w:b/>
-          <w:sz w:val="20"/>
-          <w:szCs w:val="20"/>
-        </w:rPr>
-      </w:pPr>
-      <w:r>
-        <w:rPr>
-          <w:rFonts w:ascii="Arial" w:hAnsi="Arial"/>
-          <w:b/>
-          <w:sz w:val="20"/>
-          <w:szCs w:val="20"/>
-        </w:rPr>
-        <w:t xml:space="preserve">DOKUMENTASI FOTO KERUSAKAN &amp; HASIL PENGUJIAN</w:t>
       </w:r>
     </w:p>
   </w:body>

</xml_diff>